<commit_message>
docs: update report with screenshots and add app screenshots to repo
</commit_message>
<xml_diff>
--- a/docs/memoria/Memoria_PistaGO.docx
+++ b/docs/memoria/Memoria_PistaGO.docx
@@ -4119,12 +4119,6 @@
         <w:gridCol w:w="7960"/>
       </w:tblGrid>
       <w:tr>
-        <w:tblPrEx>
-          <w:tblCellMar>
-            <w:top w:w="0" w:type="dxa"/>
-            <w:bottom w:w="0" w:type="dxa"/>
-          </w:tblCellMar>
-        </w:tblPrEx>
         <w:trPr>
           <w:tblHeader/>
         </w:trPr>
@@ -4198,12 +4192,6 @@
         </w:tc>
       </w:tr>
       <w:tr>
-        <w:tblPrEx>
-          <w:tblCellMar>
-            <w:top w:w="0" w:type="dxa"/>
-            <w:bottom w:w="0" w:type="dxa"/>
-          </w:tblCellMar>
-        </w:tblPrEx>
         <w:tc>
           <w:tcPr>
             <w:tcW w:w="1400" w:type="dxa"/>
@@ -4266,12 +4254,6 @@
         </w:tc>
       </w:tr>
       <w:tr>
-        <w:tblPrEx>
-          <w:tblCellMar>
-            <w:top w:w="0" w:type="dxa"/>
-            <w:bottom w:w="0" w:type="dxa"/>
-          </w:tblCellMar>
-        </w:tblPrEx>
         <w:tc>
           <w:tcPr>
             <w:tcW w:w="1400" w:type="dxa"/>
@@ -4334,12 +4316,6 @@
         </w:tc>
       </w:tr>
       <w:tr>
-        <w:tblPrEx>
-          <w:tblCellMar>
-            <w:top w:w="0" w:type="dxa"/>
-            <w:bottom w:w="0" w:type="dxa"/>
-          </w:tblCellMar>
-        </w:tblPrEx>
         <w:tc>
           <w:tcPr>
             <w:tcW w:w="1400" w:type="dxa"/>
@@ -4418,12 +4394,6 @@
         </w:tc>
       </w:tr>
       <w:tr>
-        <w:tblPrEx>
-          <w:tblCellMar>
-            <w:top w:w="0" w:type="dxa"/>
-            <w:bottom w:w="0" w:type="dxa"/>
-          </w:tblCellMar>
-        </w:tblPrEx>
         <w:tc>
           <w:tcPr>
             <w:tcW w:w="1400" w:type="dxa"/>
@@ -4486,12 +4456,6 @@
         </w:tc>
       </w:tr>
       <w:tr>
-        <w:tblPrEx>
-          <w:tblCellMar>
-            <w:top w:w="0" w:type="dxa"/>
-            <w:bottom w:w="0" w:type="dxa"/>
-          </w:tblCellMar>
-        </w:tblPrEx>
         <w:tc>
           <w:tcPr>
             <w:tcW w:w="1400" w:type="dxa"/>
@@ -4554,12 +4518,6 @@
         </w:tc>
       </w:tr>
       <w:tr>
-        <w:tblPrEx>
-          <w:tblCellMar>
-            <w:top w:w="0" w:type="dxa"/>
-            <w:bottom w:w="0" w:type="dxa"/>
-          </w:tblCellMar>
-        </w:tblPrEx>
         <w:tc>
           <w:tcPr>
             <w:tcW w:w="1400" w:type="dxa"/>
@@ -4622,12 +4580,6 @@
         </w:tc>
       </w:tr>
       <w:tr>
-        <w:tblPrEx>
-          <w:tblCellMar>
-            <w:top w:w="0" w:type="dxa"/>
-            <w:bottom w:w="0" w:type="dxa"/>
-          </w:tblCellMar>
-        </w:tblPrEx>
         <w:tc>
           <w:tcPr>
             <w:tcW w:w="1400" w:type="dxa"/>
@@ -4690,12 +4642,6 @@
         </w:tc>
       </w:tr>
       <w:tr>
-        <w:tblPrEx>
-          <w:tblCellMar>
-            <w:top w:w="0" w:type="dxa"/>
-            <w:bottom w:w="0" w:type="dxa"/>
-          </w:tblCellMar>
-        </w:tblPrEx>
         <w:tc>
           <w:tcPr>
             <w:tcW w:w="1400" w:type="dxa"/>
@@ -4758,12 +4704,6 @@
         </w:tc>
       </w:tr>
       <w:tr>
-        <w:tblPrEx>
-          <w:tblCellMar>
-            <w:top w:w="0" w:type="dxa"/>
-            <w:bottom w:w="0" w:type="dxa"/>
-          </w:tblCellMar>
-        </w:tblPrEx>
         <w:tc>
           <w:tcPr>
             <w:tcW w:w="1400" w:type="dxa"/>
@@ -4826,12 +4766,6 @@
         </w:tc>
       </w:tr>
       <w:tr>
-        <w:tblPrEx>
-          <w:tblCellMar>
-            <w:top w:w="0" w:type="dxa"/>
-            <w:bottom w:w="0" w:type="dxa"/>
-          </w:tblCellMar>
-        </w:tblPrEx>
         <w:tc>
           <w:tcPr>
             <w:tcW w:w="1400" w:type="dxa"/>
@@ -4894,12 +4828,6 @@
         </w:tc>
       </w:tr>
       <w:tr>
-        <w:tblPrEx>
-          <w:tblCellMar>
-            <w:top w:w="0" w:type="dxa"/>
-            <w:bottom w:w="0" w:type="dxa"/>
-          </w:tblCellMar>
-        </w:tblPrEx>
         <w:tc>
           <w:tcPr>
             <w:tcW w:w="1400" w:type="dxa"/>
@@ -4962,12 +4890,6 @@
         </w:tc>
       </w:tr>
       <w:tr>
-        <w:tblPrEx>
-          <w:tblCellMar>
-            <w:top w:w="0" w:type="dxa"/>
-            <w:bottom w:w="0" w:type="dxa"/>
-          </w:tblCellMar>
-        </w:tblPrEx>
         <w:tc>
           <w:tcPr>
             <w:tcW w:w="1400" w:type="dxa"/>
@@ -5030,12 +4952,6 @@
         </w:tc>
       </w:tr>
       <w:tr>
-        <w:tblPrEx>
-          <w:tblCellMar>
-            <w:top w:w="0" w:type="dxa"/>
-            <w:bottom w:w="0" w:type="dxa"/>
-          </w:tblCellMar>
-        </w:tblPrEx>
         <w:tc>
           <w:tcPr>
             <w:tcW w:w="1400" w:type="dxa"/>
@@ -5098,12 +5014,6 @@
         </w:tc>
       </w:tr>
       <w:tr>
-        <w:tblPrEx>
-          <w:tblCellMar>
-            <w:top w:w="0" w:type="dxa"/>
-            <w:bottom w:w="0" w:type="dxa"/>
-          </w:tblCellMar>
-        </w:tblPrEx>
         <w:tc>
           <w:tcPr>
             <w:tcW w:w="1400" w:type="dxa"/>
@@ -5219,12 +5129,6 @@
         <w:gridCol w:w="7660"/>
       </w:tblGrid>
       <w:tr>
-        <w:tblPrEx>
-          <w:tblCellMar>
-            <w:top w:w="0" w:type="dxa"/>
-            <w:bottom w:w="0" w:type="dxa"/>
-          </w:tblCellMar>
-        </w:tblPrEx>
         <w:trPr>
           <w:tblHeader/>
         </w:trPr>
@@ -5298,12 +5202,6 @@
         </w:tc>
       </w:tr>
       <w:tr>
-        <w:tblPrEx>
-          <w:tblCellMar>
-            <w:top w:w="0" w:type="dxa"/>
-            <w:bottom w:w="0" w:type="dxa"/>
-          </w:tblCellMar>
-        </w:tblPrEx>
         <w:tc>
           <w:tcPr>
             <w:tcW w:w="1700" w:type="dxa"/>
@@ -5398,12 +5296,6 @@
         </w:tc>
       </w:tr>
       <w:tr>
-        <w:tblPrEx>
-          <w:tblCellMar>
-            <w:top w:w="0" w:type="dxa"/>
-            <w:bottom w:w="0" w:type="dxa"/>
-          </w:tblCellMar>
-        </w:tblPrEx>
         <w:tc>
           <w:tcPr>
             <w:tcW w:w="1700" w:type="dxa"/>
@@ -5499,12 +5391,6 @@
         </w:tc>
       </w:tr>
       <w:tr>
-        <w:tblPrEx>
-          <w:tblCellMar>
-            <w:top w:w="0" w:type="dxa"/>
-            <w:bottom w:w="0" w:type="dxa"/>
-          </w:tblCellMar>
-        </w:tblPrEx>
         <w:tc>
           <w:tcPr>
             <w:tcW w:w="1700" w:type="dxa"/>
@@ -5583,12 +5469,6 @@
         </w:tc>
       </w:tr>
       <w:tr>
-        <w:tblPrEx>
-          <w:tblCellMar>
-            <w:top w:w="0" w:type="dxa"/>
-            <w:bottom w:w="0" w:type="dxa"/>
-          </w:tblCellMar>
-        </w:tblPrEx>
         <w:tc>
           <w:tcPr>
             <w:tcW w:w="1700" w:type="dxa"/>
@@ -5651,12 +5531,6 @@
         </w:tc>
       </w:tr>
       <w:tr>
-        <w:tblPrEx>
-          <w:tblCellMar>
-            <w:top w:w="0" w:type="dxa"/>
-            <w:bottom w:w="0" w:type="dxa"/>
-          </w:tblCellMar>
-        </w:tblPrEx>
         <w:tc>
           <w:tcPr>
             <w:tcW w:w="1700" w:type="dxa"/>
@@ -5719,12 +5593,6 @@
         </w:tc>
       </w:tr>
       <w:tr>
-        <w:tblPrEx>
-          <w:tblCellMar>
-            <w:top w:w="0" w:type="dxa"/>
-            <w:bottom w:w="0" w:type="dxa"/>
-          </w:tblCellMar>
-        </w:tblPrEx>
         <w:tc>
           <w:tcPr>
             <w:tcW w:w="1700" w:type="dxa"/>
@@ -5787,12 +5655,6 @@
         </w:tc>
       </w:tr>
       <w:tr>
-        <w:tblPrEx>
-          <w:tblCellMar>
-            <w:top w:w="0" w:type="dxa"/>
-            <w:bottom w:w="0" w:type="dxa"/>
-          </w:tblCellMar>
-        </w:tblPrEx>
         <w:tc>
           <w:tcPr>
             <w:tcW w:w="1700" w:type="dxa"/>
@@ -6844,12 +6706,6 @@
         <w:gridCol w:w="6960"/>
       </w:tblGrid>
       <w:tr>
-        <w:tblPrEx>
-          <w:tblCellMar>
-            <w:top w:w="0" w:type="dxa"/>
-            <w:bottom w:w="0" w:type="dxa"/>
-          </w:tblCellMar>
-        </w:tblPrEx>
         <w:trPr>
           <w:tblHeader/>
         </w:trPr>
@@ -6924,12 +6780,6 @@
         </w:tc>
       </w:tr>
       <w:tr>
-        <w:tblPrEx>
-          <w:tblCellMar>
-            <w:top w:w="0" w:type="dxa"/>
-            <w:bottom w:w="0" w:type="dxa"/>
-          </w:tblCellMar>
-        </w:tblPrEx>
         <w:tc>
           <w:tcPr>
             <w:tcW w:w="2400" w:type="dxa"/>
@@ -6992,12 +6842,6 @@
         </w:tc>
       </w:tr>
       <w:tr>
-        <w:tblPrEx>
-          <w:tblCellMar>
-            <w:top w:w="0" w:type="dxa"/>
-            <w:bottom w:w="0" w:type="dxa"/>
-          </w:tblCellMar>
-        </w:tblPrEx>
         <w:tc>
           <w:tcPr>
             <w:tcW w:w="2400" w:type="dxa"/>
@@ -7060,12 +6904,6 @@
         </w:tc>
       </w:tr>
       <w:tr>
-        <w:tblPrEx>
-          <w:tblCellMar>
-            <w:top w:w="0" w:type="dxa"/>
-            <w:bottom w:w="0" w:type="dxa"/>
-          </w:tblCellMar>
-        </w:tblPrEx>
         <w:tc>
           <w:tcPr>
             <w:tcW w:w="2400" w:type="dxa"/>
@@ -7144,12 +6982,6 @@
         </w:tc>
       </w:tr>
       <w:tr>
-        <w:tblPrEx>
-          <w:tblCellMar>
-            <w:top w:w="0" w:type="dxa"/>
-            <w:bottom w:w="0" w:type="dxa"/>
-          </w:tblCellMar>
-        </w:tblPrEx>
         <w:tc>
           <w:tcPr>
             <w:tcW w:w="2400" w:type="dxa"/>
@@ -7230,12 +7062,6 @@
         </w:tc>
       </w:tr>
       <w:tr>
-        <w:tblPrEx>
-          <w:tblCellMar>
-            <w:top w:w="0" w:type="dxa"/>
-            <w:bottom w:w="0" w:type="dxa"/>
-          </w:tblCellMar>
-        </w:tblPrEx>
         <w:tc>
           <w:tcPr>
             <w:tcW w:w="2400" w:type="dxa"/>
@@ -7300,12 +7126,6 @@
         </w:tc>
       </w:tr>
       <w:tr>
-        <w:tblPrEx>
-          <w:tblCellMar>
-            <w:top w:w="0" w:type="dxa"/>
-            <w:bottom w:w="0" w:type="dxa"/>
-          </w:tblCellMar>
-        </w:tblPrEx>
         <w:tc>
           <w:tcPr>
             <w:tcW w:w="2400" w:type="dxa"/>
@@ -7384,12 +7204,6 @@
         </w:tc>
       </w:tr>
       <w:tr>
-        <w:tblPrEx>
-          <w:tblCellMar>
-            <w:top w:w="0" w:type="dxa"/>
-            <w:bottom w:w="0" w:type="dxa"/>
-          </w:tblCellMar>
-        </w:tblPrEx>
         <w:tc>
           <w:tcPr>
             <w:tcW w:w="2400" w:type="dxa"/>
@@ -7524,12 +7338,6 @@
         <w:gridCol w:w="5560"/>
       </w:tblGrid>
       <w:tr>
-        <w:tblPrEx>
-          <w:tblCellMar>
-            <w:top w:w="0" w:type="dxa"/>
-            <w:bottom w:w="0" w:type="dxa"/>
-          </w:tblCellMar>
-        </w:tblPrEx>
         <w:trPr>
           <w:tblHeader/>
         </w:trPr>
@@ -7603,12 +7411,6 @@
         </w:tc>
       </w:tr>
       <w:tr>
-        <w:tblPrEx>
-          <w:tblCellMar>
-            <w:top w:w="0" w:type="dxa"/>
-            <w:bottom w:w="0" w:type="dxa"/>
-          </w:tblCellMar>
-        </w:tblPrEx>
         <w:tc>
           <w:tcPr>
             <w:tcW w:w="3800" w:type="dxa"/>
@@ -7696,12 +7498,6 @@
         </w:tc>
       </w:tr>
       <w:tr>
-        <w:tblPrEx>
-          <w:tblCellMar>
-            <w:top w:w="0" w:type="dxa"/>
-            <w:bottom w:w="0" w:type="dxa"/>
-          </w:tblCellMar>
-        </w:tblPrEx>
         <w:tc>
           <w:tcPr>
             <w:tcW w:w="3800" w:type="dxa"/>
@@ -7789,12 +7585,6 @@
         </w:tc>
       </w:tr>
       <w:tr>
-        <w:tblPrEx>
-          <w:tblCellMar>
-            <w:top w:w="0" w:type="dxa"/>
-            <w:bottom w:w="0" w:type="dxa"/>
-          </w:tblCellMar>
-        </w:tblPrEx>
         <w:tc>
           <w:tcPr>
             <w:tcW w:w="3800" w:type="dxa"/>
@@ -7857,12 +7647,6 @@
         </w:tc>
       </w:tr>
       <w:tr>
-        <w:tblPrEx>
-          <w:tblCellMar>
-            <w:top w:w="0" w:type="dxa"/>
-            <w:bottom w:w="0" w:type="dxa"/>
-          </w:tblCellMar>
-        </w:tblPrEx>
         <w:tc>
           <w:tcPr>
             <w:tcW w:w="3800" w:type="dxa"/>
@@ -7925,12 +7709,6 @@
         </w:tc>
       </w:tr>
       <w:tr>
-        <w:tblPrEx>
-          <w:tblCellMar>
-            <w:top w:w="0" w:type="dxa"/>
-            <w:bottom w:w="0" w:type="dxa"/>
-          </w:tblCellMar>
-        </w:tblPrEx>
         <w:tc>
           <w:tcPr>
             <w:tcW w:w="3800" w:type="dxa"/>
@@ -7993,12 +7771,6 @@
         </w:tc>
       </w:tr>
       <w:tr>
-        <w:tblPrEx>
-          <w:tblCellMar>
-            <w:top w:w="0" w:type="dxa"/>
-            <w:bottom w:w="0" w:type="dxa"/>
-          </w:tblCellMar>
-        </w:tblPrEx>
         <w:tc>
           <w:tcPr>
             <w:tcW w:w="3800" w:type="dxa"/>
@@ -8061,12 +7833,6 @@
         </w:tc>
       </w:tr>
       <w:tr>
-        <w:tblPrEx>
-          <w:tblCellMar>
-            <w:top w:w="0" w:type="dxa"/>
-            <w:bottom w:w="0" w:type="dxa"/>
-          </w:tblCellMar>
-        </w:tblPrEx>
         <w:tc>
           <w:tcPr>
             <w:tcW w:w="3800" w:type="dxa"/>
@@ -8129,12 +7895,6 @@
         </w:tc>
       </w:tr>
       <w:tr>
-        <w:tblPrEx>
-          <w:tblCellMar>
-            <w:top w:w="0" w:type="dxa"/>
-            <w:bottom w:w="0" w:type="dxa"/>
-          </w:tblCellMar>
-        </w:tblPrEx>
         <w:tc>
           <w:tcPr>
             <w:tcW w:w="3800" w:type="dxa"/>
@@ -8197,12 +7957,6 @@
         </w:tc>
       </w:tr>
       <w:tr>
-        <w:tblPrEx>
-          <w:tblCellMar>
-            <w:top w:w="0" w:type="dxa"/>
-            <w:bottom w:w="0" w:type="dxa"/>
-          </w:tblCellMar>
-        </w:tblPrEx>
         <w:tc>
           <w:tcPr>
             <w:tcW w:w="3800" w:type="dxa"/>
@@ -8265,12 +8019,6 @@
         </w:tc>
       </w:tr>
       <w:tr>
-        <w:tblPrEx>
-          <w:tblCellMar>
-            <w:top w:w="0" w:type="dxa"/>
-            <w:bottom w:w="0" w:type="dxa"/>
-          </w:tblCellMar>
-        </w:tblPrEx>
         <w:tc>
           <w:tcPr>
             <w:tcW w:w="3800" w:type="dxa"/>
@@ -8333,12 +8081,6 @@
         </w:tc>
       </w:tr>
       <w:tr>
-        <w:tblPrEx>
-          <w:tblCellMar>
-            <w:top w:w="0" w:type="dxa"/>
-            <w:bottom w:w="0" w:type="dxa"/>
-          </w:tblCellMar>
-        </w:tblPrEx>
         <w:tc>
           <w:tcPr>
             <w:tcW w:w="3800" w:type="dxa"/>
@@ -8418,12 +8160,6 @@
         </w:tc>
       </w:tr>
       <w:tr>
-        <w:tblPrEx>
-          <w:tblCellMar>
-            <w:top w:w="0" w:type="dxa"/>
-            <w:bottom w:w="0" w:type="dxa"/>
-          </w:tblCellMar>
-        </w:tblPrEx>
         <w:tc>
           <w:tcPr>
             <w:tcW w:w="3800" w:type="dxa"/>
@@ -8840,12 +8576,6 @@
         <w:gridCol w:w="3200"/>
       </w:tblGrid>
       <w:tr>
-        <w:tblPrEx>
-          <w:tblCellMar>
-            <w:top w:w="0" w:type="dxa"/>
-            <w:bottom w:w="0" w:type="dxa"/>
-          </w:tblCellMar>
-        </w:tblPrEx>
         <w:trPr>
           <w:tblHeader/>
         </w:trPr>
@@ -8919,12 +8649,6 @@
         </w:tc>
       </w:tr>
       <w:tr>
-        <w:tblPrEx>
-          <w:tblCellMar>
-            <w:top w:w="0" w:type="dxa"/>
-            <w:bottom w:w="0" w:type="dxa"/>
-          </w:tblCellMar>
-        </w:tblPrEx>
         <w:tc>
           <w:tcPr>
             <w:tcW w:w="6160" w:type="dxa"/>
@@ -8987,12 +8711,6 @@
         </w:tc>
       </w:tr>
       <w:tr>
-        <w:tblPrEx>
-          <w:tblCellMar>
-            <w:top w:w="0" w:type="dxa"/>
-            <w:bottom w:w="0" w:type="dxa"/>
-          </w:tblCellMar>
-        </w:tblPrEx>
         <w:tc>
           <w:tcPr>
             <w:tcW w:w="6160" w:type="dxa"/>
@@ -9071,12 +8789,6 @@
         </w:tc>
       </w:tr>
       <w:tr>
-        <w:tblPrEx>
-          <w:tblCellMar>
-            <w:top w:w="0" w:type="dxa"/>
-            <w:bottom w:w="0" w:type="dxa"/>
-          </w:tblCellMar>
-        </w:tblPrEx>
         <w:tc>
           <w:tcPr>
             <w:tcW w:w="6160" w:type="dxa"/>
@@ -9171,12 +8883,6 @@
         </w:tc>
       </w:tr>
       <w:tr>
-        <w:tblPrEx>
-          <w:tblCellMar>
-            <w:top w:w="0" w:type="dxa"/>
-            <w:bottom w:w="0" w:type="dxa"/>
-          </w:tblCellMar>
-        </w:tblPrEx>
         <w:tc>
           <w:tcPr>
             <w:tcW w:w="6160" w:type="dxa"/>
@@ -9255,12 +8961,6 @@
         </w:tc>
       </w:tr>
       <w:tr>
-        <w:tblPrEx>
-          <w:tblCellMar>
-            <w:top w:w="0" w:type="dxa"/>
-            <w:bottom w:w="0" w:type="dxa"/>
-          </w:tblCellMar>
-        </w:tblPrEx>
         <w:tc>
           <w:tcPr>
             <w:tcW w:w="6160" w:type="dxa"/>
@@ -9339,12 +9039,6 @@
         </w:tc>
       </w:tr>
       <w:tr>
-        <w:tblPrEx>
-          <w:tblCellMar>
-            <w:top w:w="0" w:type="dxa"/>
-            <w:bottom w:w="0" w:type="dxa"/>
-          </w:tblCellMar>
-        </w:tblPrEx>
         <w:tc>
           <w:tcPr>
             <w:tcW w:w="6160" w:type="dxa"/>
@@ -9423,12 +9117,6 @@
         </w:tc>
       </w:tr>
       <w:tr>
-        <w:tblPrEx>
-          <w:tblCellMar>
-            <w:top w:w="0" w:type="dxa"/>
-            <w:bottom w:w="0" w:type="dxa"/>
-          </w:tblCellMar>
-        </w:tblPrEx>
         <w:tc>
           <w:tcPr>
             <w:tcW w:w="6160" w:type="dxa"/>
@@ -9573,12 +9261,6 @@
         <w:gridCol w:w="4660"/>
       </w:tblGrid>
       <w:tr>
-        <w:tblPrEx>
-          <w:tblCellMar>
-            <w:top w:w="0" w:type="dxa"/>
-            <w:bottom w:w="0" w:type="dxa"/>
-          </w:tblCellMar>
-        </w:tblPrEx>
         <w:trPr>
           <w:tblHeader/>
         </w:trPr>
@@ -9686,12 +9368,6 @@
         </w:tc>
       </w:tr>
       <w:tr>
-        <w:tblPrEx>
-          <w:tblCellMar>
-            <w:top w:w="0" w:type="dxa"/>
-            <w:bottom w:w="0" w:type="dxa"/>
-          </w:tblCellMar>
-        </w:tblPrEx>
         <w:tc>
           <w:tcPr>
             <w:tcW w:w="1300" w:type="dxa"/>
@@ -9818,12 +9494,6 @@
         </w:tc>
       </w:tr>
       <w:tr>
-        <w:tblPrEx>
-          <w:tblCellMar>
-            <w:top w:w="0" w:type="dxa"/>
-            <w:bottom w:w="0" w:type="dxa"/>
-          </w:tblCellMar>
-        </w:tblPrEx>
         <w:tc>
           <w:tcPr>
             <w:tcW w:w="1300" w:type="dxa"/>
@@ -9941,12 +9611,6 @@
         </w:tc>
       </w:tr>
       <w:tr>
-        <w:tblPrEx>
-          <w:tblCellMar>
-            <w:top w:w="0" w:type="dxa"/>
-            <w:bottom w:w="0" w:type="dxa"/>
-          </w:tblCellMar>
-        </w:tblPrEx>
         <w:tc>
           <w:tcPr>
             <w:tcW w:w="1300" w:type="dxa"/>
@@ -10041,12 +9705,6 @@
         </w:tc>
       </w:tr>
       <w:tr>
-        <w:tblPrEx>
-          <w:tblCellMar>
-            <w:top w:w="0" w:type="dxa"/>
-            <w:bottom w:w="0" w:type="dxa"/>
-          </w:tblCellMar>
-        </w:tblPrEx>
         <w:tc>
           <w:tcPr>
             <w:tcW w:w="1300" w:type="dxa"/>
@@ -10157,12 +9815,6 @@
         </w:tc>
       </w:tr>
       <w:tr>
-        <w:tblPrEx>
-          <w:tblCellMar>
-            <w:top w:w="0" w:type="dxa"/>
-            <w:bottom w:w="0" w:type="dxa"/>
-          </w:tblCellMar>
-        </w:tblPrEx>
         <w:tc>
           <w:tcPr>
             <w:tcW w:w="1300" w:type="dxa"/>
@@ -10264,12 +9916,6 @@
         </w:tc>
       </w:tr>
       <w:tr>
-        <w:tblPrEx>
-          <w:tblCellMar>
-            <w:top w:w="0" w:type="dxa"/>
-            <w:bottom w:w="0" w:type="dxa"/>
-          </w:tblCellMar>
-        </w:tblPrEx>
         <w:tc>
           <w:tcPr>
             <w:tcW w:w="1300" w:type="dxa"/>
@@ -10364,12 +10010,6 @@
         </w:tc>
       </w:tr>
       <w:tr>
-        <w:tblPrEx>
-          <w:tblCellMar>
-            <w:top w:w="0" w:type="dxa"/>
-            <w:bottom w:w="0" w:type="dxa"/>
-          </w:tblCellMar>
-        </w:tblPrEx>
         <w:tc>
           <w:tcPr>
             <w:tcW w:w="1300" w:type="dxa"/>
@@ -10464,12 +10104,6 @@
         </w:tc>
       </w:tr>
       <w:tr>
-        <w:tblPrEx>
-          <w:tblCellMar>
-            <w:top w:w="0" w:type="dxa"/>
-            <w:bottom w:w="0" w:type="dxa"/>
-          </w:tblCellMar>
-        </w:tblPrEx>
         <w:tc>
           <w:tcPr>
             <w:tcW w:w="1300" w:type="dxa"/>
@@ -10596,12 +10230,6 @@
         </w:tc>
       </w:tr>
       <w:tr>
-        <w:tblPrEx>
-          <w:tblCellMar>
-            <w:top w:w="0" w:type="dxa"/>
-            <w:bottom w:w="0" w:type="dxa"/>
-          </w:tblCellMar>
-        </w:tblPrEx>
         <w:tc>
           <w:tcPr>
             <w:tcW w:w="1300" w:type="dxa"/>
@@ -10696,12 +10324,6 @@
         </w:tc>
       </w:tr>
       <w:tr>
-        <w:tblPrEx>
-          <w:tblCellMar>
-            <w:top w:w="0" w:type="dxa"/>
-            <w:bottom w:w="0" w:type="dxa"/>
-          </w:tblCellMar>
-        </w:tblPrEx>
         <w:tc>
           <w:tcPr>
             <w:tcW w:w="1300" w:type="dxa"/>
@@ -10805,12 +10427,6 @@
         </w:tc>
       </w:tr>
       <w:tr>
-        <w:tblPrEx>
-          <w:tblCellMar>
-            <w:top w:w="0" w:type="dxa"/>
-            <w:bottom w:w="0" w:type="dxa"/>
-          </w:tblCellMar>
-        </w:tblPrEx>
         <w:tc>
           <w:tcPr>
             <w:tcW w:w="1300" w:type="dxa"/>
@@ -10923,12 +10539,6 @@
         </w:tc>
       </w:tr>
       <w:tr>
-        <w:tblPrEx>
-          <w:tblCellMar>
-            <w:top w:w="0" w:type="dxa"/>
-            <w:bottom w:w="0" w:type="dxa"/>
-          </w:tblCellMar>
-        </w:tblPrEx>
         <w:tc>
           <w:tcPr>
             <w:tcW w:w="1300" w:type="dxa"/>
@@ -11064,12 +10674,6 @@
         </w:tc>
       </w:tr>
       <w:tr>
-        <w:tblPrEx>
-          <w:tblCellMar>
-            <w:top w:w="0" w:type="dxa"/>
-            <w:bottom w:w="0" w:type="dxa"/>
-          </w:tblCellMar>
-        </w:tblPrEx>
         <w:tc>
           <w:tcPr>
             <w:tcW w:w="1300" w:type="dxa"/>
@@ -11162,12 +10766,6 @@
         </w:tc>
       </w:tr>
       <w:tr>
-        <w:tblPrEx>
-          <w:tblCellMar>
-            <w:top w:w="0" w:type="dxa"/>
-            <w:bottom w:w="0" w:type="dxa"/>
-          </w:tblCellMar>
-        </w:tblPrEx>
         <w:tc>
           <w:tcPr>
             <w:tcW w:w="1300" w:type="dxa"/>
@@ -11294,12 +10892,6 @@
         </w:tc>
       </w:tr>
       <w:tr>
-        <w:tblPrEx>
-          <w:tblCellMar>
-            <w:top w:w="0" w:type="dxa"/>
-            <w:bottom w:w="0" w:type="dxa"/>
-          </w:tblCellMar>
-        </w:tblPrEx>
         <w:tc>
           <w:tcPr>
             <w:tcW w:w="1300" w:type="dxa"/>
@@ -11408,12 +11000,6 @@
         </w:tc>
       </w:tr>
       <w:tr>
-        <w:tblPrEx>
-          <w:tblCellMar>
-            <w:top w:w="0" w:type="dxa"/>
-            <w:bottom w:w="0" w:type="dxa"/>
-          </w:tblCellMar>
-        </w:tblPrEx>
         <w:tc>
           <w:tcPr>
             <w:tcW w:w="1300" w:type="dxa"/>
@@ -11540,12 +11126,6 @@
         </w:tc>
       </w:tr>
       <w:tr>
-        <w:tblPrEx>
-          <w:tblCellMar>
-            <w:top w:w="0" w:type="dxa"/>
-            <w:bottom w:w="0" w:type="dxa"/>
-          </w:tblCellMar>
-        </w:tblPrEx>
         <w:tc>
           <w:tcPr>
             <w:tcW w:w="1300" w:type="dxa"/>
@@ -11647,12 +11227,6 @@
         </w:tc>
       </w:tr>
       <w:tr>
-        <w:tblPrEx>
-          <w:tblCellMar>
-            <w:top w:w="0" w:type="dxa"/>
-            <w:bottom w:w="0" w:type="dxa"/>
-          </w:tblCellMar>
-        </w:tblPrEx>
         <w:tc>
           <w:tcPr>
             <w:tcW w:w="1300" w:type="dxa"/>
@@ -11802,12 +11376,6 @@
         </w:tc>
       </w:tr>
       <w:tr>
-        <w:tblPrEx>
-          <w:tblCellMar>
-            <w:top w:w="0" w:type="dxa"/>
-            <w:bottom w:w="0" w:type="dxa"/>
-          </w:tblCellMar>
-        </w:tblPrEx>
         <w:tc>
           <w:tcPr>
             <w:tcW w:w="1300" w:type="dxa"/>
@@ -11941,12 +11509,6 @@
         </w:tc>
       </w:tr>
       <w:tr>
-        <w:tblPrEx>
-          <w:tblCellMar>
-            <w:top w:w="0" w:type="dxa"/>
-            <w:bottom w:w="0" w:type="dxa"/>
-          </w:tblCellMar>
-        </w:tblPrEx>
         <w:tc>
           <w:tcPr>
             <w:tcW w:w="1300" w:type="dxa"/>
@@ -13103,13 +12665,7 @@
           <w:rPr>
             <w:rStyle w:val="Hipervnculo"/>
           </w:rPr>
-          <w:t>https://github.com/pedroaviless/PistaG</w:t>
-        </w:r>
-        <w:r>
-          <w:rPr>
-            <w:rStyle w:val="Hipervnculo"/>
-          </w:rPr>
-          <w:t>O</w:t>
+          <w:t>https://github.com/pedroaviless/PistaGO</w:t>
         </w:r>
       </w:hyperlink>
     </w:p>
@@ -13188,12 +12744,6 @@
         <w:gridCol w:w="3000"/>
       </w:tblGrid>
       <w:tr>
-        <w:tblPrEx>
-          <w:tblCellMar>
-            <w:top w:w="0" w:type="dxa"/>
-            <w:bottom w:w="0" w:type="dxa"/>
-          </w:tblCellMar>
-        </w:tblPrEx>
         <w:trPr>
           <w:tblHeader/>
         </w:trPr>
@@ -13301,12 +12851,6 @@
         </w:tc>
       </w:tr>
       <w:tr>
-        <w:tblPrEx>
-          <w:tblCellMar>
-            <w:top w:w="0" w:type="dxa"/>
-            <w:bottom w:w="0" w:type="dxa"/>
-          </w:tblCellMar>
-        </w:tblPrEx>
         <w:tc>
           <w:tcPr>
             <w:tcW w:w="4360" w:type="dxa"/>
@@ -13399,12 +12943,6 @@
         </w:tc>
       </w:tr>
       <w:tr>
-        <w:tblPrEx>
-          <w:tblCellMar>
-            <w:top w:w="0" w:type="dxa"/>
-            <w:bottom w:w="0" w:type="dxa"/>
-          </w:tblCellMar>
-        </w:tblPrEx>
         <w:tc>
           <w:tcPr>
             <w:tcW w:w="4360" w:type="dxa"/>
@@ -13506,12 +13044,6 @@
         </w:tc>
       </w:tr>
       <w:tr>
-        <w:tblPrEx>
-          <w:tblCellMar>
-            <w:top w:w="0" w:type="dxa"/>
-            <w:bottom w:w="0" w:type="dxa"/>
-          </w:tblCellMar>
-        </w:tblPrEx>
         <w:tc>
           <w:tcPr>
             <w:tcW w:w="4360" w:type="dxa"/>
@@ -13604,12 +13136,6 @@
         </w:tc>
       </w:tr>
       <w:tr>
-        <w:tblPrEx>
-          <w:tblCellMar>
-            <w:top w:w="0" w:type="dxa"/>
-            <w:bottom w:w="0" w:type="dxa"/>
-          </w:tblCellMar>
-        </w:tblPrEx>
         <w:tc>
           <w:tcPr>
             <w:tcW w:w="4360" w:type="dxa"/>
@@ -13702,12 +13228,6 @@
         </w:tc>
       </w:tr>
       <w:tr>
-        <w:tblPrEx>
-          <w:tblCellMar>
-            <w:top w:w="0" w:type="dxa"/>
-            <w:bottom w:w="0" w:type="dxa"/>
-          </w:tblCellMar>
-        </w:tblPrEx>
         <w:tc>
           <w:tcPr>
             <w:tcW w:w="4360" w:type="dxa"/>
@@ -13800,12 +13320,6 @@
         </w:tc>
       </w:tr>
       <w:tr>
-        <w:tblPrEx>
-          <w:tblCellMar>
-            <w:top w:w="0" w:type="dxa"/>
-            <w:bottom w:w="0" w:type="dxa"/>
-          </w:tblCellMar>
-        </w:tblPrEx>
         <w:tc>
           <w:tcPr>
             <w:tcW w:w="4360" w:type="dxa"/>
@@ -13935,12 +13449,6 @@
         <w:gridCol w:w="3000"/>
       </w:tblGrid>
       <w:tr>
-        <w:tblPrEx>
-          <w:tblCellMar>
-            <w:top w:w="0" w:type="dxa"/>
-            <w:bottom w:w="0" w:type="dxa"/>
-          </w:tblCellMar>
-        </w:tblPrEx>
         <w:trPr>
           <w:tblHeader/>
         </w:trPr>
@@ -14014,12 +13522,6 @@
         </w:tc>
       </w:tr>
       <w:tr>
-        <w:tblPrEx>
-          <w:tblCellMar>
-            <w:top w:w="0" w:type="dxa"/>
-            <w:bottom w:w="0" w:type="dxa"/>
-          </w:tblCellMar>
-        </w:tblPrEx>
         <w:tc>
           <w:tcPr>
             <w:tcW w:w="6360" w:type="dxa"/>
@@ -14130,12 +13632,6 @@
         </w:tc>
       </w:tr>
       <w:tr>
-        <w:tblPrEx>
-          <w:tblCellMar>
-            <w:top w:w="0" w:type="dxa"/>
-            <w:bottom w:w="0" w:type="dxa"/>
-          </w:tblCellMar>
-        </w:tblPrEx>
         <w:tc>
           <w:tcPr>
             <w:tcW w:w="6360" w:type="dxa"/>
@@ -14198,12 +13694,6 @@
         </w:tc>
       </w:tr>
       <w:tr>
-        <w:tblPrEx>
-          <w:tblCellMar>
-            <w:top w:w="0" w:type="dxa"/>
-            <w:bottom w:w="0" w:type="dxa"/>
-          </w:tblCellMar>
-        </w:tblPrEx>
         <w:tc>
           <w:tcPr>
             <w:tcW w:w="6360" w:type="dxa"/>
@@ -14298,12 +13788,6 @@
         </w:tc>
       </w:tr>
       <w:tr>
-        <w:tblPrEx>
-          <w:tblCellMar>
-            <w:top w:w="0" w:type="dxa"/>
-            <w:bottom w:w="0" w:type="dxa"/>
-          </w:tblCellMar>
-        </w:tblPrEx>
         <w:tc>
           <w:tcPr>
             <w:tcW w:w="6360" w:type="dxa"/>
@@ -14388,12 +13872,6 @@
         </w:tc>
       </w:tr>
       <w:tr>
-        <w:tblPrEx>
-          <w:tblCellMar>
-            <w:top w:w="0" w:type="dxa"/>
-            <w:bottom w:w="0" w:type="dxa"/>
-          </w:tblCellMar>
-        </w:tblPrEx>
         <w:tc>
           <w:tcPr>
             <w:tcW w:w="6360" w:type="dxa"/>
@@ -14493,12 +13971,6 @@
         <w:gridCol w:w="5960"/>
       </w:tblGrid>
       <w:tr>
-        <w:tblPrEx>
-          <w:tblCellMar>
-            <w:top w:w="0" w:type="dxa"/>
-            <w:bottom w:w="0" w:type="dxa"/>
-          </w:tblCellMar>
-        </w:tblPrEx>
         <w:trPr>
           <w:tblHeader/>
         </w:trPr>
@@ -14572,12 +14044,6 @@
         </w:tc>
       </w:tr>
       <w:tr>
-        <w:tblPrEx>
-          <w:tblCellMar>
-            <w:top w:w="0" w:type="dxa"/>
-            <w:bottom w:w="0" w:type="dxa"/>
-          </w:tblCellMar>
-        </w:tblPrEx>
         <w:tc>
           <w:tcPr>
             <w:tcW w:w="3400" w:type="dxa"/>
@@ -14640,12 +14106,6 @@
         </w:tc>
       </w:tr>
       <w:tr>
-        <w:tblPrEx>
-          <w:tblCellMar>
-            <w:top w:w="0" w:type="dxa"/>
-            <w:bottom w:w="0" w:type="dxa"/>
-          </w:tblCellMar>
-        </w:tblPrEx>
         <w:tc>
           <w:tcPr>
             <w:tcW w:w="3400" w:type="dxa"/>
@@ -14708,12 +14168,6 @@
         </w:tc>
       </w:tr>
       <w:tr>
-        <w:tblPrEx>
-          <w:tblCellMar>
-            <w:top w:w="0" w:type="dxa"/>
-            <w:bottom w:w="0" w:type="dxa"/>
-          </w:tblCellMar>
-        </w:tblPrEx>
         <w:tc>
           <w:tcPr>
             <w:tcW w:w="3400" w:type="dxa"/>
@@ -14792,12 +14246,6 @@
         </w:tc>
       </w:tr>
       <w:tr>
-        <w:tblPrEx>
-          <w:tblCellMar>
-            <w:top w:w="0" w:type="dxa"/>
-            <w:bottom w:w="0" w:type="dxa"/>
-          </w:tblCellMar>
-        </w:tblPrEx>
         <w:tc>
           <w:tcPr>
             <w:tcW w:w="3400" w:type="dxa"/>
@@ -15494,10 +14942,9 @@
       <w:hyperlink r:id="rId8" w:history="1">
         <w:r>
           <w:rPr>
-            <w:color w:val="0563C1"/>
-            <w:u w:val="single"/>
+            <w:rStyle w:val="Hipervnculo"/>
           </w:rPr>
-          <w:t>https://github.com/pedroaviles/PistaGO</w:t>
+          <w:t>https://github.com/pedroaviless/PistaGO</w:t>
         </w:r>
       </w:hyperlink>
     </w:p>
@@ -15636,54 +15083,225 @@
       </w:r>
       <w:bookmarkEnd w:id="55"/>
     </w:p>
+    <w:tbl>
+      <w:tblPr>
+        <w:tblStyle w:val="Tablaconcuadrcula"/>
+        <w:tblW w:w="0" w:type="auto"/>
+        <w:shd w:val="clear" w:color="auto" w:fill="000000" w:themeFill="text1"/>
+        <w:tblLook w:val="04A0" w:firstRow="1" w:lastRow="0" w:firstColumn="1" w:lastColumn="0" w:noHBand="0" w:noVBand="1"/>
+      </w:tblPr>
+      <w:tblGrid>
+        <w:gridCol w:w="2996"/>
+        <w:gridCol w:w="2997"/>
+        <w:gridCol w:w="3023"/>
+      </w:tblGrid>
+      <w:tr>
+        <w:tc>
+          <w:tcPr>
+            <w:tcW w:w="2559" w:type="dxa"/>
+            <w:shd w:val="clear" w:color="auto" w:fill="000000" w:themeFill="text1"/>
+          </w:tcPr>
+          <w:p>
+            <w:pPr>
+              <w:spacing w:after="120" w:line="276" w:lineRule="auto"/>
+              <w:jc w:val="both"/>
+            </w:pPr>
+            <w:r>
+              <w:rPr>
+                <w:noProof/>
+              </w:rPr>
+              <w:drawing>
+                <wp:inline distT="0" distB="0" distL="0" distR="0" wp14:anchorId="76C321B4" wp14:editId="5FA04724">
+                  <wp:extent cx="1781151" cy="4001135"/>
+                  <wp:effectExtent l="0" t="0" r="0" b="0"/>
+                  <wp:docPr id="4" name="Imagen 4"/>
+                  <wp:cNvGraphicFramePr>
+                    <a:graphicFrameLocks xmlns:a="http://schemas.openxmlformats.org/drawingml/2006/main" noChangeAspect="1"/>
+                  </wp:cNvGraphicFramePr>
+                  <a:graphic xmlns:a="http://schemas.openxmlformats.org/drawingml/2006/main">
+                    <a:graphicData uri="http://schemas.openxmlformats.org/drawingml/2006/picture">
+                      <pic:pic xmlns:pic="http://schemas.openxmlformats.org/drawingml/2006/picture">
+                        <pic:nvPicPr>
+                          <pic:cNvPr id="0" name="Picture 3"/>
+                          <pic:cNvPicPr>
+                            <a:picLocks noChangeAspect="1" noChangeArrowheads="1"/>
+                          </pic:cNvPicPr>
+                        </pic:nvPicPr>
+                        <pic:blipFill>
+                          <a:blip r:embed="rId10" cstate="print">
+                            <a:extLst>
+                              <a:ext uri="{28A0092B-C50C-407E-A947-70E740481C1C}">
+                                <a14:useLocalDpi xmlns:a14="http://schemas.microsoft.com/office/drawing/2010/main" val="0"/>
+                              </a:ext>
+                            </a:extLst>
+                          </a:blip>
+                          <a:srcRect/>
+                          <a:stretch>
+                            <a:fillRect/>
+                          </a:stretch>
+                        </pic:blipFill>
+                        <pic:spPr bwMode="auto">
+                          <a:xfrm>
+                            <a:off x="0" y="0"/>
+                            <a:ext cx="1798109" cy="4039229"/>
+                          </a:xfrm>
+                          <a:prstGeom prst="rect">
+                            <a:avLst/>
+                          </a:prstGeom>
+                          <a:noFill/>
+                          <a:ln>
+                            <a:noFill/>
+                          </a:ln>
+                        </pic:spPr>
+                      </pic:pic>
+                    </a:graphicData>
+                  </a:graphic>
+                </wp:inline>
+              </w:drawing>
+            </w:r>
+          </w:p>
+        </w:tc>
+        <w:tc>
+          <w:tcPr>
+            <w:tcW w:w="2586" w:type="dxa"/>
+            <w:shd w:val="clear" w:color="auto" w:fill="000000" w:themeFill="text1"/>
+          </w:tcPr>
+          <w:p>
+            <w:pPr>
+              <w:spacing w:after="120" w:line="276" w:lineRule="auto"/>
+              <w:jc w:val="both"/>
+            </w:pPr>
+            <w:r>
+              <w:rPr>
+                <w:noProof/>
+              </w:rPr>
+              <w:drawing>
+                <wp:inline distT="0" distB="0" distL="0" distR="0" wp14:anchorId="38A1DA8C" wp14:editId="3C673D1D">
+                  <wp:extent cx="1781175" cy="4001190"/>
+                  <wp:effectExtent l="0" t="0" r="0" b="0"/>
+                  <wp:docPr id="6" name="Imagen 6"/>
+                  <wp:cNvGraphicFramePr>
+                    <a:graphicFrameLocks xmlns:a="http://schemas.openxmlformats.org/drawingml/2006/main" noChangeAspect="1"/>
+                  </wp:cNvGraphicFramePr>
+                  <a:graphic xmlns:a="http://schemas.openxmlformats.org/drawingml/2006/main">
+                    <a:graphicData uri="http://schemas.openxmlformats.org/drawingml/2006/picture">
+                      <pic:pic xmlns:pic="http://schemas.openxmlformats.org/drawingml/2006/picture">
+                        <pic:nvPicPr>
+                          <pic:cNvPr id="0" name="Picture 5"/>
+                          <pic:cNvPicPr>
+                            <a:picLocks noChangeAspect="1" noChangeArrowheads="1"/>
+                          </pic:cNvPicPr>
+                        </pic:nvPicPr>
+                        <pic:blipFill>
+                          <a:blip r:embed="rId11" cstate="print">
+                            <a:extLst>
+                              <a:ext uri="{28A0092B-C50C-407E-A947-70E740481C1C}">
+                                <a14:useLocalDpi xmlns:a14="http://schemas.microsoft.com/office/drawing/2010/main" val="0"/>
+                              </a:ext>
+                            </a:extLst>
+                          </a:blip>
+                          <a:srcRect/>
+                          <a:stretch>
+                            <a:fillRect/>
+                          </a:stretch>
+                        </pic:blipFill>
+                        <pic:spPr bwMode="auto">
+                          <a:xfrm>
+                            <a:off x="0" y="0"/>
+                            <a:ext cx="1799992" cy="4043461"/>
+                          </a:xfrm>
+                          <a:prstGeom prst="rect">
+                            <a:avLst/>
+                          </a:prstGeom>
+                          <a:noFill/>
+                          <a:ln>
+                            <a:noFill/>
+                          </a:ln>
+                        </pic:spPr>
+                      </pic:pic>
+                    </a:graphicData>
+                  </a:graphic>
+                </wp:inline>
+              </w:drawing>
+            </w:r>
+          </w:p>
+        </w:tc>
+        <w:tc>
+          <w:tcPr>
+            <w:tcW w:w="2593" w:type="dxa"/>
+            <w:shd w:val="clear" w:color="auto" w:fill="000000" w:themeFill="text1"/>
+          </w:tcPr>
+          <w:p>
+            <w:pPr>
+              <w:spacing w:after="120" w:line="276" w:lineRule="auto"/>
+              <w:jc w:val="both"/>
+            </w:pPr>
+            <w:r>
+              <w:rPr>
+                <w:noProof/>
+              </w:rPr>
+              <w:drawing>
+                <wp:inline distT="0" distB="0" distL="0" distR="0" wp14:anchorId="3905E29A" wp14:editId="4859E9B2">
+                  <wp:extent cx="1797829" cy="4038600"/>
+                  <wp:effectExtent l="0" t="0" r="0" b="0"/>
+                  <wp:docPr id="8" name="Imagen 8"/>
+                  <wp:cNvGraphicFramePr>
+                    <a:graphicFrameLocks xmlns:a="http://schemas.openxmlformats.org/drawingml/2006/main" noChangeAspect="1"/>
+                  </wp:cNvGraphicFramePr>
+                  <a:graphic xmlns:a="http://schemas.openxmlformats.org/drawingml/2006/main">
+                    <a:graphicData uri="http://schemas.openxmlformats.org/drawingml/2006/picture">
+                      <pic:pic xmlns:pic="http://schemas.openxmlformats.org/drawingml/2006/picture">
+                        <pic:nvPicPr>
+                          <pic:cNvPr id="0" name="Picture 7"/>
+                          <pic:cNvPicPr>
+                            <a:picLocks noChangeAspect="1" noChangeArrowheads="1"/>
+                          </pic:cNvPicPr>
+                        </pic:nvPicPr>
+                        <pic:blipFill>
+                          <a:blip r:embed="rId12" cstate="print">
+                            <a:extLst>
+                              <a:ext uri="{28A0092B-C50C-407E-A947-70E740481C1C}">
+                                <a14:useLocalDpi xmlns:a14="http://schemas.microsoft.com/office/drawing/2010/main" val="0"/>
+                              </a:ext>
+                            </a:extLst>
+                          </a:blip>
+                          <a:srcRect/>
+                          <a:stretch>
+                            <a:fillRect/>
+                          </a:stretch>
+                        </pic:blipFill>
+                        <pic:spPr bwMode="auto">
+                          <a:xfrm>
+                            <a:off x="0" y="0"/>
+                            <a:ext cx="1812461" cy="4071469"/>
+                          </a:xfrm>
+                          <a:prstGeom prst="rect">
+                            <a:avLst/>
+                          </a:prstGeom>
+                          <a:noFill/>
+                          <a:ln>
+                            <a:noFill/>
+                          </a:ln>
+                        </pic:spPr>
+                      </pic:pic>
+                    </a:graphicData>
+                  </a:graphic>
+                </wp:inline>
+              </w:drawing>
+            </w:r>
+          </w:p>
+        </w:tc>
+      </w:tr>
+    </w:tbl>
     <w:p>
       <w:pPr>
         <w:spacing w:after="120" w:line="276" w:lineRule="auto"/>
         <w:jc w:val="both"/>
       </w:pPr>
-      <w:r>
-        <w:rPr>
-          <w:i/>
-          <w:iCs/>
-        </w:rPr>
-        <w:t xml:space="preserve">[Espacio reservado para incluir las capturas de pantalla de las pantallas principales de la aplicación: </w:t>
-      </w:r>
-      <w:proofErr w:type="spellStart"/>
-      <w:r>
-        <w:rPr>
-          <w:i/>
-          <w:iCs/>
-        </w:rPr>
-        <w:t>login</w:t>
-      </w:r>
-      <w:proofErr w:type="spellEnd"/>
-      <w:r>
-        <w:rPr>
-          <w:i/>
-          <w:iCs/>
-        </w:rPr>
-        <w:t xml:space="preserve">, inicio, listado de pistas, proceso de reserva, mis reservas, lista de espera, perfil y notificación </w:t>
-      </w:r>
-      <w:proofErr w:type="spellStart"/>
-      <w:r>
-        <w:rPr>
-          <w:i/>
-          <w:iCs/>
-        </w:rPr>
-        <w:t>push</w:t>
-      </w:r>
-      <w:proofErr w:type="spellEnd"/>
-      <w:r>
-        <w:rPr>
-          <w:i/>
-          <w:iCs/>
-        </w:rPr>
-        <w:t>. Se recomienda añadir aquí 6-8 capturas representativas.]</w:t>
-      </w:r>
     </w:p>
     <w:sectPr>
-      <w:headerReference w:type="default" r:id="rId10"/>
-      <w:footerReference w:type="default" r:id="rId11"/>
+      <w:headerReference w:type="default" r:id="rId13"/>
+      <w:footerReference w:type="default" r:id="rId14"/>
       <w:pgSz w:w="11906" w:h="16838"/>
       <w:pgMar w:top="1440" w:right="1440" w:bottom="1440" w:left="1440" w:header="708" w:footer="708" w:gutter="0"/>
       <w:cols w:space="720"/>
@@ -16704,6 +16322,22 @@
       <w:u w:val="single"/>
     </w:rPr>
   </w:style>
+  <w:style w:type="table" w:styleId="Tablaconcuadrcula">
+    <w:name w:val="Table Grid"/>
+    <w:basedOn w:val="Tablanormal"/>
+    <w:uiPriority w:val="39"/>
+    <w:rsid w:val="003B78DD"/>
+    <w:tblPr>
+      <w:tblBorders>
+        <w:top w:val="single" w:sz="4" w:space="0" w:color="auto"/>
+        <w:left w:val="single" w:sz="4" w:space="0" w:color="auto"/>
+        <w:bottom w:val="single" w:sz="4" w:space="0" w:color="auto"/>
+        <w:right w:val="single" w:sz="4" w:space="0" w:color="auto"/>
+        <w:insideH w:val="single" w:sz="4" w:space="0" w:color="auto"/>
+        <w:insideV w:val="single" w:sz="4" w:space="0" w:color="auto"/>
+      </w:tblBorders>
+    </w:tblPr>
+  </w:style>
 </w:styles>
 </file>
 

</xml_diff>

<commit_message>
feat(home): add admin panel card and update report with new logo
</commit_message>
<xml_diff>
--- a/docs/memoria/Memoria_PistaGO.docx
+++ b/docs/memoria/Memoria_PistaGO.docx
@@ -4,34 +4,259 @@
   <w:body>
     <w:p>
       <w:pPr>
-        <w:spacing w:before="2400"/>
+        <w:spacing w:before="120"/>
         <w:jc w:val="center"/>
-      </w:pPr>
-      <w:r>
         <w:rPr>
-          <w:sz w:val="96"/>
-          <w:szCs w:val="96"/>
+          <w:i/>
+          <w:iCs/>
+          <w:sz w:val="28"/>
+          <w:szCs w:val="28"/>
         </w:rPr>
-        <w:t>🎾</w:t>
-      </w:r>
-    </w:p>
-    <w:p>
-      <w:pPr>
-        <w:spacing w:before="240"/>
+      </w:pPr>
+      <w:r>
+        <w:rPr>
+          <w:i/>
+          <w:iCs/>
+          <w:noProof/>
+          <w:sz w:val="28"/>
+          <w:szCs w:val="28"/>
+        </w:rPr>
+        <w:drawing>
+          <wp:anchor distT="0" distB="0" distL="114300" distR="114300" simplePos="0" relativeHeight="251658240" behindDoc="0" locked="0" layoutInCell="1" allowOverlap="1" wp14:anchorId="5C52AA98" wp14:editId="30581DA0">
+            <wp:simplePos x="0" y="0"/>
+            <wp:positionH relativeFrom="margin">
+              <wp:align>center</wp:align>
+            </wp:positionH>
+            <wp:positionV relativeFrom="paragraph">
+              <wp:posOffset>-2919</wp:posOffset>
+            </wp:positionV>
+            <wp:extent cx="3689797" cy="4197932"/>
+            <wp:effectExtent l="0" t="0" r="6350" b="0"/>
+            <wp:wrapNone/>
+            <wp:docPr id="5" name="Imagen 5"/>
+            <wp:cNvGraphicFramePr>
+              <a:graphicFrameLocks xmlns:a="http://schemas.openxmlformats.org/drawingml/2006/main" noChangeAspect="1"/>
+            </wp:cNvGraphicFramePr>
+            <a:graphic xmlns:a="http://schemas.openxmlformats.org/drawingml/2006/main">
+              <a:graphicData uri="http://schemas.openxmlformats.org/drawingml/2006/picture">
+                <pic:pic xmlns:pic="http://schemas.openxmlformats.org/drawingml/2006/picture">
+                  <pic:nvPicPr>
+                    <pic:cNvPr id="5" name="Imagen 5"/>
+                    <pic:cNvPicPr/>
+                  </pic:nvPicPr>
+                  <pic:blipFill>
+                    <a:blip r:embed="rId7">
+                      <a:extLst>
+                        <a:ext uri="{28A0092B-C50C-407E-A947-70E740481C1C}">
+                          <a14:useLocalDpi xmlns:a14="http://schemas.microsoft.com/office/drawing/2010/main" val="0"/>
+                        </a:ext>
+                      </a:extLst>
+                    </a:blip>
+                    <a:stretch>
+                      <a:fillRect/>
+                    </a:stretch>
+                  </pic:blipFill>
+                  <pic:spPr>
+                    <a:xfrm>
+                      <a:off x="0" y="0"/>
+                      <a:ext cx="3689797" cy="4197932"/>
+                    </a:xfrm>
+                    <a:prstGeom prst="rect">
+                      <a:avLst/>
+                    </a:prstGeom>
+                  </pic:spPr>
+                </pic:pic>
+              </a:graphicData>
+            </a:graphic>
+            <wp14:sizeRelH relativeFrom="page">
+              <wp14:pctWidth>0</wp14:pctWidth>
+            </wp14:sizeRelH>
+            <wp14:sizeRelV relativeFrom="page">
+              <wp14:pctHeight>0</wp14:pctHeight>
+            </wp14:sizeRelV>
+          </wp:anchor>
+        </w:drawing>
+      </w:r>
+    </w:p>
+    <w:p>
+      <w:pPr>
+        <w:spacing w:before="120"/>
         <w:jc w:val="center"/>
-      </w:pPr>
-      <w:proofErr w:type="spellStart"/>
-      <w:r>
         <w:rPr>
-          <w:b/>
-          <w:bCs/>
-          <w:color w:val="2E75B6"/>
-          <w:sz w:val="72"/>
-          <w:szCs w:val="72"/>
+          <w:i/>
+          <w:iCs/>
+          <w:sz w:val="28"/>
+          <w:szCs w:val="28"/>
         </w:rPr>
-        <w:t>PistaGO</w:t>
-      </w:r>
-      <w:proofErr w:type="spellEnd"/>
+      </w:pPr>
+    </w:p>
+    <w:p>
+      <w:pPr>
+        <w:spacing w:before="120"/>
+        <w:jc w:val="center"/>
+        <w:rPr>
+          <w:i/>
+          <w:iCs/>
+          <w:sz w:val="28"/>
+          <w:szCs w:val="28"/>
+        </w:rPr>
+      </w:pPr>
+    </w:p>
+    <w:p>
+      <w:pPr>
+        <w:spacing w:before="120"/>
+        <w:jc w:val="center"/>
+        <w:rPr>
+          <w:i/>
+          <w:iCs/>
+          <w:sz w:val="28"/>
+          <w:szCs w:val="28"/>
+        </w:rPr>
+      </w:pPr>
+    </w:p>
+    <w:p>
+      <w:pPr>
+        <w:spacing w:before="120"/>
+        <w:jc w:val="center"/>
+        <w:rPr>
+          <w:i/>
+          <w:iCs/>
+          <w:sz w:val="28"/>
+          <w:szCs w:val="28"/>
+        </w:rPr>
+      </w:pPr>
+    </w:p>
+    <w:p>
+      <w:pPr>
+        <w:spacing w:before="120"/>
+        <w:jc w:val="center"/>
+        <w:rPr>
+          <w:i/>
+          <w:iCs/>
+          <w:sz w:val="28"/>
+          <w:szCs w:val="28"/>
+        </w:rPr>
+      </w:pPr>
+    </w:p>
+    <w:p>
+      <w:pPr>
+        <w:spacing w:before="120"/>
+        <w:jc w:val="center"/>
+        <w:rPr>
+          <w:i/>
+          <w:iCs/>
+          <w:sz w:val="28"/>
+          <w:szCs w:val="28"/>
+        </w:rPr>
+      </w:pPr>
+    </w:p>
+    <w:p>
+      <w:pPr>
+        <w:spacing w:before="120"/>
+        <w:jc w:val="center"/>
+        <w:rPr>
+          <w:i/>
+          <w:iCs/>
+          <w:sz w:val="28"/>
+          <w:szCs w:val="28"/>
+        </w:rPr>
+      </w:pPr>
+    </w:p>
+    <w:p>
+      <w:pPr>
+        <w:spacing w:before="120"/>
+        <w:jc w:val="center"/>
+        <w:rPr>
+          <w:i/>
+          <w:iCs/>
+          <w:sz w:val="28"/>
+          <w:szCs w:val="28"/>
+        </w:rPr>
+      </w:pPr>
+    </w:p>
+    <w:p>
+      <w:pPr>
+        <w:spacing w:before="120"/>
+        <w:jc w:val="center"/>
+        <w:rPr>
+          <w:i/>
+          <w:iCs/>
+          <w:sz w:val="28"/>
+          <w:szCs w:val="28"/>
+        </w:rPr>
+      </w:pPr>
+    </w:p>
+    <w:p>
+      <w:pPr>
+        <w:spacing w:before="120"/>
+        <w:jc w:val="center"/>
+        <w:rPr>
+          <w:i/>
+          <w:iCs/>
+          <w:sz w:val="28"/>
+          <w:szCs w:val="28"/>
+        </w:rPr>
+      </w:pPr>
+    </w:p>
+    <w:p>
+      <w:pPr>
+        <w:spacing w:before="120"/>
+        <w:jc w:val="center"/>
+        <w:rPr>
+          <w:i/>
+          <w:iCs/>
+          <w:sz w:val="28"/>
+          <w:szCs w:val="28"/>
+        </w:rPr>
+      </w:pPr>
+    </w:p>
+    <w:p>
+      <w:pPr>
+        <w:spacing w:before="120"/>
+        <w:jc w:val="center"/>
+        <w:rPr>
+          <w:i/>
+          <w:iCs/>
+          <w:sz w:val="28"/>
+          <w:szCs w:val="28"/>
+        </w:rPr>
+      </w:pPr>
+    </w:p>
+    <w:p>
+      <w:pPr>
+        <w:spacing w:before="120"/>
+        <w:jc w:val="center"/>
+        <w:rPr>
+          <w:i/>
+          <w:iCs/>
+          <w:sz w:val="28"/>
+          <w:szCs w:val="28"/>
+        </w:rPr>
+      </w:pPr>
+    </w:p>
+    <w:p>
+      <w:pPr>
+        <w:spacing w:before="120"/>
+        <w:jc w:val="center"/>
+        <w:rPr>
+          <w:i/>
+          <w:iCs/>
+          <w:sz w:val="28"/>
+          <w:szCs w:val="28"/>
+        </w:rPr>
+      </w:pPr>
+    </w:p>
+    <w:p>
+      <w:pPr>
+        <w:spacing w:before="120"/>
+        <w:jc w:val="center"/>
+        <w:rPr>
+          <w:i/>
+          <w:iCs/>
+          <w:sz w:val="28"/>
+          <w:szCs w:val="28"/>
+        </w:rPr>
+      </w:pPr>
     </w:p>
     <w:p>
       <w:pPr>
@@ -12400,7 +12625,7 @@
                     <pic:cNvPicPr/>
                   </pic:nvPicPr>
                   <pic:blipFill>
-                    <a:blip r:embed="rId7">
+                    <a:blip r:embed="rId8">
                       <a:extLst>
                         <a:ext uri="{28A0092B-C50C-407E-A947-70E740481C1C}">
                           <a14:useLocalDpi xmlns:a14="http://schemas.microsoft.com/office/drawing/2010/main" val="0"/>
@@ -12657,7 +12882,7 @@
                     <pic:cNvPicPr/>
                   </pic:nvPicPr>
                   <pic:blipFill>
-                    <a:blip r:embed="rId8">
+                    <a:blip r:embed="rId9">
                       <a:extLst>
                         <a:ext uri="{28A0092B-C50C-407E-A947-70E740481C1C}">
                           <a14:useLocalDpi xmlns:a14="http://schemas.microsoft.com/office/drawing/2010/main" val="0"/>
@@ -13314,7 +13539,7 @@
       <w:r>
         <w:t xml:space="preserve">El código completo del proyecto está disponible en el siguiente repositorio de GitHub: </w:t>
       </w:r>
-      <w:hyperlink r:id="rId9" w:history="1">
+      <w:hyperlink r:id="rId10" w:history="1">
         <w:r>
           <w:rPr>
             <w:rStyle w:val="Hipervnculo"/>
@@ -15593,7 +15818,7 @@
       <w:r>
         <w:t xml:space="preserve">, cliente Android y documentación): </w:t>
       </w:r>
-      <w:hyperlink r:id="rId10" w:history="1">
+      <w:hyperlink r:id="rId11" w:history="1">
         <w:r>
           <w:rPr>
             <w:rStyle w:val="Hipervnculo"/>
@@ -15672,7 +15897,7 @@
                     </pic:cNvPicPr>
                   </pic:nvPicPr>
                   <pic:blipFill>
-                    <a:blip r:embed="rId11" cstate="print">
+                    <a:blip r:embed="rId12" cstate="print">
                       <a:extLst>
                         <a:ext uri="{28A0092B-C50C-407E-A947-70E740481C1C}">
                           <a14:useLocalDpi xmlns:a14="http://schemas.microsoft.com/office/drawing/2010/main" val="0"/>
@@ -15782,7 +16007,7 @@
                           </pic:cNvPicPr>
                         </pic:nvPicPr>
                         <pic:blipFill>
-                          <a:blip r:embed="rId12" cstate="print">
+                          <a:blip r:embed="rId13" cstate="print">
                             <a:extLst>
                               <a:ext uri="{28A0092B-C50C-407E-A947-70E740481C1C}">
                                 <a14:useLocalDpi xmlns:a14="http://schemas.microsoft.com/office/drawing/2010/main" val="0"/>
@@ -15847,7 +16072,7 @@
                           </pic:cNvPicPr>
                         </pic:nvPicPr>
                         <pic:blipFill>
-                          <a:blip r:embed="rId13" cstate="print">
+                          <a:blip r:embed="rId14" cstate="print">
                             <a:extLst>
                               <a:ext uri="{28A0092B-C50C-407E-A947-70E740481C1C}">
                                 <a14:useLocalDpi xmlns:a14="http://schemas.microsoft.com/office/drawing/2010/main" val="0"/>
@@ -15912,7 +16137,7 @@
                           </pic:cNvPicPr>
                         </pic:nvPicPr>
                         <pic:blipFill>
-                          <a:blip r:embed="rId14" cstate="print">
+                          <a:blip r:embed="rId15" cstate="print">
                             <a:extLst>
                               <a:ext uri="{28A0092B-C50C-407E-A947-70E740481C1C}">
                                 <a14:useLocalDpi xmlns:a14="http://schemas.microsoft.com/office/drawing/2010/main" val="0"/>
@@ -15954,8 +16179,8 @@
       </w:pPr>
     </w:p>
     <w:sectPr>
-      <w:headerReference w:type="default" r:id="rId15"/>
-      <w:footerReference w:type="default" r:id="rId16"/>
+      <w:headerReference w:type="default" r:id="rId16"/>
+      <w:footerReference w:type="default" r:id="rId17"/>
       <w:pgSz w:w="11906" w:h="16838"/>
       <w:pgMar w:top="1440" w:right="1440" w:bottom="1440" w:left="1440" w:header="708" w:footer="708" w:gutter="0"/>
       <w:cols w:space="720"/>
@@ -16915,6 +17140,7 @@
   <w:style w:type="character" w:default="1" w:styleId="Fuentedeprrafopredeter">
     <w:name w:val="Default Paragraph Font"/>
     <w:uiPriority w:val="1"/>
+    <w:semiHidden/>
     <w:unhideWhenUsed/>
   </w:style>
   <w:style w:type="table" w:default="1" w:styleId="Tablanormal">

</xml_diff>

<commit_message>
add captures and update memory
</commit_message>
<xml_diff>
--- a/docs/memoria/Memoria_PistaGO.docx
+++ b/docs/memoria/Memoria_PistaGO.docx
@@ -5615,7 +5615,14 @@
         <w:jc w:val="both"/>
       </w:pPr>
       <w:bookmarkStart w:id="9" w:name="_Toc230535729"/>
-      <w:r>
+    </w:p>
+    <w:p>
+      <w:pPr>
+        <w:pStyle w:val="Ttulo2"/>
+        <w:jc w:val="both"/>
+      </w:pPr>
+      <w:r>
+        <w:lastRenderedPageBreak/>
         <w:t>2.3. Requisitos no funcionales</w:t>
       </w:r>
       <w:bookmarkEnd w:id="9"/>
@@ -5676,7 +5683,6 @@
                 <w:sz w:val="20"/>
                 <w:szCs w:val="20"/>
               </w:rPr>
-              <w:lastRenderedPageBreak/>
               <w:t>Tipo</w:t>
             </w:r>
           </w:p>
@@ -6356,15 +6362,7 @@
         <w:t>tres</w:t>
       </w:r>
       <w:r>
-        <w:t xml:space="preserve"> actores: el Usuario (socio del club), el </w:t>
-      </w:r>
-      <w:proofErr w:type="gramStart"/>
-      <w:r>
-        <w:t>Administrador,  y</w:t>
-      </w:r>
-      <w:proofErr w:type="gramEnd"/>
-      <w:r>
-        <w:t xml:space="preserve"> un actor externo, </w:t>
+        <w:t xml:space="preserve"> actores: el Usuario (socio del club), el Administrador,  y un actor externo, </w:t>
       </w:r>
       <w:proofErr w:type="spellStart"/>
       <w:r>
@@ -6521,6 +6519,7 @@
         <w:jc w:val="both"/>
       </w:pPr>
       <w:r>
+        <w:lastRenderedPageBreak/>
         <w:t>El usuario consulta la disponibilidad y selecciona una franja ocupada.</w:t>
       </w:r>
     </w:p>
@@ -6535,7 +6534,6 @@
         <w:jc w:val="both"/>
       </w:pPr>
       <w:r>
-        <w:lastRenderedPageBreak/>
         <w:t>El usuario solicita apuntarse a la lista de espera de esa pista y franja.</w:t>
       </w:r>
     </w:p>
@@ -6638,15 +6636,7 @@
         <w:t xml:space="preserve">Flujo alternativo: </w:t>
       </w:r>
       <w:r>
-        <w:t xml:space="preserve">si el usuario ya está en la cola, el sistema rechaza la solicitud. Si el usuario destinatario no tiene token de notificación registrado, el aviso se guarda en el </w:t>
-      </w:r>
-      <w:proofErr w:type="gramStart"/>
-      <w:r>
-        <w:t>historial</w:t>
-      </w:r>
-      <w:proofErr w:type="gramEnd"/>
-      <w:r>
-        <w:t xml:space="preserve"> pero no se envía </w:t>
+        <w:t xml:space="preserve">si el usuario ya está en la cola, el sistema rechaza la solicitud. Si el usuario destinatario no tiene token de notificación registrado, el aviso se guarda en el historial pero no se envía </w:t>
       </w:r>
       <w:proofErr w:type="spellStart"/>
       <w:r>
@@ -7202,6 +7192,25 @@
       <w:r>
         <w:t>).</w:t>
       </w:r>
+      <w:r>
+        <w:t xml:space="preserve"> Hay 5 en producción y </w:t>
+      </w:r>
+      <w:proofErr w:type="spellStart"/>
+      <w:r>
+        <w:t>bloqueos_horario</w:t>
+      </w:r>
+      <w:proofErr w:type="spellEnd"/>
+      <w:r>
+        <w:t xml:space="preserve"> y </w:t>
+      </w:r>
+      <w:proofErr w:type="spellStart"/>
+      <w:r>
+        <w:t>configuracion_sistema</w:t>
+      </w:r>
+      <w:proofErr w:type="spellEnd"/>
+      <w:r>
+        <w:t xml:space="preserve"> están pendientes a futuras actualizaciones. </w:t>
+      </w:r>
     </w:p>
     <w:p>
       <w:pPr>
@@ -7209,6 +7218,7 @@
         <w:jc w:val="both"/>
       </w:pPr>
       <w:r>
+        <w:lastRenderedPageBreak/>
         <w:t xml:space="preserve">El diagrama entidad-relación completo, con todos los atributos, claves y relaciones, se encuentra en el repositorio en </w:t>
       </w:r>
       <w:proofErr w:type="spellStart"/>
@@ -7290,7 +7300,6 @@
                 <w:sz w:val="20"/>
                 <w:szCs w:val="20"/>
               </w:rPr>
-              <w:lastRenderedPageBreak/>
               <w:t>Entidad</w:t>
             </w:r>
           </w:p>
@@ -8570,6 +8579,7 @@
                 <w:sz w:val="20"/>
                 <w:szCs w:val="20"/>
               </w:rPr>
+              <w:lastRenderedPageBreak/>
               <w:t>GET /api/usuarios/perfil</w:t>
             </w:r>
           </w:p>
@@ -8778,7 +8788,6 @@
                 <w:sz w:val="20"/>
                 <w:szCs w:val="20"/>
               </w:rPr>
-              <w:lastRenderedPageBreak/>
               <w:t>PUT /api/usuarios/perfil/</w:t>
             </w:r>
             <w:proofErr w:type="spellStart"/>
@@ -9473,23 +9482,7 @@
                 <w:sz w:val="20"/>
                 <w:szCs w:val="20"/>
               </w:rPr>
-              <w:t xml:space="preserve">Enero - </w:t>
-            </w:r>
-            <w:proofErr w:type="gramStart"/>
-            <w:r>
-              <w:rPr>
-                <w:sz w:val="20"/>
-                <w:szCs w:val="20"/>
-              </w:rPr>
-              <w:t>Febrero</w:t>
-            </w:r>
-            <w:proofErr w:type="gramEnd"/>
-            <w:r>
-              <w:rPr>
-                <w:sz w:val="20"/>
-                <w:szCs w:val="20"/>
-              </w:rPr>
-              <w:t xml:space="preserve"> 2026</w:t>
+              <w:t>Enero - Febrero 2026</w:t>
             </w:r>
           </w:p>
         </w:tc>
@@ -9569,23 +9562,7 @@
                 <w:sz w:val="20"/>
                 <w:szCs w:val="20"/>
               </w:rPr>
-              <w:t xml:space="preserve">Febrero - </w:t>
-            </w:r>
-            <w:proofErr w:type="gramStart"/>
-            <w:r>
-              <w:rPr>
-                <w:sz w:val="20"/>
-                <w:szCs w:val="20"/>
-              </w:rPr>
-              <w:t>Marzo</w:t>
-            </w:r>
-            <w:proofErr w:type="gramEnd"/>
-            <w:r>
-              <w:rPr>
-                <w:sz w:val="20"/>
-                <w:szCs w:val="20"/>
-              </w:rPr>
-              <w:t xml:space="preserve"> 2026</w:t>
+              <w:t>Febrero - Marzo 2026</w:t>
             </w:r>
           </w:p>
         </w:tc>
@@ -9649,23 +9626,7 @@
                 <w:sz w:val="20"/>
                 <w:szCs w:val="20"/>
               </w:rPr>
-              <w:t xml:space="preserve">Marzo - </w:t>
-            </w:r>
-            <w:proofErr w:type="gramStart"/>
-            <w:r>
-              <w:rPr>
-                <w:sz w:val="20"/>
-                <w:szCs w:val="20"/>
-              </w:rPr>
-              <w:t>Abril</w:t>
-            </w:r>
-            <w:proofErr w:type="gramEnd"/>
-            <w:r>
-              <w:rPr>
-                <w:sz w:val="20"/>
-                <w:szCs w:val="20"/>
-              </w:rPr>
-              <w:t xml:space="preserve"> 2026</w:t>
+              <w:t>Marzo - Abril 2026</w:t>
             </w:r>
           </w:p>
         </w:tc>
@@ -9729,23 +9690,7 @@
                 <w:sz w:val="20"/>
                 <w:szCs w:val="20"/>
               </w:rPr>
-              <w:t xml:space="preserve">Abril - </w:t>
-            </w:r>
-            <w:proofErr w:type="gramStart"/>
-            <w:r>
-              <w:rPr>
-                <w:sz w:val="20"/>
-                <w:szCs w:val="20"/>
-              </w:rPr>
-              <w:t>Mayo</w:t>
-            </w:r>
-            <w:proofErr w:type="gramEnd"/>
-            <w:r>
-              <w:rPr>
-                <w:sz w:val="20"/>
-                <w:szCs w:val="20"/>
-              </w:rPr>
-              <w:t xml:space="preserve"> 2026</w:t>
+              <w:t>Abril - Mayo 2026</w:t>
             </w:r>
           </w:p>
         </w:tc>
@@ -9889,23 +9834,7 @@
                 <w:sz w:val="20"/>
                 <w:szCs w:val="20"/>
               </w:rPr>
-              <w:t xml:space="preserve">Mayo - </w:t>
-            </w:r>
-            <w:proofErr w:type="gramStart"/>
-            <w:r>
-              <w:rPr>
-                <w:sz w:val="20"/>
-                <w:szCs w:val="20"/>
-              </w:rPr>
-              <w:t>Junio</w:t>
-            </w:r>
-            <w:proofErr w:type="gramEnd"/>
-            <w:r>
-              <w:rPr>
-                <w:sz w:val="20"/>
-                <w:szCs w:val="20"/>
-              </w:rPr>
-              <w:t xml:space="preserve"> 2026</w:t>
+              <w:t>Mayo - Junio 2026</w:t>
             </w:r>
           </w:p>
         </w:tc>
@@ -13266,7 +13195,7 @@
           <w:szCs w:val="22"/>
         </w:rPr>
         <w:drawing>
-          <wp:inline distT="0" distB="0" distL="0" distR="0" wp14:anchorId="5B4A8AEC" wp14:editId="233EA5A0">
+          <wp:inline distT="0" distB="0" distL="0" distR="0" wp14:anchorId="5B4A8AEC" wp14:editId="062A669D">
             <wp:extent cx="5731510" cy="2351088"/>
             <wp:effectExtent l="0" t="0" r="2540" b="0"/>
             <wp:docPr id="2" name="Imagen 2"/>
@@ -13420,7 +13349,6 @@
         </w:rPr>
         <w:t xml:space="preserve"> </w:t>
       </w:r>
-      <w:proofErr w:type="gramStart"/>
       <w:r>
         <w:rPr>
           <w:b w:val="0"/>
@@ -13429,18 +13357,7 @@
           <w:sz w:val="22"/>
           <w:szCs w:val="22"/>
         </w:rPr>
-        <w:t>Además</w:t>
-      </w:r>
-      <w:proofErr w:type="gramEnd"/>
-      <w:r>
-        <w:rPr>
-          <w:b w:val="0"/>
-          <w:bCs w:val="0"/>
-          <w:color w:val="auto"/>
-          <w:sz w:val="22"/>
-          <w:szCs w:val="22"/>
-        </w:rPr>
-        <w:t xml:space="preserve"> se cubren tres casos para la regla de reserva única por usuario: rechazo cuando ya hay una reserva activa, permitir reservar cuando la anterior ha expirado, y exención del rol ADMINISTRADOR</w:t>
+        <w:t>Además se cubren tres casos para la regla de reserva única por usuario: rechazo cuando ya hay una reserva activa, permitir reservar cuando la anterior ha expirado, y exención del rol ADMINISTRADOR</w:t>
       </w:r>
     </w:p>
     <w:p>
@@ -13622,7 +13539,7 @@
         </w:rPr>
         <w:lastRenderedPageBreak/>
         <w:drawing>
-          <wp:inline distT="0" distB="0" distL="0" distR="0" wp14:anchorId="7A0A4147" wp14:editId="0A84C9CE">
+          <wp:inline distT="0" distB="0" distL="0" distR="0" wp14:anchorId="7A0A4147" wp14:editId="348C51C9">
             <wp:extent cx="5731510" cy="2291930"/>
             <wp:effectExtent l="0" t="0" r="2540" b="0"/>
             <wp:docPr id="3" name="Imagen 3"/>

</xml_diff>

<commit_message>
update memory and ReservaService delete !!
</commit_message>
<xml_diff>
--- a/docs/memoria/Memoria_PistaGO.docx
+++ b/docs/memoria/Memoria_PistaGO.docx
@@ -558,21 +558,7 @@
                 <w:rStyle w:val="Hipervnculo"/>
                 <w:noProof/>
               </w:rPr>
-              <w:t>1.1. Intro</w:t>
-            </w:r>
-            <w:r>
-              <w:rPr>
-                <w:rStyle w:val="Hipervnculo"/>
-                <w:noProof/>
-              </w:rPr>
-              <w:t>d</w:t>
-            </w:r>
-            <w:r>
-              <w:rPr>
-                <w:rStyle w:val="Hipervnculo"/>
-                <w:noProof/>
-              </w:rPr>
-              <w:t>ucción</w:t>
+              <w:t>1.1. Introducción</w:t>
             </w:r>
             <w:r>
               <w:rPr>
@@ -4424,10 +4410,7 @@
         <w:t>,</w:t>
       </w:r>
       <w:r>
-        <w:t xml:space="preserve"> </w:t>
-      </w:r>
-      <w:r>
-        <w:t>con índices compuestos para optimizar las consultas de disponibilidad.</w:t>
+        <w:t xml:space="preserve"> con índices compuestos para optimizar las consultas de disponibilidad.</w:t>
       </w:r>
     </w:p>
     <w:p>
@@ -7575,13 +7558,7 @@
         <w:jc w:val="both"/>
       </w:pPr>
       <w:r>
-        <w:t>2.</w:t>
-      </w:r>
-      <w:r>
-        <w:t>6</w:t>
-      </w:r>
-      <w:r>
-        <w:t xml:space="preserve">. </w:t>
+        <w:t xml:space="preserve">2.6. </w:t>
       </w:r>
       <w:r>
         <w:t>Requisitos previstos para trabajo futuro</w:t>
@@ -7616,10 +7593,7 @@
       </w:r>
       <w:proofErr w:type="gramEnd"/>
       <w:r>
-        <w:t xml:space="preserve"> pero no implementadas en esta versión del proyecto. Estos requisitos quedan documentados como evolución natural del sistema:</w:t>
-      </w:r>
-      <w:r>
-        <w:t xml:space="preserve"> </w:t>
+        <w:t xml:space="preserve"> pero no implementadas en esta versión del proyecto. Estos requisitos quedan documentados como evolución natural del sistema: </w:t>
       </w:r>
     </w:p>
     <w:p>
@@ -7823,14 +7797,7 @@
                 <w:sz w:val="20"/>
                 <w:szCs w:val="20"/>
               </w:rPr>
-              <w:t>FUT-0</w:t>
-            </w:r>
-            <w:r>
-              <w:rPr>
-                <w:sz w:val="20"/>
-                <w:szCs w:val="20"/>
-              </w:rPr>
-              <w:t>2</w:t>
+              <w:t>FUT-02</w:t>
             </w:r>
           </w:p>
         </w:tc>
@@ -16096,7 +16063,7 @@
           <w:szCs w:val="22"/>
         </w:rPr>
         <w:drawing>
-          <wp:inline distT="0" distB="0" distL="0" distR="0" wp14:anchorId="5B4A8AEC" wp14:editId="154C095B">
+          <wp:inline distT="0" distB="0" distL="0" distR="0" wp14:anchorId="5B4A8AEC" wp14:editId="5EC0794E">
             <wp:extent cx="5731510" cy="2351088"/>
             <wp:effectExtent l="0" t="0" r="2540" b="0"/>
             <wp:docPr id="2" name="Imagen 2"/>
@@ -16415,6 +16382,58 @@
         </w:rPr>
         <w:t xml:space="preserve"> correspondiente y se integran en el ciclo de compilación. El informe de resultados generado confirma que la totalidad de las pruebas se superan correctamente</w:t>
       </w:r>
+      <w:r>
+        <w:rPr>
+          <w:b w:val="0"/>
+          <w:bCs w:val="0"/>
+          <w:color w:val="auto"/>
+          <w:sz w:val="22"/>
+          <w:szCs w:val="22"/>
+        </w:rPr>
+        <w:t xml:space="preserve">. </w:t>
+      </w:r>
+      <w:r>
+        <w:rPr>
+          <w:b w:val="0"/>
+          <w:bCs w:val="0"/>
+          <w:color w:val="auto"/>
+          <w:sz w:val="22"/>
+          <w:szCs w:val="22"/>
+        </w:rPr>
+        <w:t xml:space="preserve">Las pruebas unitarias cubren la lógica de negocio implementada hasta antes del sprint final. Las funcionalidades incorporadas en la fase de refinamiento —rotación automática de la cola de espera con @Scheduled, notificación </w:t>
+      </w:r>
+      <w:proofErr w:type="spellStart"/>
+      <w:r>
+        <w:rPr>
+          <w:b w:val="0"/>
+          <w:bCs w:val="0"/>
+          <w:color w:val="auto"/>
+          <w:sz w:val="22"/>
+          <w:szCs w:val="22"/>
+        </w:rPr>
+        <w:t>push</w:t>
+      </w:r>
+      <w:proofErr w:type="spellEnd"/>
+      <w:r>
+        <w:rPr>
+          <w:b w:val="0"/>
+          <w:bCs w:val="0"/>
+          <w:color w:val="auto"/>
+          <w:sz w:val="22"/>
+          <w:szCs w:val="22"/>
+        </w:rPr>
+        <w:t xml:space="preserve"> al usuario afectado por cancelaciones del administrador, ajuste del cómputo de estadísticas para incluir reservas EXPIRADAS— se han verificado funcionalmente de forma manual y quedan identificadas como ampliación natural de la suite automatizada para trabajos futuros</w:t>
+      </w:r>
+      <w:r>
+        <w:rPr>
+          <w:b w:val="0"/>
+          <w:bCs w:val="0"/>
+          <w:color w:val="auto"/>
+          <w:sz w:val="22"/>
+          <w:szCs w:val="22"/>
+        </w:rPr>
+        <w:t>.</w:t>
+      </w:r>
     </w:p>
     <w:p>
       <w:pPr>
@@ -16450,9 +16469,8 @@
           <w:sz w:val="22"/>
           <w:szCs w:val="22"/>
         </w:rPr>
-        <w:lastRenderedPageBreak/>
         <w:drawing>
-          <wp:inline distT="0" distB="0" distL="0" distR="0" wp14:anchorId="7A0A4147" wp14:editId="2D4D9B50">
+          <wp:inline distT="0" distB="0" distL="0" distR="0" wp14:anchorId="7A0A4147" wp14:editId="2B9719AB">
             <wp:extent cx="5731510" cy="2291930"/>
             <wp:effectExtent l="0" t="0" r="2540" b="0"/>
             <wp:docPr id="3" name="Imagen 3"/>
@@ -16629,7 +16647,7 @@
           <w:sz w:val="22"/>
           <w:szCs w:val="22"/>
         </w:rPr>
-        <w:t xml:space="preserve">, comprobando tanto los casos correctos como los de error (por ejemplo, el rechazo de un registro con email inválido o contraseña demasiado corta). El flujo más representativo verificado de extremo a extremo fue el ciclo completo de notificación: con dos usuarios reales, uno se apuntó a la lista de espera de una franja ocupada y, al cancelar el otro su reserva, el primero recibió la notificación </w:t>
+        <w:t xml:space="preserve"> y a través de la interfaz interactiva de </w:t>
       </w:r>
       <w:proofErr w:type="spellStart"/>
       <w:r>
@@ -16640,7 +16658,7 @@
           <w:sz w:val="22"/>
           <w:szCs w:val="22"/>
         </w:rPr>
-        <w:t>push</w:t>
+        <w:t>Swagger</w:t>
       </w:r>
       <w:proofErr w:type="spellEnd"/>
       <w:r>
@@ -16651,10 +16669,13 @@
           <w:sz w:val="22"/>
           <w:szCs w:val="22"/>
         </w:rPr>
-        <w:t xml:space="preserve"> en su dispositivo, validando así toda la cadena cliente-servidor-</w:t>
-      </w:r>
-      <w:proofErr w:type="spellStart"/>
-      <w:r>
+        <w:t xml:space="preserve"> UI, comprobando tanto los casos correctos como los de error (por ejemplo, el rechazo de un registro con email inválido o contraseña demasiado corta). Los flujos más representativos verificados de extremo a extremo fueron tres:</w:t>
+      </w:r>
+    </w:p>
+    <w:p>
+      <w:pPr>
+        <w:pStyle w:val="Ttulo2"/>
+        <w:jc w:val="both"/>
         <w:rPr>
           <w:b w:val="0"/>
           <w:bCs w:val="0"/>
@@ -16662,9 +16683,7 @@
           <w:sz w:val="22"/>
           <w:szCs w:val="22"/>
         </w:rPr>
-        <w:t>Firebase</w:t>
-      </w:r>
-      <w:proofErr w:type="spellEnd"/>
+      </w:pPr>
       <w:r>
         <w:rPr>
           <w:b w:val="0"/>
@@ -16673,7 +16692,185 @@
           <w:sz w:val="22"/>
           <w:szCs w:val="22"/>
         </w:rPr>
+        <w:t xml:space="preserve">Ciclo completo de notificación tras cancelación de usuario: con dos usuarios reales, uno se apuntó a la lista de espera de una franja ocupada y, al cancelar el otro su reserva, el primero recibió la notificación </w:t>
+      </w:r>
+      <w:proofErr w:type="spellStart"/>
+      <w:r>
+        <w:rPr>
+          <w:b w:val="0"/>
+          <w:bCs w:val="0"/>
+          <w:color w:val="auto"/>
+          <w:sz w:val="22"/>
+          <w:szCs w:val="22"/>
+        </w:rPr>
+        <w:t>push</w:t>
+      </w:r>
+      <w:proofErr w:type="spellEnd"/>
+      <w:r>
+        <w:rPr>
+          <w:b w:val="0"/>
+          <w:bCs w:val="0"/>
+          <w:color w:val="auto"/>
+          <w:sz w:val="22"/>
+          <w:szCs w:val="22"/>
+        </w:rPr>
+        <w:t xml:space="preserve"> en su dispositivo, validando toda la cadena cliente-servidor-</w:t>
+      </w:r>
+      <w:proofErr w:type="spellStart"/>
+      <w:r>
+        <w:rPr>
+          <w:b w:val="0"/>
+          <w:bCs w:val="0"/>
+          <w:color w:val="auto"/>
+          <w:sz w:val="22"/>
+          <w:szCs w:val="22"/>
+        </w:rPr>
+        <w:t>Firebase</w:t>
+      </w:r>
+      <w:proofErr w:type="spellEnd"/>
+      <w:r>
+        <w:rPr>
+          <w:b w:val="0"/>
+          <w:bCs w:val="0"/>
+          <w:color w:val="auto"/>
+          <w:sz w:val="22"/>
+          <w:szCs w:val="22"/>
+        </w:rPr>
         <w:t>.</w:t>
+      </w:r>
+    </w:p>
+    <w:p>
+      <w:pPr>
+        <w:pStyle w:val="Ttulo2"/>
+        <w:jc w:val="both"/>
+        <w:rPr>
+          <w:b w:val="0"/>
+          <w:bCs w:val="0"/>
+          <w:color w:val="auto"/>
+          <w:sz w:val="22"/>
+          <w:szCs w:val="22"/>
+        </w:rPr>
+      </w:pPr>
+      <w:r>
+        <w:rPr>
+          <w:b w:val="0"/>
+          <w:bCs w:val="0"/>
+          <w:color w:val="auto"/>
+          <w:sz w:val="22"/>
+          <w:szCs w:val="22"/>
+        </w:rPr>
+        <w:t xml:space="preserve">Rotación automática de la cola: con tres usuarios en la cola, se dejó pasar el plazo de confirmación del primero notificado y se verificó que el </w:t>
+      </w:r>
+      <w:proofErr w:type="spellStart"/>
+      <w:r>
+        <w:rPr>
+          <w:b w:val="0"/>
+          <w:bCs w:val="0"/>
+          <w:color w:val="auto"/>
+          <w:sz w:val="22"/>
+          <w:szCs w:val="22"/>
+        </w:rPr>
+        <w:t>scheduler</w:t>
+      </w:r>
+      <w:proofErr w:type="spellEnd"/>
+      <w:r>
+        <w:rPr>
+          <w:b w:val="0"/>
+          <w:bCs w:val="0"/>
+          <w:color w:val="auto"/>
+          <w:sz w:val="22"/>
+          <w:szCs w:val="22"/>
+        </w:rPr>
+        <w:t xml:space="preserve"> detectaba la expiración, eliminaba su entrada y enviaba automáticamente la notificación </w:t>
+      </w:r>
+      <w:proofErr w:type="spellStart"/>
+      <w:r>
+        <w:rPr>
+          <w:b w:val="0"/>
+          <w:bCs w:val="0"/>
+          <w:color w:val="auto"/>
+          <w:sz w:val="22"/>
+          <w:szCs w:val="22"/>
+        </w:rPr>
+        <w:t>push</w:t>
+      </w:r>
+      <w:proofErr w:type="spellEnd"/>
+      <w:r>
+        <w:rPr>
+          <w:b w:val="0"/>
+          <w:bCs w:val="0"/>
+          <w:color w:val="auto"/>
+          <w:sz w:val="22"/>
+          <w:szCs w:val="22"/>
+        </w:rPr>
+        <w:t xml:space="preserve"> al segundo usuario, todo ello sin intervención manual.</w:t>
+      </w:r>
+    </w:p>
+    <w:p>
+      <w:pPr>
+        <w:pStyle w:val="Ttulo2"/>
+        <w:jc w:val="both"/>
+        <w:rPr>
+          <w:b w:val="0"/>
+          <w:bCs w:val="0"/>
+          <w:color w:val="auto"/>
+          <w:sz w:val="22"/>
+          <w:szCs w:val="22"/>
+        </w:rPr>
+      </w:pPr>
+      <w:r>
+        <w:rPr>
+          <w:b w:val="0"/>
+          <w:bCs w:val="0"/>
+          <w:color w:val="auto"/>
+          <w:sz w:val="22"/>
+          <w:szCs w:val="22"/>
+        </w:rPr>
+        <w:t xml:space="preserve">Cancelación por administrador con doble notificación: el administrador canceló una reserva de un socio del club; se comprobó que el socio afectado recibía el </w:t>
+      </w:r>
+      <w:proofErr w:type="spellStart"/>
+      <w:r>
+        <w:rPr>
+          <w:b w:val="0"/>
+          <w:bCs w:val="0"/>
+          <w:color w:val="auto"/>
+          <w:sz w:val="22"/>
+          <w:szCs w:val="22"/>
+        </w:rPr>
+        <w:t>push</w:t>
+      </w:r>
+      <w:proofErr w:type="spellEnd"/>
+      <w:r>
+        <w:rPr>
+          <w:b w:val="0"/>
+          <w:bCs w:val="0"/>
+          <w:color w:val="auto"/>
+          <w:sz w:val="22"/>
+          <w:szCs w:val="22"/>
+        </w:rPr>
+        <w:t xml:space="preserve"> de cancelación y, simultáneamente, el primer usuario de la lista de espera de esa franja recibía el </w:t>
+      </w:r>
+      <w:proofErr w:type="spellStart"/>
+      <w:r>
+        <w:rPr>
+          <w:b w:val="0"/>
+          <w:bCs w:val="0"/>
+          <w:color w:val="auto"/>
+          <w:sz w:val="22"/>
+          <w:szCs w:val="22"/>
+        </w:rPr>
+        <w:t>push</w:t>
+      </w:r>
+      <w:proofErr w:type="spellEnd"/>
+      <w:r>
+        <w:rPr>
+          <w:b w:val="0"/>
+          <w:bCs w:val="0"/>
+          <w:color w:val="auto"/>
+          <w:sz w:val="22"/>
+          <w:szCs w:val="22"/>
+        </w:rPr>
+        <w:t xml:space="preserve"> de turno disponible.</w:t>
       </w:r>
     </w:p>
     <w:p>
@@ -16780,105 +16977,6 @@
     </w:p>
     <w:p>
       <w:pPr>
-        <w:jc w:val="both"/>
-      </w:pPr>
-      <w:r>
-        <w:br w:type="page"/>
-      </w:r>
-    </w:p>
-    <w:p>
-      <w:pPr>
-        <w:pStyle w:val="Ttulo1"/>
-        <w:jc w:val="both"/>
-      </w:pPr>
-      <w:bookmarkStart w:id="39" w:name="_Toc230535759"/>
-      <w:r>
-        <w:lastRenderedPageBreak/>
-        <w:t>7. Despliegue</w:t>
-      </w:r>
-      <w:bookmarkEnd w:id="39"/>
-    </w:p>
-    <w:p>
-      <w:pPr>
-        <w:pStyle w:val="Ttulo2"/>
-        <w:jc w:val="both"/>
-      </w:pPr>
-      <w:bookmarkStart w:id="40" w:name="_Toc230535760"/>
-      <w:r>
-        <w:t>7.1. Entorno de producción</w:t>
-      </w:r>
-      <w:bookmarkEnd w:id="40"/>
-    </w:p>
-    <w:p>
-      <w:pPr>
-        <w:spacing w:after="120" w:line="276" w:lineRule="auto"/>
-        <w:jc w:val="both"/>
-      </w:pPr>
-      <w:r>
-        <w:t xml:space="preserve">El </w:t>
-      </w:r>
-      <w:proofErr w:type="spellStart"/>
-      <w:r>
-        <w:t>backend</w:t>
-      </w:r>
-      <w:proofErr w:type="spellEnd"/>
-      <w:r>
-        <w:t xml:space="preserve"> de </w:t>
-      </w:r>
-      <w:proofErr w:type="spellStart"/>
-      <w:r>
-        <w:t>PistaGO</w:t>
-      </w:r>
-      <w:proofErr w:type="spellEnd"/>
-      <w:r>
-        <w:t xml:space="preserve"> se ha desplegado en un servidor virtual privado (VPS) de </w:t>
-      </w:r>
-      <w:proofErr w:type="spellStart"/>
-      <w:r>
-        <w:t>DigitalOcean</w:t>
-      </w:r>
-      <w:proofErr w:type="spellEnd"/>
-      <w:r>
-        <w:t xml:space="preserve"> con sistema operativo Ubuntu, aprovechando el crédito gratuito que ofrece el GitHub </w:t>
-      </w:r>
-      <w:proofErr w:type="spellStart"/>
-      <w:r>
-        <w:t>Student</w:t>
-      </w:r>
-      <w:proofErr w:type="spellEnd"/>
-      <w:r>
-        <w:t xml:space="preserve"> </w:t>
-      </w:r>
-      <w:proofErr w:type="spellStart"/>
-      <w:r>
-        <w:t>Developer</w:t>
-      </w:r>
-      <w:proofErr w:type="spellEnd"/>
-      <w:r>
-        <w:t xml:space="preserve"> Pack. A diferencia de la previsión inicial (que contemplaba plataformas como </w:t>
-      </w:r>
-      <w:proofErr w:type="spellStart"/>
-      <w:r>
-        <w:t>Railway</w:t>
-      </w:r>
-      <w:proofErr w:type="spellEnd"/>
-      <w:r>
-        <w:t xml:space="preserve"> o Render), se optó por un VPS propio, lo que aporta un control total sobre el entorno y constituye una experiencia más cercana a un escenario profesional real de administración de sistemas.</w:t>
-      </w:r>
-    </w:p>
-    <w:p>
-      <w:pPr>
-        <w:pStyle w:val="Ttulo2"/>
-        <w:jc w:val="both"/>
-      </w:pPr>
-      <w:bookmarkStart w:id="41" w:name="_Toc230535761"/>
-      <w:r>
-        <w:t>7.2. Componentes del despliegue</w:t>
-      </w:r>
-      <w:bookmarkEnd w:id="41"/>
-    </w:p>
-    <w:p>
-      <w:pPr>
         <w:pStyle w:val="Prrafodelista"/>
         <w:numPr>
           <w:ilvl w:val="0"/>
@@ -16887,40 +16985,16 @@
         <w:spacing w:after="60" w:line="276" w:lineRule="auto"/>
         <w:jc w:val="both"/>
       </w:pPr>
-      <w:proofErr w:type="spellStart"/>
-      <w:r>
-        <w:rPr>
-          <w:b/>
-          <w:bCs/>
-        </w:rPr>
-        <w:t>Nginx</w:t>
-      </w:r>
-      <w:proofErr w:type="spellEnd"/>
-      <w:r>
-        <w:rPr>
-          <w:b/>
-          <w:bCs/>
-        </w:rPr>
-        <w:t xml:space="preserve"> como proxy inverso: </w:t>
-      </w:r>
-      <w:r>
-        <w:t xml:space="preserve">recibe las peticiones HTTPS en el subdominio de la API y las redirige al </w:t>
-      </w:r>
-      <w:proofErr w:type="spellStart"/>
-      <w:r>
-        <w:t>backend</w:t>
-      </w:r>
-      <w:proofErr w:type="spellEnd"/>
-      <w:r>
-        <w:t xml:space="preserve"> de Spring </w:t>
-      </w:r>
-      <w:proofErr w:type="spellStart"/>
-      <w:r>
-        <w:t>Boot</w:t>
-      </w:r>
-      <w:proofErr w:type="spellEnd"/>
-      <w:r>
-        <w:t>, que escucha en local. Además, sirve directamente las fotos de perfil como archivos estáticos.</w:t>
+      <w:r>
+        <w:t xml:space="preserve">Cancelación de reservas ajenas por parte del administrador: el sistema permite la operación si el rol es ADMINISTRADOR y, simultáneamente, notifica al socio afectado mediante </w:t>
+      </w:r>
+      <w:proofErr w:type="spellStart"/>
+      <w:r>
+        <w:t>push</w:t>
+      </w:r>
+      <w:proofErr w:type="spellEnd"/>
+      <w:r>
+        <w:t xml:space="preserve">. </w:t>
       </w:r>
     </w:p>
     <w:p>
@@ -16934,46 +17008,8 @@
         <w:jc w:val="both"/>
       </w:pPr>
       <w:r>
-        <w:rPr>
-          <w:b/>
-          <w:bCs/>
-        </w:rPr>
-        <w:t xml:space="preserve">HTTPS con </w:t>
-      </w:r>
-      <w:proofErr w:type="spellStart"/>
-      <w:r>
-        <w:rPr>
-          <w:b/>
-          <w:bCs/>
-        </w:rPr>
-        <w:t>Let's</w:t>
-      </w:r>
-      <w:proofErr w:type="spellEnd"/>
-      <w:r>
-        <w:rPr>
-          <w:b/>
-          <w:bCs/>
-        </w:rPr>
-        <w:t xml:space="preserve"> </w:t>
-      </w:r>
-      <w:proofErr w:type="spellStart"/>
-      <w:r>
-        <w:rPr>
-          <w:b/>
-          <w:bCs/>
-        </w:rPr>
-        <w:t>Encrypt</w:t>
-      </w:r>
-      <w:proofErr w:type="spellEnd"/>
-      <w:r>
-        <w:rPr>
-          <w:b/>
-          <w:bCs/>
-        </w:rPr>
-        <w:t xml:space="preserve">: </w:t>
-      </w:r>
-      <w:r>
-        <w:t>certificado SSL gratuito y renovable que cifra todas las comunicaciones.</w:t>
+        <w:lastRenderedPageBreak/>
+        <w:t xml:space="preserve">Expiración de plazo en lista de espera sin confirmación: la tarea programada elimina la entrada caducada y notifica al siguiente usuario. </w:t>
       </w:r>
     </w:p>
     <w:p>
@@ -16987,15 +17023,115 @@
         <w:jc w:val="both"/>
       </w:pPr>
       <w:r>
-        <w:rPr>
-          <w:b/>
-          <w:bCs/>
-        </w:rPr>
-        <w:t xml:space="preserve">PostgreSQL: </w:t>
-      </w:r>
-      <w:r>
-        <w:t>base de datos instalada en el propio servidor, accesible solo de forma local por seguridad.</w:t>
-      </w:r>
+        <w:t xml:space="preserve">Consistencia horaria entre </w:t>
+      </w:r>
+      <w:proofErr w:type="spellStart"/>
+      <w:r>
+        <w:t>backend</w:t>
+      </w:r>
+      <w:proofErr w:type="spellEnd"/>
+      <w:r>
+        <w:t xml:space="preserve"> y cliente: verificada coincidencia exacta de las horas mostradas en la app con las almacenadas en base de datos, tras la fijación explícita de la zona horaria en el servidor.</w:t>
+      </w:r>
+    </w:p>
+    <w:p>
+      <w:pPr>
+        <w:jc w:val="both"/>
+      </w:pPr>
+      <w:r>
+        <w:br w:type="page"/>
+      </w:r>
+    </w:p>
+    <w:p>
+      <w:pPr>
+        <w:pStyle w:val="Ttulo1"/>
+        <w:jc w:val="both"/>
+      </w:pPr>
+      <w:bookmarkStart w:id="39" w:name="_Toc230535759"/>
+      <w:r>
+        <w:lastRenderedPageBreak/>
+        <w:t>7. Despliegue</w:t>
+      </w:r>
+      <w:bookmarkEnd w:id="39"/>
+    </w:p>
+    <w:p>
+      <w:pPr>
+        <w:pStyle w:val="Ttulo2"/>
+        <w:jc w:val="both"/>
+      </w:pPr>
+      <w:bookmarkStart w:id="40" w:name="_Toc230535760"/>
+      <w:r>
+        <w:t>7.1. Entorno de producción</w:t>
+      </w:r>
+      <w:bookmarkEnd w:id="40"/>
+    </w:p>
+    <w:p>
+      <w:pPr>
+        <w:spacing w:after="120" w:line="276" w:lineRule="auto"/>
+        <w:jc w:val="both"/>
+      </w:pPr>
+      <w:r>
+        <w:t xml:space="preserve">El </w:t>
+      </w:r>
+      <w:proofErr w:type="spellStart"/>
+      <w:r>
+        <w:t>backend</w:t>
+      </w:r>
+      <w:proofErr w:type="spellEnd"/>
+      <w:r>
+        <w:t xml:space="preserve"> de </w:t>
+      </w:r>
+      <w:proofErr w:type="spellStart"/>
+      <w:r>
+        <w:t>PistaGO</w:t>
+      </w:r>
+      <w:proofErr w:type="spellEnd"/>
+      <w:r>
+        <w:t xml:space="preserve"> se ha desplegado en un servidor virtual privado (VPS) de </w:t>
+      </w:r>
+      <w:proofErr w:type="spellStart"/>
+      <w:r>
+        <w:t>DigitalOcean</w:t>
+      </w:r>
+      <w:proofErr w:type="spellEnd"/>
+      <w:r>
+        <w:t xml:space="preserve"> con sistema operativo Ubuntu, aprovechando el crédito gratuito que ofrece el GitHub </w:t>
+      </w:r>
+      <w:proofErr w:type="spellStart"/>
+      <w:r>
+        <w:t>Student</w:t>
+      </w:r>
+      <w:proofErr w:type="spellEnd"/>
+      <w:r>
+        <w:t xml:space="preserve"> </w:t>
+      </w:r>
+      <w:proofErr w:type="spellStart"/>
+      <w:r>
+        <w:t>Developer</w:t>
+      </w:r>
+      <w:proofErr w:type="spellEnd"/>
+      <w:r>
+        <w:t xml:space="preserve"> Pack. A diferencia de la previsión inicial (que contemplaba plataformas como </w:t>
+      </w:r>
+      <w:proofErr w:type="spellStart"/>
+      <w:r>
+        <w:t>Railway</w:t>
+      </w:r>
+      <w:proofErr w:type="spellEnd"/>
+      <w:r>
+        <w:t xml:space="preserve"> o Render), se optó por un VPS propio, lo que aporta un control total sobre el entorno y constituye una experiencia más cercana a un escenario profesional real de administración de sistemas.</w:t>
+      </w:r>
+    </w:p>
+    <w:p>
+      <w:pPr>
+        <w:pStyle w:val="Ttulo2"/>
+        <w:jc w:val="both"/>
+      </w:pPr>
+      <w:bookmarkStart w:id="41" w:name="_Toc230535761"/>
+      <w:r>
+        <w:t>7.2. Componentes del despliegue</w:t>
+      </w:r>
+      <w:bookmarkEnd w:id="41"/>
     </w:p>
     <w:p>
       <w:pPr>
@@ -17007,31 +17143,40 @@
         <w:spacing w:after="60" w:line="276" w:lineRule="auto"/>
         <w:jc w:val="both"/>
       </w:pPr>
+      <w:proofErr w:type="spellStart"/>
       <w:r>
         <w:rPr>
           <w:b/>
           <w:bCs/>
         </w:rPr>
-        <w:t xml:space="preserve">Backend Spring </w:t>
-      </w:r>
-      <w:proofErr w:type="spellStart"/>
+        <w:t>Nginx</w:t>
+      </w:r>
+      <w:proofErr w:type="spellEnd"/>
       <w:r>
         <w:rPr>
           <w:b/>
           <w:bCs/>
         </w:rPr>
+        <w:t xml:space="preserve"> como proxy inverso: </w:t>
+      </w:r>
+      <w:r>
+        <w:t xml:space="preserve">recibe las peticiones HTTPS en el subdominio de la API y las redirige al </w:t>
+      </w:r>
+      <w:proofErr w:type="spellStart"/>
+      <w:r>
+        <w:t>backend</w:t>
+      </w:r>
+      <w:proofErr w:type="spellEnd"/>
+      <w:r>
+        <w:t xml:space="preserve"> de Spring </w:t>
+      </w:r>
+      <w:proofErr w:type="spellStart"/>
+      <w:r>
         <w:t>Boot</w:t>
       </w:r>
       <w:proofErr w:type="spellEnd"/>
       <w:r>
-        <w:rPr>
-          <w:b/>
-          <w:bCs/>
-        </w:rPr>
-        <w:t xml:space="preserve">: </w:t>
-      </w:r>
-      <w:r>
-        <w:t>empaquetado como un archivo JAR ejecutable y arrancado como proceso en segundo plano.</w:t>
+        <w:t>, que escucha en local. Además, sirve directamente las fotos de perfil como archivos estáticos.</w:t>
       </w:r>
     </w:p>
     <w:p>
@@ -17044,40 +17189,47 @@
         <w:spacing w:after="60" w:line="276" w:lineRule="auto"/>
         <w:jc w:val="both"/>
       </w:pPr>
-      <w:proofErr w:type="spellStart"/>
       <w:r>
         <w:rPr>
           <w:b/>
           <w:bCs/>
         </w:rPr>
-        <w:t>Firebase</w:t>
-      </w:r>
-      <w:proofErr w:type="spellEnd"/>
+        <w:t xml:space="preserve">HTTPS con </w:t>
+      </w:r>
+      <w:proofErr w:type="spellStart"/>
       <w:r>
         <w:rPr>
           <w:b/>
           <w:bCs/>
         </w:rPr>
-        <w:t xml:space="preserve"> </w:t>
-      </w:r>
-      <w:proofErr w:type="spellStart"/>
+        <w:t>Let's</w:t>
+      </w:r>
+      <w:proofErr w:type="spellEnd"/>
       <w:r>
         <w:rPr>
           <w:b/>
           <w:bCs/>
         </w:rPr>
-        <w:t>Admin</w:t>
-      </w:r>
-      <w:proofErr w:type="spellEnd"/>
+        <w:t xml:space="preserve"> </w:t>
+      </w:r>
+      <w:proofErr w:type="spellStart"/>
       <w:r>
         <w:rPr>
           <w:b/>
           <w:bCs/>
         </w:rPr>
-        <w:t xml:space="preserve"> SDK: </w:t>
-      </w:r>
-      <w:r>
-        <w:t>configurado con una clave de cuenta de servicio, protegida con permisos restringidos y nunca incluida en el control de versiones.</w:t>
+        <w:t>Encrypt</w:t>
+      </w:r>
+      <w:proofErr w:type="spellEnd"/>
+      <w:r>
+        <w:rPr>
+          <w:b/>
+          <w:bCs/>
+        </w:rPr>
+        <w:t xml:space="preserve">: </w:t>
+      </w:r>
+      <w:r>
+        <w:t>certificado SSL gratuito y renovable que cifra todas las comunicaciones.</w:t>
       </w:r>
     </w:p>
     <w:p>
@@ -17095,13 +17247,137 @@
           <w:b/>
           <w:bCs/>
         </w:rPr>
-        <w:t>Página de descarga de la APK</w:t>
-      </w:r>
+        <w:t xml:space="preserve">PostgreSQL: </w:t>
+      </w:r>
+      <w:r>
+        <w:t>base de datos instalada en el propio servidor, accesible solo de forma local por seguridad.</w:t>
+      </w:r>
+    </w:p>
+    <w:p>
+      <w:pPr>
+        <w:pStyle w:val="Prrafodelista"/>
+        <w:numPr>
+          <w:ilvl w:val="0"/>
+          <w:numId w:val="2"/>
+        </w:numPr>
+        <w:spacing w:after="60" w:line="276" w:lineRule="auto"/>
+        <w:jc w:val="both"/>
+      </w:pPr>
+      <w:proofErr w:type="spellStart"/>
       <w:r>
         <w:rPr>
           <w:b/>
           <w:bCs/>
         </w:rPr>
+        <w:t>Backend</w:t>
+      </w:r>
+      <w:proofErr w:type="spellEnd"/>
+      <w:r>
+        <w:rPr>
+          <w:b/>
+          <w:bCs/>
+        </w:rPr>
+        <w:t xml:space="preserve"> Spring </w:t>
+      </w:r>
+      <w:proofErr w:type="spellStart"/>
+      <w:r>
+        <w:rPr>
+          <w:b/>
+          <w:bCs/>
+        </w:rPr>
+        <w:t>Boot</w:t>
+      </w:r>
+      <w:proofErr w:type="spellEnd"/>
+      <w:r>
+        <w:rPr>
+          <w:b/>
+          <w:bCs/>
+        </w:rPr>
+        <w:t xml:space="preserve">: </w:t>
+      </w:r>
+      <w:r>
+        <w:t xml:space="preserve">empaquetado como un archivo JAR ejecutable y gestionado como servicio del sistema mediante </w:t>
+      </w:r>
+      <w:proofErr w:type="spellStart"/>
+      <w:r>
+        <w:t>systemd</w:t>
+      </w:r>
+      <w:proofErr w:type="spellEnd"/>
+      <w:r>
+        <w:t>, lo que garantiza el arranque automático al iniciar el servidor y el reinicio automático en caso de caída del proceso</w:t>
+      </w:r>
+      <w:r>
+        <w:t>.</w:t>
+      </w:r>
+    </w:p>
+    <w:p>
+      <w:pPr>
+        <w:pStyle w:val="Prrafodelista"/>
+        <w:numPr>
+          <w:ilvl w:val="0"/>
+          <w:numId w:val="2"/>
+        </w:numPr>
+        <w:spacing w:after="60" w:line="276" w:lineRule="auto"/>
+        <w:jc w:val="both"/>
+      </w:pPr>
+      <w:proofErr w:type="spellStart"/>
+      <w:r>
+        <w:rPr>
+          <w:b/>
+          <w:bCs/>
+        </w:rPr>
+        <w:t>Firebase</w:t>
+      </w:r>
+      <w:proofErr w:type="spellEnd"/>
+      <w:r>
+        <w:rPr>
+          <w:b/>
+          <w:bCs/>
+        </w:rPr>
+        <w:t xml:space="preserve"> </w:t>
+      </w:r>
+      <w:proofErr w:type="spellStart"/>
+      <w:r>
+        <w:rPr>
+          <w:b/>
+          <w:bCs/>
+        </w:rPr>
+        <w:t>Admin</w:t>
+      </w:r>
+      <w:proofErr w:type="spellEnd"/>
+      <w:r>
+        <w:rPr>
+          <w:b/>
+          <w:bCs/>
+        </w:rPr>
+        <w:t xml:space="preserve"> SDK: </w:t>
+      </w:r>
+      <w:r>
+        <w:t>configurado con una clave de cuenta de servicio, protegida con permisos restringidos y nunca incluida en el control de versiones.</w:t>
+      </w:r>
+    </w:p>
+    <w:p>
+      <w:pPr>
+        <w:pStyle w:val="Prrafodelista"/>
+        <w:numPr>
+          <w:ilvl w:val="0"/>
+          <w:numId w:val="2"/>
+        </w:numPr>
+        <w:spacing w:after="60" w:line="276" w:lineRule="auto"/>
+        <w:jc w:val="both"/>
+      </w:pPr>
+      <w:r>
+        <w:rPr>
+          <w:b/>
+          <w:bCs/>
+        </w:rPr>
+        <w:t>Página de descarga de la APK</w:t>
+      </w:r>
+      <w:r>
+        <w:rPr>
+          <w:b/>
+          <w:bCs/>
+        </w:rPr>
         <w:t>:</w:t>
       </w:r>
       <w:r>
@@ -17118,6 +17394,145 @@
     </w:p>
     <w:p>
       <w:pPr>
+        <w:pStyle w:val="Prrafodelista"/>
+        <w:numPr>
+          <w:ilvl w:val="0"/>
+          <w:numId w:val="2"/>
+        </w:numPr>
+        <w:spacing w:after="60" w:line="276" w:lineRule="auto"/>
+        <w:jc w:val="both"/>
+      </w:pPr>
+      <w:r>
+        <w:rPr>
+          <w:b/>
+          <w:bCs/>
+        </w:rPr>
+        <w:t>Documentación interactiva de la API (</w:t>
+      </w:r>
+      <w:proofErr w:type="spellStart"/>
+      <w:r>
+        <w:rPr>
+          <w:b/>
+          <w:bCs/>
+        </w:rPr>
+        <w:t>Swagger</w:t>
+      </w:r>
+      <w:proofErr w:type="spellEnd"/>
+      <w:r>
+        <w:rPr>
+          <w:b/>
+          <w:bCs/>
+        </w:rPr>
+        <w:t xml:space="preserve"> UI)</w:t>
+      </w:r>
+      <w:r>
+        <w:t xml:space="preserve">: </w:t>
+      </w:r>
+      <w:proofErr w:type="spellStart"/>
+      <w:r>
+        <w:t>Nginx</w:t>
+      </w:r>
+      <w:proofErr w:type="spellEnd"/>
+      <w:r>
+        <w:t xml:space="preserve"> expone la ruta /swagger-ui.html del </w:t>
+      </w:r>
+      <w:proofErr w:type="spellStart"/>
+      <w:r>
+        <w:t>backend</w:t>
+      </w:r>
+      <w:proofErr w:type="spellEnd"/>
+      <w:r>
+        <w:t xml:space="preserve"> en el subdominio </w:t>
+      </w:r>
+      <w:proofErr w:type="spellStart"/>
+      <w:r>
+        <w:t>api.nacimiento.me</w:t>
+      </w:r>
+      <w:proofErr w:type="spellEnd"/>
+      <w:r>
+        <w:t xml:space="preserve">, permitiendo explorar y probar todos los </w:t>
+      </w:r>
+      <w:proofErr w:type="spellStart"/>
+      <w:r>
+        <w:t>endpoints</w:t>
+      </w:r>
+      <w:proofErr w:type="spellEnd"/>
+      <w:r>
+        <w:t xml:space="preserve"> desde el navegador sin herramientas externas. La detección correcta del esquema HTTPS detrás del proxy se logra mediante la propiedad </w:t>
+      </w:r>
+      <w:proofErr w:type="spellStart"/>
+      <w:r>
+        <w:t>server.forward-headers-strategy</w:t>
+      </w:r>
+      <w:proofErr w:type="spellEnd"/>
+      <w:r>
+        <w:t>=</w:t>
+      </w:r>
+      <w:proofErr w:type="spellStart"/>
+      <w:r>
+        <w:t>framework</w:t>
+      </w:r>
+      <w:proofErr w:type="spellEnd"/>
+      <w:r>
+        <w:t xml:space="preserve"> y la propagación de cabeceras X-</w:t>
+      </w:r>
+      <w:proofErr w:type="spellStart"/>
+      <w:r>
+        <w:t>Forwarded</w:t>
+      </w:r>
+      <w:proofErr w:type="spellEnd"/>
+      <w:r>
+        <w:t xml:space="preserve">-* desde </w:t>
+      </w:r>
+      <w:proofErr w:type="spellStart"/>
+      <w:r>
+        <w:t>Nginx</w:t>
+      </w:r>
+      <w:proofErr w:type="spellEnd"/>
+      <w:r>
+        <w:t>.</w:t>
+      </w:r>
+    </w:p>
+    <w:p>
+      <w:pPr>
+        <w:pStyle w:val="Prrafodelista"/>
+        <w:numPr>
+          <w:ilvl w:val="0"/>
+          <w:numId w:val="2"/>
+        </w:numPr>
+        <w:spacing w:after="60" w:line="276" w:lineRule="auto"/>
+        <w:jc w:val="both"/>
+      </w:pPr>
+      <w:r>
+        <w:rPr>
+          <w:b/>
+          <w:bCs/>
+        </w:rPr>
+        <w:t xml:space="preserve">Tareas programadas en el </w:t>
+      </w:r>
+      <w:proofErr w:type="spellStart"/>
+      <w:r>
+        <w:rPr>
+          <w:b/>
+          <w:bCs/>
+        </w:rPr>
+        <w:t>backend</w:t>
+      </w:r>
+      <w:proofErr w:type="spellEnd"/>
+      <w:r>
+        <w:t xml:space="preserve">: el motor de planificación de Spring (@EnableScheduling) ejecuta cada 30 segundos la rotación automática de la cola de espera, sin requerir ningún proceso adicional fuera del propio servicio del </w:t>
+      </w:r>
+      <w:proofErr w:type="spellStart"/>
+      <w:r>
+        <w:t>backend</w:t>
+      </w:r>
+      <w:proofErr w:type="spellEnd"/>
+      <w:r>
+        <w:t>.</w:t>
+      </w:r>
+    </w:p>
+    <w:p>
+      <w:pPr>
         <w:pStyle w:val="Ttulo2"/>
         <w:jc w:val="both"/>
       </w:pPr>
@@ -17133,7 +17548,79 @@
         <w:jc w:val="both"/>
       </w:pPr>
       <w:r>
-        <w:t xml:space="preserve">El proceso de despliegue de una nueva versión consiste en compilar el archivo JAR en el entorno de desarrollo, subirlo al servidor mediante una conexión segura (SCP), detener el proceso anterior, reemplazar el archivo y arrancar la nueva versión, verificando en los registros que el arranque ha sido correcto. La configuración sensible (credenciales de base de datos, secreto JWT, ruta de las credenciales de </w:t>
+        <w:t xml:space="preserve">El proceso de despliegue de una nueva versión consiste en compilar el archivo JAR en el entorno de desarrollo </w:t>
+      </w:r>
+      <w:proofErr w:type="gramStart"/>
+      <w:r>
+        <w:t>con .</w:t>
+      </w:r>
+      <w:proofErr w:type="gramEnd"/>
+      <w:r>
+        <w:t>/</w:t>
+      </w:r>
+      <w:proofErr w:type="spellStart"/>
+      <w:r>
+        <w:t>gradlew</w:t>
+      </w:r>
+      <w:proofErr w:type="spellEnd"/>
+      <w:r>
+        <w:t xml:space="preserve"> </w:t>
+      </w:r>
+      <w:proofErr w:type="spellStart"/>
+      <w:r>
+        <w:t>bootJar</w:t>
+      </w:r>
+      <w:proofErr w:type="spellEnd"/>
+      <w:r>
+        <w:t xml:space="preserve">, subirlo al servidor mediante una conexión segura (SCP) y reiniciar el servicio del </w:t>
+      </w:r>
+      <w:proofErr w:type="spellStart"/>
+      <w:r>
+        <w:t>backend</w:t>
+      </w:r>
+      <w:proofErr w:type="spellEnd"/>
+      <w:r>
+        <w:t xml:space="preserve"> con sudo </w:t>
+      </w:r>
+      <w:proofErr w:type="spellStart"/>
+      <w:r>
+        <w:t>systemctl</w:t>
+      </w:r>
+      <w:proofErr w:type="spellEnd"/>
+      <w:r>
+        <w:t xml:space="preserve"> </w:t>
+      </w:r>
+      <w:proofErr w:type="spellStart"/>
+      <w:r>
+        <w:t>restart</w:t>
+      </w:r>
+      <w:proofErr w:type="spellEnd"/>
+      <w:r>
+        <w:t xml:space="preserve"> </w:t>
+      </w:r>
+      <w:proofErr w:type="spellStart"/>
+      <w:r>
+        <w:t>pistago</w:t>
+      </w:r>
+      <w:proofErr w:type="spellEnd"/>
+      <w:r>
+        <w:t xml:space="preserve">. </w:t>
+      </w:r>
+      <w:proofErr w:type="spellStart"/>
+      <w:r>
+        <w:t>systemd</w:t>
+      </w:r>
+      <w:proofErr w:type="spellEnd"/>
+      <w:r>
+        <w:t xml:space="preserve"> se encarga de detener la versión anterior, liberar el puerto y arrancar la nueva versión de forma ordenada, registrando la salida en su propio sistema de logs (</w:t>
+      </w:r>
+      <w:proofErr w:type="spellStart"/>
+      <w:r>
+        <w:t>journalctl</w:t>
+      </w:r>
+      <w:proofErr w:type="spellEnd"/>
+      <w:r>
+        <w:t xml:space="preserve">). La configuración sensible (credenciales de base de datos, secreto JWT, ruta de las credenciales de </w:t>
       </w:r>
       <w:proofErr w:type="spellStart"/>
       <w:r>
@@ -17141,7 +17628,10 @@
       </w:r>
       <w:proofErr w:type="spellEnd"/>
       <w:r>
-        <w:t>) se mantiene en un archivo de configuración externo al JAR, presente solo en el servidor y fuera del repositorio.</w:t>
+        <w:t>) se mantiene en un archivo de configuración externo al JAR, presente solo en el servidor y fuera del repositorio</w:t>
+      </w:r>
+      <w:r>
+        <w:t>.</w:t>
       </w:r>
     </w:p>
     <w:p>
@@ -17151,6 +17641,7 @@
       </w:pPr>
       <w:bookmarkStart w:id="43" w:name="_Toc230535763"/>
       <w:r>
+        <w:lastRenderedPageBreak/>
         <w:t>7.4. Repositorio del proyecto</w:t>
       </w:r>
       <w:bookmarkEnd w:id="43"/>
@@ -17524,7 +18015,14 @@
                 <w:sz w:val="20"/>
                 <w:szCs w:val="20"/>
               </w:rPr>
-              <w:t>45 h</w:t>
+              <w:t>5</w:t>
+            </w:r>
+            <w:r>
+              <w:rPr>
+                <w:sz w:val="20"/>
+                <w:szCs w:val="20"/>
+              </w:rPr>
+              <w:t>5 h</w:t>
             </w:r>
           </w:p>
         </w:tc>
@@ -17555,7 +18053,21 @@
                 <w:sz w:val="20"/>
                 <w:szCs w:val="20"/>
               </w:rPr>
-              <w:t>1.125 €</w:t>
+              <w:t>1.</w:t>
+            </w:r>
+            <w:r>
+              <w:rPr>
+                <w:sz w:val="20"/>
+                <w:szCs w:val="20"/>
+              </w:rPr>
+              <w:t>37</w:t>
+            </w:r>
+            <w:r>
+              <w:rPr>
+                <w:sz w:val="20"/>
+                <w:szCs w:val="20"/>
+              </w:rPr>
+              <w:t>5 €</w:t>
             </w:r>
           </w:p>
         </w:tc>
@@ -17714,7 +18226,14 @@
                 <w:sz w:val="20"/>
                 <w:szCs w:val="20"/>
               </w:rPr>
-              <w:t>15 h</w:t>
+              <w:t>20</w:t>
+            </w:r>
+            <w:r>
+              <w:rPr>
+                <w:sz w:val="20"/>
+                <w:szCs w:val="20"/>
+              </w:rPr>
+              <w:t xml:space="preserve"> h</w:t>
             </w:r>
           </w:p>
         </w:tc>
@@ -17745,7 +18264,14 @@
                 <w:sz w:val="20"/>
                 <w:szCs w:val="20"/>
               </w:rPr>
-              <w:t>375 €</w:t>
+              <w:t>500</w:t>
+            </w:r>
+            <w:r>
+              <w:rPr>
+                <w:sz w:val="20"/>
+                <w:szCs w:val="20"/>
+              </w:rPr>
+              <w:t xml:space="preserve"> €</w:t>
             </w:r>
           </w:p>
         </w:tc>
@@ -17809,7 +18335,21 @@
                 <w:sz w:val="20"/>
                 <w:szCs w:val="20"/>
               </w:rPr>
-              <w:t>10 h</w:t>
+              <w:t>1</w:t>
+            </w:r>
+            <w:r>
+              <w:rPr>
+                <w:sz w:val="20"/>
+                <w:szCs w:val="20"/>
+              </w:rPr>
+              <w:t>5</w:t>
+            </w:r>
+            <w:r>
+              <w:rPr>
+                <w:sz w:val="20"/>
+                <w:szCs w:val="20"/>
+              </w:rPr>
+              <w:t xml:space="preserve"> h</w:t>
             </w:r>
           </w:p>
         </w:tc>
@@ -17840,7 +18380,14 @@
                 <w:sz w:val="20"/>
                 <w:szCs w:val="20"/>
               </w:rPr>
-              <w:t>250 €</w:t>
+              <w:t>375</w:t>
+            </w:r>
+            <w:r>
+              <w:rPr>
+                <w:sz w:val="20"/>
+                <w:szCs w:val="20"/>
+              </w:rPr>
+              <w:t xml:space="preserve"> €</w:t>
             </w:r>
           </w:p>
         </w:tc>
@@ -17904,7 +18451,21 @@
                 <w:sz w:val="20"/>
                 <w:szCs w:val="20"/>
               </w:rPr>
-              <w:t>150 h</w:t>
+              <w:t>1</w:t>
+            </w:r>
+            <w:r>
+              <w:rPr>
+                <w:sz w:val="20"/>
+                <w:szCs w:val="20"/>
+              </w:rPr>
+              <w:t>7</w:t>
+            </w:r>
+            <w:r>
+              <w:rPr>
+                <w:sz w:val="20"/>
+                <w:szCs w:val="20"/>
+              </w:rPr>
+              <w:t>0 h</w:t>
             </w:r>
           </w:p>
         </w:tc>
@@ -17935,7 +18496,28 @@
                 <w:sz w:val="20"/>
                 <w:szCs w:val="20"/>
               </w:rPr>
-              <w:t>3.750 €</w:t>
+              <w:t>4</w:t>
+            </w:r>
+            <w:r>
+              <w:rPr>
+                <w:sz w:val="20"/>
+                <w:szCs w:val="20"/>
+              </w:rPr>
+              <w:t>.</w:t>
+            </w:r>
+            <w:r>
+              <w:rPr>
+                <w:sz w:val="20"/>
+                <w:szCs w:val="20"/>
+              </w:rPr>
+              <w:t>2</w:t>
+            </w:r>
+            <w:r>
+              <w:rPr>
+                <w:sz w:val="20"/>
+                <w:szCs w:val="20"/>
+              </w:rPr>
+              <w:t>50 €</w:t>
             </w:r>
           </w:p>
         </w:tc>
@@ -18938,7 +19520,7 @@
         <w:jc w:val="both"/>
       </w:pPr>
       <w:r>
-        <w:t xml:space="preserve">Entre los logros más destacables se encuentran la implementación de la lista de espera con cálculo dinámico de posición, el sistema de notificaciones </w:t>
+        <w:t xml:space="preserve">Entre los logros más destacables se encuentran la implementación de la lista de espera con cálculo dinámico de posición y rotación automática del turno mediante tarea programada, el sistema de notificaciones </w:t>
       </w:r>
       <w:proofErr w:type="spellStart"/>
       <w:r>
@@ -18946,7 +19528,47 @@
       </w:r>
       <w:proofErr w:type="spellEnd"/>
       <w:r>
-        <w:t xml:space="preserve"> que cierra el ciclo de reasignación de plazas, y el despliegue completo en un VPS propio con HTTPS, que ha supuesto una valiosa experiencia de administración de sistemas. El desarrollo iterativo y el uso disciplinado del control de versiones han sido claves para gestionar la complejidad del proyecto.</w:t>
+        <w:t xml:space="preserve"> que cierra el ciclo de comunicación tanto al liberar plazas como cuando un administrador cancela una reserva, el despliegue completo en un VPS propio con HTTPS y servicio gestionado por </w:t>
+      </w:r>
+      <w:proofErr w:type="spellStart"/>
+      <w:r>
+        <w:t>systemd</w:t>
+      </w:r>
+      <w:proofErr w:type="spellEnd"/>
+      <w:r>
+        <w:t xml:space="preserve"> —una experiencia valiosa de administración de sistemas— y la documentación interactiva de la API mediante </w:t>
+      </w:r>
+      <w:proofErr w:type="spellStart"/>
+      <w:r>
+        <w:t>OpenAPI</w:t>
+      </w:r>
+      <w:proofErr w:type="spellEnd"/>
+      <w:r>
+        <w:t>/</w:t>
+      </w:r>
+      <w:proofErr w:type="spellStart"/>
+      <w:r>
+        <w:t>Swagger</w:t>
+      </w:r>
+      <w:proofErr w:type="spellEnd"/>
+      <w:r>
+        <w:t xml:space="preserve">, accesible públicamente. El desarrollo iterativo, el uso disciplinado del control de versiones con </w:t>
+      </w:r>
+      <w:proofErr w:type="spellStart"/>
+      <w:r>
+        <w:t>Conventional</w:t>
+      </w:r>
+      <w:proofErr w:type="spellEnd"/>
+      <w:r>
+        <w:t xml:space="preserve"> </w:t>
+      </w:r>
+      <w:proofErr w:type="spellStart"/>
+      <w:r>
+        <w:t>Commits</w:t>
+      </w:r>
+      <w:proofErr w:type="spellEnd"/>
+      <w:r>
+        <w:t xml:space="preserve"> y la incorporación de una batería de pruebas unitarias automatizadas han sido claves para gestionar la complejidad del proyecto y garantizar su robustez.</w:t>
       </w:r>
     </w:p>
     <w:p>
@@ -19024,27 +19646,19 @@
         <w:t xml:space="preserve">Ampliación de la cobertura de pruebas: </w:t>
       </w:r>
       <w:r>
-        <w:t xml:space="preserve">Pruebas de integración con base de datos en memoria, que complementen las </w:t>
-      </w:r>
-      <w:r>
-        <w:t>30</w:t>
-      </w:r>
-      <w:r>
-        <w:t xml:space="preserve"> unitarias actuales con verificación </w:t>
-      </w:r>
-      <w:proofErr w:type="spellStart"/>
-      <w:r>
-        <w:t>end-to-end</w:t>
-      </w:r>
-      <w:proofErr w:type="spellEnd"/>
-      <w:r>
-        <w:t xml:space="preserve"> de los </w:t>
-      </w:r>
-      <w:proofErr w:type="spellStart"/>
-      <w:r>
-        <w:t>endpoints</w:t>
-      </w:r>
-      <w:proofErr w:type="spellEnd"/>
+        <w:t xml:space="preserve">pruebas de integración con base de datos en memoria y pruebas unitarias específicas para las funcionalidades añadidas en el sprint final (rotación automática de cola, </w:t>
+      </w:r>
+      <w:proofErr w:type="spellStart"/>
+      <w:r>
+        <w:t>push</w:t>
+      </w:r>
+      <w:proofErr w:type="spellEnd"/>
+      <w:r>
+        <w:t xml:space="preserve"> del administrador, cómputo de estadísticas con estado EXPIRADA), que complementen la suite actual de 30 pruebas</w:t>
+      </w:r>
+      <w:r>
+        <w:t>.</w:t>
+      </w:r>
     </w:p>
     <w:p>
       <w:pPr>
@@ -19061,10 +19675,26 @@
           <w:b/>
           <w:bCs/>
         </w:rPr>
-        <w:t xml:space="preserve">Expiración automática del turno en lista de espera: </w:t>
-      </w:r>
-      <w:r>
-        <w:t>un proceso programado que, al expirar la ventana de un usuario notificado, pase el aviso al siguiente de la cola.</w:t>
+        <w:t>Bloqueos por franja horaria</w:t>
+      </w:r>
+      <w:r>
+        <w:t xml:space="preserve">: activar la tabla </w:t>
+      </w:r>
+      <w:proofErr w:type="spellStart"/>
+      <w:r>
+        <w:t>bloqueos_</w:t>
+      </w:r>
+      <w:proofErr w:type="gramStart"/>
+      <w:r>
+        <w:t>horario</w:t>
+      </w:r>
+      <w:proofErr w:type="spellEnd"/>
+      <w:r>
+        <w:t xml:space="preserve"> ya modelada</w:t>
+      </w:r>
+      <w:proofErr w:type="gramEnd"/>
+      <w:r>
+        <w:t>, permitiendo al administrador reservar pistas para mantenimiento o eventos puntuales.</w:t>
       </w:r>
     </w:p>
     <w:p>
@@ -19082,10 +19712,21 @@
           <w:b/>
           <w:bCs/>
         </w:rPr>
-        <w:t xml:space="preserve">Recordatorios y otros tipos de notificación: </w:t>
-      </w:r>
-      <w:r>
-        <w:t>aprovechar la infraestructura de notificaciones ya construida para enviar recordatorios previos al partido o avisos de límite de uso.</w:t>
+        <w:t>Configuración dinámica del sistema</w:t>
+      </w:r>
+      <w:r>
+        <w:t xml:space="preserve">: migrar parámetros globales (horarios de apertura, duración de franja, márgenes de cancelación) a la tabla </w:t>
+      </w:r>
+      <w:proofErr w:type="spellStart"/>
+      <w:r>
+        <w:t>configuracion_sistema</w:t>
+      </w:r>
+      <w:proofErr w:type="spellEnd"/>
+      <w:r>
+        <w:t xml:space="preserve"> para que puedan modificarse desde el panel de administrador sin necesidad de redespliegue</w:t>
+      </w:r>
+      <w:r>
+        <w:t>.</w:t>
       </w:r>
     </w:p>
     <w:p>
@@ -19103,31 +19744,11 @@
           <w:b/>
           <w:bCs/>
         </w:rPr>
-        <w:t xml:space="preserve">Refresco en tiempo real de la lista de espera: </w:t>
-      </w:r>
-      <w:r>
-        <w:t>actualizar la posición en la pantalla sin necesidad de recargar manualmente.</w:t>
-      </w:r>
-    </w:p>
-    <w:p>
-      <w:pPr>
-        <w:jc w:val="both"/>
-      </w:pPr>
-      <w:r>
-        <w:br w:type="page"/>
-      </w:r>
-    </w:p>
-    <w:p>
-      <w:pPr>
-        <w:pStyle w:val="Ttulo1"/>
-        <w:jc w:val="both"/>
-      </w:pPr>
-      <w:bookmarkStart w:id="51" w:name="_Toc230535771"/>
-      <w:r>
-        <w:lastRenderedPageBreak/>
-        <w:t>10. Bibliografía y referencias</w:t>
-      </w:r>
-      <w:bookmarkEnd w:id="51"/>
+        <w:t xml:space="preserve">Recordatorios y otros tipos de notificación: </w:t>
+      </w:r>
+      <w:r>
+        <w:t>aprovechar la infraestructura de notificaciones ya construida para enviar recordatorios previos al partido o avisos de límite de uso.</w:t>
+      </w:r>
     </w:p>
     <w:p>
       <w:pPr>
@@ -19140,32 +19761,35 @@
         <w:jc w:val="both"/>
       </w:pPr>
       <w:r>
-        <w:t xml:space="preserve">Documentación oficial de Android </w:t>
-      </w:r>
-      <w:proofErr w:type="spellStart"/>
-      <w:r>
-        <w:t>Developers</w:t>
-      </w:r>
-      <w:proofErr w:type="spellEnd"/>
-      <w:r>
-        <w:t xml:space="preserve"> y </w:t>
-      </w:r>
-      <w:proofErr w:type="spellStart"/>
-      <w:r>
-        <w:t>Jetpack</w:t>
-      </w:r>
-      <w:proofErr w:type="spellEnd"/>
-      <w:r>
-        <w:t xml:space="preserve"> </w:t>
-      </w:r>
-      <w:proofErr w:type="spellStart"/>
-      <w:r>
-        <w:t>Compose</w:t>
-      </w:r>
-      <w:proofErr w:type="spellEnd"/>
-      <w:r>
-        <w:t>. https://developer.android.com</w:t>
-      </w:r>
+        <w:rPr>
+          <w:b/>
+          <w:bCs/>
+        </w:rPr>
+        <w:t xml:space="preserve">Refresco en tiempo real de la lista de espera: </w:t>
+      </w:r>
+      <w:r>
+        <w:t>actualizar la posición en la pantalla sin necesidad de recargar manualmente.</w:t>
+      </w:r>
+    </w:p>
+    <w:p>
+      <w:pPr>
+        <w:jc w:val="both"/>
+      </w:pPr>
+      <w:r>
+        <w:br w:type="page"/>
+      </w:r>
+    </w:p>
+    <w:p>
+      <w:pPr>
+        <w:pStyle w:val="Ttulo1"/>
+        <w:jc w:val="both"/>
+      </w:pPr>
+      <w:bookmarkStart w:id="51" w:name="_Toc230535771"/>
+      <w:r>
+        <w:lastRenderedPageBreak/>
+        <w:t>10. Bibliografía y referencias</w:t>
+      </w:r>
+      <w:bookmarkEnd w:id="51"/>
     </w:p>
     <w:p>
       <w:pPr>
@@ -19178,15 +19802,31 @@
         <w:jc w:val="both"/>
       </w:pPr>
       <w:r>
-        <w:t xml:space="preserve">Documentación oficial de </w:t>
-      </w:r>
-      <w:proofErr w:type="spellStart"/>
-      <w:r>
-        <w:t>Kotlin</w:t>
-      </w:r>
-      <w:proofErr w:type="spellEnd"/>
-      <w:r>
-        <w:t>. https://kotlinlang.org/docs</w:t>
+        <w:t xml:space="preserve">Documentación oficial de Android </w:t>
+      </w:r>
+      <w:proofErr w:type="spellStart"/>
+      <w:r>
+        <w:t>Developers</w:t>
+      </w:r>
+      <w:proofErr w:type="spellEnd"/>
+      <w:r>
+        <w:t xml:space="preserve"> y </w:t>
+      </w:r>
+      <w:proofErr w:type="spellStart"/>
+      <w:r>
+        <w:t>Jetpack</w:t>
+      </w:r>
+      <w:proofErr w:type="spellEnd"/>
+      <w:r>
+        <w:t xml:space="preserve"> </w:t>
+      </w:r>
+      <w:proofErr w:type="spellStart"/>
+      <w:r>
+        <w:t>Compose</w:t>
+      </w:r>
+      <w:proofErr w:type="spellEnd"/>
+      <w:r>
+        <w:t>. https://developer.android.com</w:t>
       </w:r>
     </w:p>
     <w:p>
@@ -19200,15 +19840,15 @@
         <w:jc w:val="both"/>
       </w:pPr>
       <w:r>
-        <w:t xml:space="preserve">Documentación oficial de Spring </w:t>
-      </w:r>
-      <w:proofErr w:type="spellStart"/>
-      <w:r>
-        <w:t>Boot</w:t>
-      </w:r>
-      <w:proofErr w:type="spellEnd"/>
-      <w:r>
-        <w:t xml:space="preserve"> y Spring Security. https://spring.io</w:t>
+        <w:t xml:space="preserve">Documentación oficial de </w:t>
+      </w:r>
+      <w:proofErr w:type="spellStart"/>
+      <w:r>
+        <w:t>Kotlin</w:t>
+      </w:r>
+      <w:proofErr w:type="spellEnd"/>
+      <w:r>
+        <w:t>. https://kotlinlang.org/docs</w:t>
       </w:r>
     </w:p>
     <w:p>
@@ -19222,7 +19862,15 @@
         <w:jc w:val="both"/>
       </w:pPr>
       <w:r>
-        <w:t>Documentación oficial de PostgreSQL. https://www.postgresql.org/docs</w:t>
+        <w:t xml:space="preserve">Documentación oficial de Spring </w:t>
+      </w:r>
+      <w:proofErr w:type="spellStart"/>
+      <w:r>
+        <w:t>Boot</w:t>
+      </w:r>
+      <w:proofErr w:type="spellEnd"/>
+      <w:r>
+        <w:t xml:space="preserve"> y Spring Security. https://spring.io</w:t>
       </w:r>
     </w:p>
     <w:p>
@@ -19236,39 +19884,7 @@
         <w:jc w:val="both"/>
       </w:pPr>
       <w:r>
-        <w:t xml:space="preserve">Documentación de </w:t>
-      </w:r>
-      <w:proofErr w:type="spellStart"/>
-      <w:r>
-        <w:t>Firebase</w:t>
-      </w:r>
-      <w:proofErr w:type="spellEnd"/>
-      <w:r>
-        <w:t xml:space="preserve"> Cloud </w:t>
-      </w:r>
-      <w:proofErr w:type="spellStart"/>
-      <w:r>
-        <w:t>Messaging</w:t>
-      </w:r>
-      <w:proofErr w:type="spellEnd"/>
-      <w:r>
-        <w:t xml:space="preserve"> y </w:t>
-      </w:r>
-      <w:proofErr w:type="spellStart"/>
-      <w:r>
-        <w:t>Firebase</w:t>
-      </w:r>
-      <w:proofErr w:type="spellEnd"/>
-      <w:r>
-        <w:t xml:space="preserve"> </w:t>
-      </w:r>
-      <w:proofErr w:type="spellStart"/>
-      <w:r>
-        <w:t>Admin</w:t>
-      </w:r>
-      <w:proofErr w:type="spellEnd"/>
-      <w:r>
-        <w:t xml:space="preserve"> SDK. https://firebase.google.com/docs</w:t>
+        <w:t>Documentación oficial de PostgreSQL. https://www.postgresql.org/docs</w:t>
       </w:r>
     </w:p>
     <w:p>
@@ -19286,7 +19902,15 @@
       </w:r>
       <w:proofErr w:type="spellStart"/>
       <w:r>
-        <w:t>Retrofit</w:t>
+        <w:t>Firebase</w:t>
+      </w:r>
+      <w:proofErr w:type="spellEnd"/>
+      <w:r>
+        <w:t xml:space="preserve"> Cloud </w:t>
+      </w:r>
+      <w:proofErr w:type="spellStart"/>
+      <w:r>
+        <w:t>Messaging</w:t>
       </w:r>
       <w:proofErr w:type="spellEnd"/>
       <w:r>
@@ -19294,11 +19918,19 @@
       </w:r>
       <w:proofErr w:type="spellStart"/>
       <w:r>
-        <w:t>OkHttp</w:t>
-      </w:r>
-      <w:proofErr w:type="spellEnd"/>
-      <w:r>
-        <w:t xml:space="preserve"> (Square). https://square.github.io/retrofit</w:t>
+        <w:t>Firebase</w:t>
+      </w:r>
+      <w:proofErr w:type="spellEnd"/>
+      <w:r>
+        <w:t xml:space="preserve"> </w:t>
+      </w:r>
+      <w:proofErr w:type="spellStart"/>
+      <w:r>
+        <w:t>Admin</w:t>
+      </w:r>
+      <w:proofErr w:type="spellEnd"/>
+      <w:r>
+        <w:t xml:space="preserve"> SDK. https://firebase.google.com/docs</w:t>
       </w:r>
     </w:p>
     <w:p>
@@ -19316,19 +19948,19 @@
       </w:r>
       <w:proofErr w:type="spellStart"/>
       <w:r>
-        <w:t>Hilt</w:t>
-      </w:r>
-      <w:proofErr w:type="spellEnd"/>
-      <w:r>
-        <w:t xml:space="preserve"> (</w:t>
-      </w:r>
-      <w:proofErr w:type="spellStart"/>
-      <w:r>
-        <w:t>Dagger</w:t>
-      </w:r>
-      <w:proofErr w:type="spellEnd"/>
-      <w:r>
-        <w:t>). https://dagger.dev/hilt</w:t>
+        <w:t>Retrofit</w:t>
+      </w:r>
+      <w:proofErr w:type="spellEnd"/>
+      <w:r>
+        <w:t xml:space="preserve"> y </w:t>
+      </w:r>
+      <w:proofErr w:type="spellStart"/>
+      <w:r>
+        <w:t>OkHttp</w:t>
+      </w:r>
+      <w:proofErr w:type="spellEnd"/>
+      <w:r>
+        <w:t xml:space="preserve"> (Square). https://square.github.io/retrofit</w:t>
       </w:r>
     </w:p>
     <w:p>
@@ -19346,27 +19978,19 @@
       </w:r>
       <w:proofErr w:type="spellStart"/>
       <w:r>
-        <w:t>Nginx</w:t>
-      </w:r>
-      <w:proofErr w:type="spellEnd"/>
-      <w:r>
-        <w:t xml:space="preserve"> y </w:t>
-      </w:r>
-      <w:proofErr w:type="spellStart"/>
-      <w:r>
-        <w:t>Let's</w:t>
-      </w:r>
-      <w:proofErr w:type="spellEnd"/>
-      <w:r>
-        <w:t xml:space="preserve"> </w:t>
-      </w:r>
-      <w:proofErr w:type="spellStart"/>
-      <w:r>
-        <w:t>Encrypt</w:t>
-      </w:r>
-      <w:proofErr w:type="spellEnd"/>
-      <w:r>
-        <w:t>. https://nginx.org · https://letsencrypt.org</w:t>
+        <w:t>Hilt</w:t>
+      </w:r>
+      <w:proofErr w:type="spellEnd"/>
+      <w:r>
+        <w:t xml:space="preserve"> (</w:t>
+      </w:r>
+      <w:proofErr w:type="spellStart"/>
+      <w:r>
+        <w:t>Dagger</w:t>
+      </w:r>
+      <w:proofErr w:type="spellEnd"/>
+      <w:r>
+        <w:t>). https://dagger.dev/hilt</w:t>
       </w:r>
     </w:p>
     <w:p>
@@ -19380,6 +20004,44 @@
         <w:jc w:val="both"/>
       </w:pPr>
       <w:r>
+        <w:t xml:space="preserve">Documentación de </w:t>
+      </w:r>
+      <w:proofErr w:type="spellStart"/>
+      <w:r>
+        <w:t>Nginx</w:t>
+      </w:r>
+      <w:proofErr w:type="spellEnd"/>
+      <w:r>
+        <w:t xml:space="preserve"> y </w:t>
+      </w:r>
+      <w:proofErr w:type="spellStart"/>
+      <w:r>
+        <w:t>Let's</w:t>
+      </w:r>
+      <w:proofErr w:type="spellEnd"/>
+      <w:r>
+        <w:t xml:space="preserve"> </w:t>
+      </w:r>
+      <w:proofErr w:type="spellStart"/>
+      <w:r>
+        <w:t>Encrypt</w:t>
+      </w:r>
+      <w:proofErr w:type="spellEnd"/>
+      <w:r>
+        <w:t>. https://nginx.org · https://letsencrypt.org</w:t>
+      </w:r>
+    </w:p>
+    <w:p>
+      <w:pPr>
+        <w:pStyle w:val="Prrafodelista"/>
+        <w:numPr>
+          <w:ilvl w:val="0"/>
+          <w:numId w:val="2"/>
+        </w:numPr>
+        <w:spacing w:after="60" w:line="276" w:lineRule="auto"/>
+        <w:jc w:val="both"/>
+      </w:pPr>
+      <w:r>
         <w:t xml:space="preserve">Material </w:t>
       </w:r>
       <w:proofErr w:type="spellStart"/>
@@ -19388,8 +20050,145 @@
       </w:r>
       <w:proofErr w:type="spellEnd"/>
       <w:r>
-        <w:t xml:space="preserve"> 3. https://m3.material.io</w:t>
-      </w:r>
+        <w:t xml:space="preserve"> 3. </w:t>
+      </w:r>
+      <w:hyperlink r:id="rId12" w:history="1">
+        <w:r>
+          <w:rPr>
+            <w:rStyle w:val="Hipervnculo"/>
+          </w:rPr>
+          <w:t>https://m3.material.io</w:t>
+        </w:r>
+      </w:hyperlink>
+    </w:p>
+    <w:p>
+      <w:pPr>
+        <w:pStyle w:val="Prrafodelista"/>
+        <w:numPr>
+          <w:ilvl w:val="0"/>
+          <w:numId w:val="2"/>
+        </w:numPr>
+        <w:spacing w:after="60" w:line="276" w:lineRule="auto"/>
+        <w:jc w:val="both"/>
+      </w:pPr>
+      <w:r>
+        <w:t xml:space="preserve">Documentación de </w:t>
+      </w:r>
+      <w:proofErr w:type="spellStart"/>
+      <w:r>
+        <w:t>springdoc-openapi</w:t>
+      </w:r>
+      <w:proofErr w:type="spellEnd"/>
+      <w:r>
+        <w:t xml:space="preserve">. </w:t>
+      </w:r>
+      <w:hyperlink r:id="rId13" w:history="1">
+        <w:r>
+          <w:rPr>
+            <w:rStyle w:val="Hipervnculo"/>
+          </w:rPr>
+          <w:t>https://springdoc.org</w:t>
+        </w:r>
+      </w:hyperlink>
+      <w:r>
+        <w:t xml:space="preserve"> </w:t>
+      </w:r>
+    </w:p>
+    <w:p>
+      <w:pPr>
+        <w:pStyle w:val="Prrafodelista"/>
+        <w:numPr>
+          <w:ilvl w:val="0"/>
+          <w:numId w:val="2"/>
+        </w:numPr>
+        <w:spacing w:after="60" w:line="276" w:lineRule="auto"/>
+        <w:jc w:val="both"/>
+      </w:pPr>
+      <w:r>
+        <w:t xml:space="preserve">Documentación de </w:t>
+      </w:r>
+      <w:proofErr w:type="spellStart"/>
+      <w:r>
+        <w:t>JUnit</w:t>
+      </w:r>
+      <w:proofErr w:type="spellEnd"/>
+      <w:r>
+        <w:t xml:space="preserve"> 5. </w:t>
+      </w:r>
+      <w:hyperlink r:id="rId14" w:history="1">
+        <w:r>
+          <w:rPr>
+            <w:rStyle w:val="Hipervnculo"/>
+          </w:rPr>
+          <w:t>https://junit.org/junit5/docs/current/user-guide</w:t>
+        </w:r>
+      </w:hyperlink>
+      <w:r>
+        <w:t xml:space="preserve"> </w:t>
+      </w:r>
+    </w:p>
+    <w:p>
+      <w:pPr>
+        <w:pStyle w:val="Prrafodelista"/>
+        <w:numPr>
+          <w:ilvl w:val="0"/>
+          <w:numId w:val="2"/>
+        </w:numPr>
+        <w:spacing w:after="60" w:line="276" w:lineRule="auto"/>
+        <w:jc w:val="both"/>
+      </w:pPr>
+      <w:r>
+        <w:t xml:space="preserve">Documentación de </w:t>
+      </w:r>
+      <w:proofErr w:type="spellStart"/>
+      <w:r>
+        <w:t>Mockito-Kotlin</w:t>
+      </w:r>
+      <w:proofErr w:type="spellEnd"/>
+      <w:r>
+        <w:t xml:space="preserve">. </w:t>
+      </w:r>
+      <w:hyperlink r:id="rId15" w:history="1">
+        <w:r>
+          <w:rPr>
+            <w:rStyle w:val="Hipervnculo"/>
+          </w:rPr>
+          <w:t>https://github.com/mockito/mockito-kotlin</w:t>
+        </w:r>
+      </w:hyperlink>
+      <w:r>
+        <w:t xml:space="preserve"> </w:t>
+      </w:r>
+    </w:p>
+    <w:p>
+      <w:pPr>
+        <w:pStyle w:val="Prrafodelista"/>
+        <w:numPr>
+          <w:ilvl w:val="0"/>
+          <w:numId w:val="2"/>
+        </w:numPr>
+        <w:spacing w:after="60" w:line="276" w:lineRule="auto"/>
+        <w:jc w:val="both"/>
+      </w:pPr>
+      <w:r>
+        <w:t xml:space="preserve">Manual de </w:t>
+      </w:r>
+      <w:proofErr w:type="spellStart"/>
+      <w:r>
+        <w:t>systemd</w:t>
+      </w:r>
+      <w:proofErr w:type="spellEnd"/>
+      <w:r>
+        <w:t xml:space="preserve">. </w:t>
+      </w:r>
+      <w:hyperlink r:id="rId16" w:history="1">
+        <w:r>
+          <w:rPr>
+            <w:rStyle w:val="Hipervnculo"/>
+          </w:rPr>
+          <w:t>https://www.freedesktop.org/wiki/Software/systemd</w:t>
+        </w:r>
+      </w:hyperlink>
     </w:p>
     <w:p>
       <w:pPr>
@@ -19438,7 +20237,7 @@
       <w:r>
         <w:t xml:space="preserve">, cliente Android y documentación): </w:t>
       </w:r>
-      <w:hyperlink r:id="rId12" w:history="1">
+      <w:hyperlink r:id="rId17" w:history="1">
         <w:r>
           <w:rPr>
             <w:rStyle w:val="Hipervnculo"/>
@@ -19518,7 +20317,7 @@
                     </pic:cNvPicPr>
                   </pic:nvPicPr>
                   <pic:blipFill>
-                    <a:blip r:embed="rId13" cstate="print">
+                    <a:blip r:embed="rId18" cstate="print">
                       <a:extLst>
                         <a:ext uri="{28A0092B-C50C-407E-A947-70E740481C1C}">
                           <a14:useLocalDpi xmlns:a14="http://schemas.microsoft.com/office/drawing/2010/main" val="0"/>
@@ -19614,7 +20413,7 @@
                     <pic:cNvPicPr/>
                   </pic:nvPicPr>
                   <pic:blipFill>
-                    <a:blip r:embed="rId14">
+                    <a:blip r:embed="rId19">
                       <a:extLst>
                         <a:ext uri="{28A0092B-C50C-407E-A947-70E740481C1C}">
                           <a14:useLocalDpi xmlns:a14="http://schemas.microsoft.com/office/drawing/2010/main" val="0"/>
@@ -19685,7 +20484,7 @@
                     <pic:cNvPicPr/>
                   </pic:nvPicPr>
                   <pic:blipFill>
-                    <a:blip r:embed="rId15">
+                    <a:blip r:embed="rId20">
                       <a:extLst>
                         <a:ext uri="{28A0092B-C50C-407E-A947-70E740481C1C}">
                           <a14:useLocalDpi xmlns:a14="http://schemas.microsoft.com/office/drawing/2010/main" val="0"/>
@@ -19713,8 +20512,8 @@
       </w:r>
     </w:p>
     <w:sectPr>
-      <w:headerReference w:type="default" r:id="rId16"/>
-      <w:footerReference w:type="default" r:id="rId17"/>
+      <w:headerReference w:type="default" r:id="rId21"/>
+      <w:footerReference w:type="default" r:id="rId22"/>
       <w:pgSz w:w="11906" w:h="16838"/>
       <w:pgMar w:top="1440" w:right="1440" w:bottom="1440" w:left="1440" w:header="708" w:footer="708" w:gutter="0"/>
       <w:cols w:space="720"/>

</xml_diff>

<commit_message>
feat: update memory the last changes
</commit_message>
<xml_diff>
--- a/docs/memoria/Memoria_PistaGO.docx
+++ b/docs/memoria/Memoria_PistaGO.docx
@@ -286,19 +286,8 @@
           <w:sz w:val="32"/>
           <w:szCs w:val="32"/>
         </w:rPr>
-        <w:t xml:space="preserve">Memoria del Proyecto </w:t>
-      </w:r>
-      <w:proofErr w:type="spellStart"/>
-      <w:r>
-        <w:rPr>
-          <w:b/>
-          <w:bCs/>
-          <w:sz w:val="32"/>
-          <w:szCs w:val="32"/>
-        </w:rPr>
-        <w:t>Intermodular</w:t>
-      </w:r>
-      <w:proofErr w:type="spellEnd"/>
+        <w:t>Memoria del Proyecto Intermodular</w:t>
+      </w:r>
     </w:p>
     <w:p>
       <w:pPr>
@@ -3943,7 +3932,6 @@
         </w:rPr>
       </w:pPr>
       <w:bookmarkStart w:id="3" w:name="_Toc230535723"/>
-      <w:proofErr w:type="spellStart"/>
       <w:r>
         <w:rPr>
           <w:b w:val="0"/>
@@ -3952,10 +3940,13 @@
           <w:sz w:val="22"/>
           <w:szCs w:val="22"/>
         </w:rPr>
-        <w:t>PistaGO</w:t>
-      </w:r>
-      <w:proofErr w:type="spellEnd"/>
-      <w:r>
+        <w:t>PistaGO es una aplicación móvil Android nativa para la gestión integral de reservas de pistas de tenis en clubes deportivos. El proyecto nace de una necesidad real: muchos clubes de tamaño pequeño y medio siguen gestionando sus reservas de forma manual —llamadas telefónicas, mensajes de WhatsApp o anotaciones en papel—, lo que provoca solapamientos de horarios, conflictos entre socios y un aprovechamiento ineficiente de las pistas.</w:t>
+      </w:r>
+    </w:p>
+    <w:p>
+      <w:pPr>
+        <w:pStyle w:val="Ttulo2"/>
+        <w:jc w:val="both"/>
         <w:rPr>
           <w:b w:val="0"/>
           <w:bCs w:val="0"/>
@@ -3963,13 +3954,8 @@
           <w:sz w:val="22"/>
           <w:szCs w:val="22"/>
         </w:rPr>
-        <w:t xml:space="preserve"> es una aplicación móvil Android nativa para la gestión integral de reservas de pistas de tenis en clubes deportivos. El proyecto nace de una necesidad real: muchos clubes de tamaño pequeño y medio siguen gestionando sus reservas de forma manual —llamadas telefónicas, mensajes de WhatsApp o anotaciones en papel—, lo que provoca solapamientos de horarios, conflictos entre socios y un aprovechamiento ineficiente de las pistas.</w:t>
-      </w:r>
-    </w:p>
-    <w:p>
-      <w:pPr>
-        <w:pStyle w:val="Ttulo2"/>
-        <w:jc w:val="both"/>
+      </w:pPr>
+      <w:r>
         <w:rPr>
           <w:b w:val="0"/>
           <w:bCs w:val="0"/>
@@ -3977,126 +3963,7 @@
           <w:sz w:val="22"/>
           <w:szCs w:val="22"/>
         </w:rPr>
-      </w:pPr>
-      <w:r>
-        <w:rPr>
-          <w:b w:val="0"/>
-          <w:bCs w:val="0"/>
-          <w:color w:val="auto"/>
-          <w:sz w:val="22"/>
-          <w:szCs w:val="22"/>
-        </w:rPr>
-        <w:t xml:space="preserve">La motivación personal surge de mi afición al tenis y de la experiencia directa con estos problemas. A nivel académico, </w:t>
-      </w:r>
-      <w:proofErr w:type="spellStart"/>
-      <w:r>
-        <w:rPr>
-          <w:b w:val="0"/>
-          <w:bCs w:val="0"/>
-          <w:color w:val="auto"/>
-          <w:sz w:val="22"/>
-          <w:szCs w:val="22"/>
-        </w:rPr>
-        <w:t>PistaGO</w:t>
-      </w:r>
-      <w:proofErr w:type="spellEnd"/>
-      <w:r>
-        <w:rPr>
-          <w:b w:val="0"/>
-          <w:bCs w:val="0"/>
-          <w:color w:val="auto"/>
-          <w:sz w:val="22"/>
-          <w:szCs w:val="22"/>
-        </w:rPr>
-        <w:t xml:space="preserve"> es un proyecto </w:t>
-      </w:r>
-      <w:proofErr w:type="spellStart"/>
-      <w:r>
-        <w:rPr>
-          <w:b w:val="0"/>
-          <w:bCs w:val="0"/>
-          <w:color w:val="auto"/>
-          <w:sz w:val="22"/>
-          <w:szCs w:val="22"/>
-        </w:rPr>
-        <w:t>intermodular</w:t>
-      </w:r>
-      <w:proofErr w:type="spellEnd"/>
-      <w:r>
-        <w:rPr>
-          <w:b w:val="0"/>
-          <w:bCs w:val="0"/>
-          <w:color w:val="auto"/>
-          <w:sz w:val="22"/>
-          <w:szCs w:val="22"/>
-        </w:rPr>
-        <w:t xml:space="preserve"> que integra las competencias de todos los módulos del ciclo DAM: los de desarrollo de interfaces y programación multimedia y dispositivos móviles (aplicación Android nativa con </w:t>
-      </w:r>
-      <w:proofErr w:type="spellStart"/>
-      <w:r>
-        <w:rPr>
-          <w:b w:val="0"/>
-          <w:bCs w:val="0"/>
-          <w:color w:val="auto"/>
-          <w:sz w:val="22"/>
-          <w:szCs w:val="22"/>
-        </w:rPr>
-        <w:t>Jetpack</w:t>
-      </w:r>
-      <w:proofErr w:type="spellEnd"/>
-      <w:r>
-        <w:rPr>
-          <w:b w:val="0"/>
-          <w:bCs w:val="0"/>
-          <w:color w:val="auto"/>
-          <w:sz w:val="22"/>
-          <w:szCs w:val="22"/>
-        </w:rPr>
-        <w:t xml:space="preserve"> </w:t>
-      </w:r>
-      <w:proofErr w:type="spellStart"/>
-      <w:r>
-        <w:rPr>
-          <w:b w:val="0"/>
-          <w:bCs w:val="0"/>
-          <w:color w:val="auto"/>
-          <w:sz w:val="22"/>
-          <w:szCs w:val="22"/>
-        </w:rPr>
-        <w:t>Compose</w:t>
-      </w:r>
-      <w:proofErr w:type="spellEnd"/>
-      <w:r>
-        <w:rPr>
-          <w:b w:val="0"/>
-          <w:bCs w:val="0"/>
-          <w:color w:val="auto"/>
-          <w:sz w:val="22"/>
-          <w:szCs w:val="22"/>
-        </w:rPr>
-        <w:t xml:space="preserve">), el de acceso a datos (base de datos relacional y mapeo objeto-relacional), la programación de servicios y procesos (API REST, concurrencia y comunicación en red mediante notificaciones </w:t>
-      </w:r>
-      <w:proofErr w:type="spellStart"/>
-      <w:r>
-        <w:rPr>
-          <w:b w:val="0"/>
-          <w:bCs w:val="0"/>
-          <w:color w:val="auto"/>
-          <w:sz w:val="22"/>
-          <w:szCs w:val="22"/>
-        </w:rPr>
-        <w:t>push</w:t>
-      </w:r>
-      <w:proofErr w:type="spellEnd"/>
-      <w:r>
-        <w:rPr>
-          <w:b w:val="0"/>
-          <w:bCs w:val="0"/>
-          <w:color w:val="auto"/>
-          <w:sz w:val="22"/>
-          <w:szCs w:val="22"/>
-        </w:rPr>
-        <w:t>) y los sistemas de gestión empresarial (lógica de negocio de reservas, roles y validaciones).</w:t>
+        <w:t>La motivación personal surge de mi afición al tenis y de la experiencia directa con estos problemas. A nivel académico, PistaGO es un proyecto intermodular que integra las competencias de todos los módulos del ciclo DAM: los de desarrollo de interfaces y programación multimedia y dispositivos móviles (aplicación Android nativa con Jetpack Compose), el de acceso a datos (base de datos relacional y mapeo objeto-relacional), la programación de servicios y procesos (API REST, concurrencia y comunicación en red mediante notificaciones push) y los sistemas de gestión empresarial (lógica de negocio de reservas, roles y validaciones).</w:t>
       </w:r>
     </w:p>
     <w:p>
@@ -4122,15 +3989,7 @@
         <w:t xml:space="preserve">Objetivo general: </w:t>
       </w:r>
       <w:r>
-        <w:t xml:space="preserve">desarrollar una aplicación móvil Android nativa, respaldada por una API REST propia, que permita gestionar de forma integral las reservas de pistas de tenis de un club, automatizando el proceso mediante una interfaz visual intuitiva y un </w:t>
-      </w:r>
-      <w:proofErr w:type="spellStart"/>
-      <w:r>
-        <w:t>backend</w:t>
-      </w:r>
-      <w:proofErr w:type="spellEnd"/>
-      <w:r>
-        <w:t xml:space="preserve"> seguro y robusto, todo ello desplegado en un entorno de producción real.</w:t>
+        <w:t>desarrollar una aplicación móvil Android nativa, respaldada por una API REST propia, que permita gestionar de forma integral las reservas de pistas de tenis de un club, automatizando el proceso mediante una interfaz visual intuitiva y un backend seguro y robusto, todo ello desplegado en un entorno de producción real.</w:t>
       </w:r>
     </w:p>
     <w:p>
@@ -4224,31 +4083,7 @@
         <w:jc w:val="both"/>
       </w:pPr>
       <w:r>
-        <w:t xml:space="preserve">Integrar notificaciones </w:t>
-      </w:r>
-      <w:proofErr w:type="spellStart"/>
-      <w:r>
-        <w:t>push</w:t>
-      </w:r>
-      <w:proofErr w:type="spellEnd"/>
-      <w:r>
-        <w:t xml:space="preserve"> mediante </w:t>
-      </w:r>
-      <w:proofErr w:type="spellStart"/>
-      <w:r>
-        <w:t>Firebase</w:t>
-      </w:r>
-      <w:proofErr w:type="spellEnd"/>
-      <w:r>
-        <w:t xml:space="preserve"> Cloud </w:t>
-      </w:r>
-      <w:proofErr w:type="spellStart"/>
-      <w:r>
-        <w:t>Messaging</w:t>
-      </w:r>
-      <w:proofErr w:type="spellEnd"/>
-      <w:r>
-        <w:t xml:space="preserve"> para avisar al usuario de que su turno en la lista de espera está disponible.</w:t>
+        <w:t>Integrar notificaciones push mediante Firebase Cloud Messaging para avisar al usuario de que su turno en la lista de espera está disponible.</w:t>
       </w:r>
     </w:p>
     <w:p>
@@ -4382,15 +4217,7 @@
         <w:jc w:val="both"/>
       </w:pPr>
       <w:r>
-        <w:t xml:space="preserve">Desarrollar una API REST con Spring </w:t>
-      </w:r>
-      <w:proofErr w:type="spellStart"/>
-      <w:r>
-        <w:t>Boot</w:t>
-      </w:r>
-      <w:proofErr w:type="spellEnd"/>
-      <w:r>
-        <w:t xml:space="preserve"> estructurada en capas (controlador, servicio, repositorio), con validación de entrada y manejo centralizado de errores.</w:t>
+        <w:t>Desarrollar una API REST con Spring Boot estructurada en capas (controlador, servicio, repositorio), con validación de entrada y manejo centralizado de errores.</w:t>
       </w:r>
     </w:p>
     <w:p>
@@ -4424,15 +4251,7 @@
         <w:jc w:val="both"/>
       </w:pPr>
       <w:r>
-        <w:t xml:space="preserve">Implementar tareas programadas (@Scheduled) en el </w:t>
-      </w:r>
-      <w:proofErr w:type="spellStart"/>
-      <w:r>
-        <w:t>backend</w:t>
-      </w:r>
-      <w:proofErr w:type="spellEnd"/>
-      <w:r>
-        <w:t xml:space="preserve"> para la rotación automática de la lista de espera, garantizando que el sistema reaccione a eventos temporales sin intervención externa.</w:t>
+        <w:t>Implementar tareas programadas (@Scheduled) en el backend para la rotación automática de la lista de espera, garantizando que el sistema reaccione a eventos temporales sin intervención externa.</w:t>
       </w:r>
     </w:p>
     <w:p>
@@ -4484,31 +4303,23 @@
         <w:jc w:val="both"/>
       </w:pPr>
       <w:r>
-        <w:t xml:space="preserve">Garantizar la calidad del </w:t>
+        <w:t>Garantizar la calidad del backend con una batería de pruebas unitarias automatizadas (</w:t>
       </w:r>
       <w:proofErr w:type="spellStart"/>
       <w:r>
-        <w:t>backend</w:t>
+        <w:t>JUnit</w:t>
       </w:r>
       <w:proofErr w:type="spellEnd"/>
       <w:r>
-        <w:t xml:space="preserve"> con una batería de pruebas unitarias automatizadas (</w:t>
+        <w:t xml:space="preserve"> 5 + </w:t>
       </w:r>
       <w:proofErr w:type="spellStart"/>
       <w:r>
-        <w:t>JUnit</w:t>
+        <w:t>Mockito</w:t>
       </w:r>
       <w:proofErr w:type="spellEnd"/>
       <w:r>
-        <w:t xml:space="preserve"> 5 + </w:t>
-      </w:r>
-      <w:proofErr w:type="spellStart"/>
-      <w:r>
-        <w:t>Mockito-Kotlin</w:t>
-      </w:r>
-      <w:proofErr w:type="spellEnd"/>
-      <w:r>
-        <w:t>) que cubra los servicios críticos y se ejecute en menos de dos segundos.</w:t>
+        <w:t>-Kotlin) que cubra los servicios críticos y se ejecute en menos de dos segundos.</w:t>
       </w:r>
     </w:p>
     <w:p>
@@ -4522,15 +4333,7 @@
         <w:jc w:val="both"/>
       </w:pPr>
       <w:r>
-        <w:t xml:space="preserve">Desplegar el </w:t>
-      </w:r>
-      <w:proofErr w:type="spellStart"/>
-      <w:r>
-        <w:t>backend</w:t>
-      </w:r>
-      <w:proofErr w:type="spellEnd"/>
-      <w:r>
-        <w:t xml:space="preserve"> en un servidor propio (VPS) con HTTPS, garantizando seguridad en las comunicaciones.</w:t>
+        <w:t>Desplegar el backend en un servidor propio (VPS) con HTTPS, garantizando seguridad en las comunicaciones.</w:t>
       </w:r>
     </w:p>
     <w:p>
@@ -5342,23 +5145,7 @@
                 <w:sz w:val="20"/>
                 <w:szCs w:val="20"/>
               </w:rPr>
-              <w:t xml:space="preserve">Al cancelarse una reserva, el sistema notificará automáticamente mediante </w:t>
-            </w:r>
-            <w:proofErr w:type="spellStart"/>
-            <w:r>
-              <w:rPr>
-                <w:sz w:val="20"/>
-                <w:szCs w:val="20"/>
-              </w:rPr>
-              <w:t>push</w:t>
-            </w:r>
-            <w:proofErr w:type="spellEnd"/>
-            <w:r>
-              <w:rPr>
-                <w:sz w:val="20"/>
-                <w:szCs w:val="20"/>
-              </w:rPr>
-              <w:t xml:space="preserve"> al primer usuario de la lista de espera que no haya sido notificado.</w:t>
+              <w:t>Al cancelarse una reserva, el sistema notificará automáticamente mediante push al primer usuario de la lista de espera que no haya sido notificado.</w:t>
             </w:r>
           </w:p>
         </w:tc>
@@ -5422,23 +5209,7 @@
                 <w:sz w:val="20"/>
                 <w:szCs w:val="20"/>
               </w:rPr>
-              <w:t xml:space="preserve">Si el primer usuario notificado no confirma la reserva en un plazo configurable, una tarea programada del </w:t>
-            </w:r>
-            <w:proofErr w:type="spellStart"/>
-            <w:r>
-              <w:rPr>
-                <w:sz w:val="20"/>
-                <w:szCs w:val="20"/>
-              </w:rPr>
-              <w:t>backend</w:t>
-            </w:r>
-            <w:proofErr w:type="spellEnd"/>
-            <w:r>
-              <w:rPr>
-                <w:sz w:val="20"/>
-                <w:szCs w:val="20"/>
-              </w:rPr>
-              <w:t xml:space="preserve"> rotará automáticamente la cola y notificará al siguiente.</w:t>
+              <w:t>Si el primer usuario notificado no confirma la reserva en un plazo configurable, una tarea programada del backend rotará automáticamente la cola y notificará al siguiente.</w:t>
             </w:r>
           </w:p>
         </w:tc>
@@ -5502,23 +5273,7 @@
                 <w:sz w:val="20"/>
                 <w:szCs w:val="20"/>
               </w:rPr>
-              <w:t xml:space="preserve">Cuando un administrador cancele una reserva de la que no es propietario, el sistema notificará al usuario afectado mediante </w:t>
-            </w:r>
-            <w:proofErr w:type="spellStart"/>
-            <w:r>
-              <w:rPr>
-                <w:sz w:val="20"/>
-                <w:szCs w:val="20"/>
-              </w:rPr>
-              <w:t>push</w:t>
-            </w:r>
-            <w:proofErr w:type="spellEnd"/>
-            <w:r>
-              <w:rPr>
-                <w:sz w:val="20"/>
-                <w:szCs w:val="20"/>
-              </w:rPr>
-              <w:t>.</w:t>
+              <w:t>Cuando un administrador cancele una reserva de la que no es propietario, el sistema notificará al usuario afectado mediante push.</w:t>
             </w:r>
           </w:p>
         </w:tc>
@@ -6679,7 +6434,7 @@
                 <w:sz w:val="20"/>
                 <w:szCs w:val="20"/>
               </w:rPr>
-              <w:t xml:space="preserve">El </w:t>
+              <w:t>El backend cuenta con una batería de pruebas unitarias automatizadas (</w:t>
             </w:r>
             <w:proofErr w:type="spellStart"/>
             <w:r>
@@ -6687,7 +6442,7 @@
                 <w:sz w:val="20"/>
                 <w:szCs w:val="20"/>
               </w:rPr>
-              <w:t>backend</w:t>
+              <w:t>JUnit</w:t>
             </w:r>
             <w:proofErr w:type="spellEnd"/>
             <w:r>
@@ -6695,7 +6450,7 @@
                 <w:sz w:val="20"/>
                 <w:szCs w:val="20"/>
               </w:rPr>
-              <w:t xml:space="preserve"> cuenta con una batería de pruebas unitarias automatizadas (</w:t>
+              <w:t xml:space="preserve"> 5 + </w:t>
             </w:r>
             <w:proofErr w:type="spellStart"/>
             <w:r>
@@ -6703,7 +6458,7 @@
                 <w:sz w:val="20"/>
                 <w:szCs w:val="20"/>
               </w:rPr>
-              <w:t>JUnit</w:t>
+              <w:t>Mockito</w:t>
             </w:r>
             <w:proofErr w:type="spellEnd"/>
             <w:r>
@@ -6711,23 +6466,7 @@
                 <w:sz w:val="20"/>
                 <w:szCs w:val="20"/>
               </w:rPr>
-              <w:t xml:space="preserve"> 5 + </w:t>
-            </w:r>
-            <w:proofErr w:type="spellStart"/>
-            <w:r>
-              <w:rPr>
-                <w:sz w:val="20"/>
-                <w:szCs w:val="20"/>
-              </w:rPr>
-              <w:t>Mockito-Kotlin</w:t>
-            </w:r>
-            <w:proofErr w:type="spellEnd"/>
-            <w:r>
-              <w:rPr>
-                <w:sz w:val="20"/>
-                <w:szCs w:val="20"/>
-              </w:rPr>
-              <w:t>) que cubre los servicios críticos y se ejecuta en menos de dos segundos.</w:t>
+              <w:t>-Kotlin) que cubre los servicios críticos y se ejecuta en menos de dos segundos.</w:t>
             </w:r>
           </w:p>
         </w:tc>
@@ -6919,23 +6658,7 @@
                 <w:sz w:val="20"/>
                 <w:szCs w:val="20"/>
               </w:rPr>
-              <w:t xml:space="preserve">El </w:t>
-            </w:r>
-            <w:proofErr w:type="spellStart"/>
-            <w:r>
-              <w:rPr>
-                <w:sz w:val="20"/>
-                <w:szCs w:val="20"/>
-              </w:rPr>
-              <w:t>backend</w:t>
-            </w:r>
-            <w:proofErr w:type="spellEnd"/>
-            <w:r>
-              <w:rPr>
-                <w:sz w:val="20"/>
-                <w:szCs w:val="20"/>
-              </w:rPr>
-              <w:t xml:space="preserve"> se ejecuta como servicio gestionado por </w:t>
+              <w:t xml:space="preserve">El backend se ejecuta como servicio gestionado por </w:t>
             </w:r>
             <w:proofErr w:type="spellStart"/>
             <w:r>
@@ -7160,66 +6883,40 @@
         <w:jc w:val="both"/>
       </w:pPr>
       <w:r>
-        <w:t xml:space="preserve">Se identifican tres actores: el Usuario (socio del club), el Administrador, y un actor externo, </w:t>
+        <w:t>Se identifican tres actores: el Usuario (socio del club), el Administrador, y un actor externo, Firebase Cloud Messaging, encargado de entregar las notificaciones push. El actor Administrador hereda los casos de uso del Usuario y añade los suyos propios.</w:t>
+      </w:r>
+    </w:p>
+    <w:p>
+      <w:pPr>
+        <w:jc w:val="both"/>
+      </w:pPr>
+    </w:p>
+    <w:p>
+      <w:pPr>
+        <w:jc w:val="both"/>
+      </w:pPr>
+      <w:r>
+        <w:t xml:space="preserve">El diagrama de casos de uso completo, junto con la descripción detallada de cada uno (precondiciones, flujo normal, flujos alternativos y postcondiciones), se incluye en el repositorio del proyecto en la carpeta </w:t>
       </w:r>
       <w:proofErr w:type="spellStart"/>
       <w:r>
-        <w:t>Firebase</w:t>
+        <w:t>docs</w:t>
       </w:r>
       <w:proofErr w:type="spellEnd"/>
       <w:r>
-        <w:t xml:space="preserve"> Cloud </w:t>
+        <w:t>/</w:t>
       </w:r>
       <w:proofErr w:type="spellStart"/>
       <w:r>
-        <w:t>Messaging</w:t>
+        <w:t>diagrams</w:t>
       </w:r>
       <w:proofErr w:type="spellEnd"/>
       <w:r>
-        <w:t xml:space="preserve">, encargado de entregar las notificaciones </w:t>
-      </w:r>
-      <w:proofErr w:type="spellStart"/>
-      <w:r>
-        <w:t>push</w:t>
-      </w:r>
-      <w:proofErr w:type="spellEnd"/>
-      <w:r>
-        <w:t>. El actor Administrador hereda los casos de uso del Usuario y añade los suyos propios.</w:t>
-      </w:r>
-    </w:p>
-    <w:p>
-      <w:pPr>
-        <w:jc w:val="both"/>
-      </w:pPr>
-    </w:p>
-    <w:p>
-      <w:pPr>
-        <w:jc w:val="both"/>
-      </w:pPr>
-      <w:r>
-        <w:t xml:space="preserve">El diagrama de casos de uso completo, junto con la descripción detallada de cada uno (precondiciones, flujo normal, flujos alternativos y postcondiciones), se incluye en el repositorio del proyecto en la carpeta </w:t>
-      </w:r>
-      <w:proofErr w:type="spellStart"/>
-      <w:r>
-        <w:t>docs</w:t>
-      </w:r>
-      <w:proofErr w:type="spellEnd"/>
-      <w:r>
-        <w:t>/</w:t>
-      </w:r>
-      <w:proofErr w:type="spellStart"/>
-      <w:r>
-        <w:t>diagrams</w:t>
-      </w:r>
-      <w:proofErr w:type="spellEnd"/>
-      <w:r>
         <w:t xml:space="preserve">. A </w:t>
       </w:r>
-      <w:proofErr w:type="gramStart"/>
-      <w:r>
-        <w:t>continuación</w:t>
-      </w:r>
-      <w:proofErr w:type="gramEnd"/>
+      <w:r>
+        <w:t>continuación,</w:t>
+      </w:r>
       <w:r>
         <w:t xml:space="preserve"> se resume el caso de uso más representativo:</w:t>
       </w:r>
@@ -7270,7 +6967,10 @@
         <w:t>Actor principal</w:t>
       </w:r>
       <w:r>
-        <w:t>: Usuario.</w:t>
+        <w:t>: Usuario</w:t>
+      </w:r>
+      <w:r>
+        <w:t xml:space="preserve"> y Administrador</w:t>
       </w:r>
     </w:p>
     <w:p>
@@ -7289,23 +6989,7 @@
         <w:t>Actor secundario</w:t>
       </w:r>
       <w:r>
-        <w:t xml:space="preserve">: </w:t>
-      </w:r>
-      <w:proofErr w:type="spellStart"/>
-      <w:r>
-        <w:t>Firebase</w:t>
-      </w:r>
-      <w:proofErr w:type="spellEnd"/>
-      <w:r>
-        <w:t xml:space="preserve"> Cloud </w:t>
-      </w:r>
-      <w:proofErr w:type="spellStart"/>
-      <w:r>
-        <w:t>Messaging</w:t>
-      </w:r>
-      <w:proofErr w:type="spellEnd"/>
-      <w:r>
-        <w:t>.</w:t>
+        <w:t>: Firebase Cloud Messaging.</w:t>
       </w:r>
     </w:p>
     <w:p>
@@ -7421,23 +7105,7 @@
         <w:jc w:val="both"/>
       </w:pPr>
       <w:r>
-        <w:t xml:space="preserve">El sistema solicita a </w:t>
-      </w:r>
-      <w:proofErr w:type="spellStart"/>
-      <w:r>
-        <w:t>Firebase</w:t>
-      </w:r>
-      <w:proofErr w:type="spellEnd"/>
-      <w:r>
-        <w:t xml:space="preserve"> el envío de una notificación </w:t>
-      </w:r>
-      <w:proofErr w:type="spellStart"/>
-      <w:r>
-        <w:t>push</w:t>
-      </w:r>
-      <w:proofErr w:type="spellEnd"/>
-      <w:r>
-        <w:t xml:space="preserve"> a ese usuario, registra el aviso en el historial y marca un plazo de confirmación.</w:t>
+        <w:t>El sistema solicita a Firebase el envío de una notificación push a ese usuario, registra el aviso en el historial y marca un plazo de confirmación.</w:t>
       </w:r>
     </w:p>
     <w:p>
@@ -7500,21 +7168,11 @@
       <w:r>
         <w:t xml:space="preserve">Si el usuario destinatario no tiene token de notificación registrado, el aviso se guarda en el </w:t>
       </w:r>
-      <w:proofErr w:type="gramStart"/>
-      <w:r>
-        <w:t>historial</w:t>
-      </w:r>
-      <w:proofErr w:type="gramEnd"/>
-      <w:r>
-        <w:t xml:space="preserve"> pero no se envía </w:t>
-      </w:r>
-      <w:proofErr w:type="spellStart"/>
-      <w:r>
-        <w:t>push</w:t>
-      </w:r>
-      <w:proofErr w:type="spellEnd"/>
-      <w:r>
-        <w:t>.</w:t>
+      <w:r>
+        <w:t>historial,</w:t>
+      </w:r>
+      <w:r>
+        <w:t xml:space="preserve"> pero no se envía push.</w:t>
       </w:r>
     </w:p>
     <w:p>
@@ -7536,15 +7194,7 @@
         <w:t>no confirma la reserva dentro del plazo establecido</w:t>
       </w:r>
       <w:r>
-        <w:t xml:space="preserve">, una tarea programada del </w:t>
-      </w:r>
-      <w:proofErr w:type="spellStart"/>
-      <w:r>
-        <w:t>backend</w:t>
-      </w:r>
-      <w:proofErr w:type="spellEnd"/>
-      <w:r>
-        <w:t xml:space="preserve"> (@Scheduled) detectará la expiración, eliminará su entrada de la cola y notificará automáticamente al siguiente usuario de la lista, reiniciando el ciclo.</w:t>
+        <w:t>, una tarea programada del backend (@Scheduled) detectará la expiración, eliminará su entrada de la cola y notificará automáticamente al siguiente usuario de la lista, reiniciando el ciclo.</w:t>
       </w:r>
     </w:p>
     <w:p>
@@ -7569,29 +7219,11 @@
         <w:jc w:val="both"/>
       </w:pPr>
       <w:r>
-        <w:t>Durante el diseño del modelo de datos se incluyeron dos tablas (</w:t>
-      </w:r>
-      <w:proofErr w:type="spellStart"/>
-      <w:r>
-        <w:t>bloqueos_horario</w:t>
-      </w:r>
-      <w:proofErr w:type="spellEnd"/>
-      <w:r>
-        <w:t xml:space="preserve"> y </w:t>
-      </w:r>
-      <w:proofErr w:type="spellStart"/>
-      <w:r>
-        <w:t>configuracion_sistema</w:t>
-      </w:r>
-      <w:proofErr w:type="spellEnd"/>
-      <w:r>
-        <w:t xml:space="preserve">) que dan soporte a funcionalidades </w:t>
-      </w:r>
-      <w:proofErr w:type="gramStart"/>
-      <w:r>
-        <w:t>planificadas</w:t>
-      </w:r>
-      <w:proofErr w:type="gramEnd"/>
+        <w:t xml:space="preserve">Durante el diseño del modelo de datos se incluyeron dos tablas (bloqueos_horario y configuracion_sistema) que dan soporte a funcionalidades </w:t>
+      </w:r>
+      <w:r>
+        <w:t>planificadas,</w:t>
+      </w:r>
       <w:r>
         <w:t xml:space="preserve"> pero no implementadas en esta versión del proyecto. Estos requisitos quedan documentados como evolución natural del sistema: </w:t>
       </w:r>
@@ -7740,23 +7372,7 @@
                 <w:sz w:val="20"/>
                 <w:szCs w:val="20"/>
               </w:rPr>
-              <w:t xml:space="preserve">El administrador podrá bloquear franjas horarias específicas por mantenimiento o eventos. La tabla </w:t>
-            </w:r>
-            <w:proofErr w:type="spellStart"/>
-            <w:r>
-              <w:rPr>
-                <w:sz w:val="20"/>
-                <w:szCs w:val="20"/>
-              </w:rPr>
-              <w:t>bloqueos_horario</w:t>
-            </w:r>
-            <w:proofErr w:type="spellEnd"/>
-            <w:r>
-              <w:rPr>
-                <w:sz w:val="20"/>
-                <w:szCs w:val="20"/>
-              </w:rPr>
-              <w:t xml:space="preserve"> está modelada y vinculada al modelo de datos.</w:t>
+              <w:t>El administrador podrá bloquear franjas horarias específicas por mantenimiento o eventos. La tabla bloqueos_horario está modelada y vinculada al modelo de datos.</w:t>
             </w:r>
           </w:p>
         </w:tc>
@@ -7818,23 +7434,7 @@
                 <w:sz w:val="20"/>
                 <w:szCs w:val="20"/>
               </w:rPr>
-              <w:t xml:space="preserve">El administrador podrá configurar parámetros globales del sistema (horarios de apertura, duración de franja, márgenes de cancelación) desde un panel, sin necesidad de redespliegue. La tabla </w:t>
-            </w:r>
-            <w:proofErr w:type="spellStart"/>
-            <w:r>
-              <w:rPr>
-                <w:sz w:val="20"/>
-                <w:szCs w:val="20"/>
-              </w:rPr>
-              <w:t>configuracion_sistema</w:t>
-            </w:r>
-            <w:proofErr w:type="spellEnd"/>
-            <w:r>
-              <w:rPr>
-                <w:sz w:val="20"/>
-                <w:szCs w:val="20"/>
-              </w:rPr>
-              <w:t xml:space="preserve"> está modelada para soportarlo.</w:t>
+              <w:t>El administrador podrá configurar parámetros globales del sistema (horarios de apertura, duración de franja, márgenes de cancelación) desde un panel, sin necesidad de redespliegue. La tabla configuracion_sistema está modelada para soportarlo.</w:t>
             </w:r>
           </w:p>
         </w:tc>
@@ -7876,45 +7476,8 @@
         <w:spacing w:after="120" w:line="276" w:lineRule="auto"/>
         <w:jc w:val="both"/>
       </w:pPr>
-      <w:proofErr w:type="spellStart"/>
-      <w:r>
-        <w:t>PistaGO</w:t>
-      </w:r>
-      <w:proofErr w:type="spellEnd"/>
-      <w:r>
-        <w:t xml:space="preserve"> sigue una arquitectura cliente-servidor. El cliente es una aplicación Android nativa que se comunica con el servidor exclusivamente a través de una API REST sobre HTTPS, intercambiando datos en formato JSON. El servidor, una API REST desarrollada con Spring </w:t>
-      </w:r>
-      <w:proofErr w:type="spellStart"/>
-      <w:r>
-        <w:t>Boot</w:t>
-      </w:r>
-      <w:proofErr w:type="spellEnd"/>
-      <w:r>
-        <w:t xml:space="preserve">, concentra la lógica de negocio y el acceso a la base de datos PostgreSQL. Las notificaciones </w:t>
-      </w:r>
-      <w:proofErr w:type="spellStart"/>
-      <w:r>
-        <w:t>push</w:t>
-      </w:r>
-      <w:proofErr w:type="spellEnd"/>
-      <w:r>
-        <w:t xml:space="preserve"> viajan por un canal independiente gestionado por </w:t>
-      </w:r>
-      <w:proofErr w:type="spellStart"/>
-      <w:r>
-        <w:t>Firebase</w:t>
-      </w:r>
-      <w:proofErr w:type="spellEnd"/>
-      <w:r>
-        <w:t xml:space="preserve"> Cloud </w:t>
-      </w:r>
-      <w:proofErr w:type="spellStart"/>
-      <w:r>
-        <w:t>Messaging</w:t>
-      </w:r>
-      <w:proofErr w:type="spellEnd"/>
-      <w:r>
-        <w:t>.</w:t>
+      <w:r>
+        <w:t>PistaGO sigue una arquitectura cliente-servidor. El cliente es una aplicación Android nativa que se comunica con el servidor exclusivamente a través de una API REST sobre HTTPS, intercambiando datos en formato JSON. El servidor, una API REST desarrollada con Spring Boot, concentra la lógica de negocio y el acceso a la base de datos PostgreSQL. Las notificaciones push viajan por un canal independiente gestionado por Firebase Cloud Messaging.</w:t>
       </w:r>
     </w:p>
     <w:p>
@@ -7938,51 +7501,7 @@
           <w:sz w:val="22"/>
           <w:szCs w:val="22"/>
         </w:rPr>
-        <w:t xml:space="preserve">La infraestructura de producción se aloja en un servidor virtual privado (VPS) con Ubuntu 24.04, donde </w:t>
-      </w:r>
-      <w:proofErr w:type="spellStart"/>
-      <w:r>
-        <w:rPr>
-          <w:b w:val="0"/>
-          <w:bCs w:val="0"/>
-          <w:color w:val="auto"/>
-          <w:sz w:val="22"/>
-          <w:szCs w:val="22"/>
-        </w:rPr>
-        <w:t>Nginx</w:t>
-      </w:r>
-      <w:proofErr w:type="spellEnd"/>
-      <w:r>
-        <w:rPr>
-          <w:b w:val="0"/>
-          <w:bCs w:val="0"/>
-          <w:color w:val="auto"/>
-          <w:sz w:val="22"/>
-          <w:szCs w:val="22"/>
-        </w:rPr>
-        <w:t xml:space="preserve"> actúa como proxy inverso: redirige las peticiones de la API hacia el </w:t>
-      </w:r>
-      <w:proofErr w:type="spellStart"/>
-      <w:r>
-        <w:rPr>
-          <w:b w:val="0"/>
-          <w:bCs w:val="0"/>
-          <w:color w:val="auto"/>
-          <w:sz w:val="22"/>
-          <w:szCs w:val="22"/>
-        </w:rPr>
-        <w:t>backend</w:t>
-      </w:r>
-      <w:proofErr w:type="spellEnd"/>
-      <w:r>
-        <w:rPr>
-          <w:b w:val="0"/>
-          <w:bCs w:val="0"/>
-          <w:color w:val="auto"/>
-          <w:sz w:val="22"/>
-          <w:szCs w:val="22"/>
-        </w:rPr>
-        <w:t xml:space="preserve"> y sirve directamente los archivos estáticos (fotos de perfil), todo ello bajo HTTPS con certificado de </w:t>
+        <w:t xml:space="preserve">La infraestructura de producción se aloja en un servidor virtual privado (VPS) con Ubuntu 24.04, donde Nginx actúa como proxy inverso: redirige las peticiones de la API hacia el backend y sirve directamente los archivos estáticos (fotos de perfil), todo ello bajo HTTPS con certificado de </w:t>
       </w:r>
       <w:proofErr w:type="spellStart"/>
       <w:r>
@@ -8026,29 +7545,7 @@
           <w:sz w:val="22"/>
           <w:szCs w:val="22"/>
         </w:rPr>
-        <w:t xml:space="preserve">. El </w:t>
-      </w:r>
-      <w:proofErr w:type="spellStart"/>
-      <w:r>
-        <w:rPr>
-          <w:b w:val="0"/>
-          <w:bCs w:val="0"/>
-          <w:color w:val="auto"/>
-          <w:sz w:val="22"/>
-          <w:szCs w:val="22"/>
-        </w:rPr>
-        <w:t>backend</w:t>
-      </w:r>
-      <w:proofErr w:type="spellEnd"/>
-      <w:r>
-        <w:rPr>
-          <w:b w:val="0"/>
-          <w:bCs w:val="0"/>
-          <w:color w:val="auto"/>
-          <w:sz w:val="22"/>
-          <w:szCs w:val="22"/>
-        </w:rPr>
-        <w:t xml:space="preserve"> se ejecuta como servicio gestionado por </w:t>
+        <w:t xml:space="preserve">. El backend se ejecuta como servicio gestionado por </w:t>
       </w:r>
       <w:proofErr w:type="spellStart"/>
       <w:r>
@@ -8203,23 +7700,7 @@
         <w:t xml:space="preserve">Capa de presentación: </w:t>
       </w:r>
       <w:r>
-        <w:t xml:space="preserve">pantallas construidas con </w:t>
-      </w:r>
-      <w:proofErr w:type="spellStart"/>
-      <w:r>
-        <w:t>Jetpack</w:t>
-      </w:r>
-      <w:proofErr w:type="spellEnd"/>
-      <w:r>
-        <w:t xml:space="preserve"> </w:t>
-      </w:r>
-      <w:proofErr w:type="spellStart"/>
-      <w:r>
-        <w:t>Compose</w:t>
-      </w:r>
-      <w:proofErr w:type="spellEnd"/>
-      <w:r>
-        <w:t xml:space="preserve"> y </w:t>
+        <w:t xml:space="preserve">pantallas construidas con Jetpack Compose y </w:t>
       </w:r>
       <w:proofErr w:type="spellStart"/>
       <w:r>
@@ -8354,23 +7835,7 @@
         <w:jc w:val="both"/>
       </w:pPr>
       <w:r>
-        <w:t xml:space="preserve">El </w:t>
-      </w:r>
-      <w:proofErr w:type="spellStart"/>
-      <w:r>
-        <w:t>backend</w:t>
-      </w:r>
-      <w:proofErr w:type="spellEnd"/>
-      <w:r>
-        <w:t xml:space="preserve"> sigue la arquitectura en capas clásica de Spring </w:t>
-      </w:r>
-      <w:proofErr w:type="spellStart"/>
-      <w:r>
-        <w:t>Boot</w:t>
-      </w:r>
-      <w:proofErr w:type="spellEnd"/>
-      <w:r>
-        <w:t>, complementada con un componente de tareas programadas:</w:t>
+        <w:t>El backend sigue la arquitectura en capas clásica de Spring Boot, complementada con un componente de tareas programadas:</w:t>
       </w:r>
     </w:p>
     <w:p>
@@ -8542,13 +8007,17 @@
         <w:t xml:space="preserve">): </w:t>
       </w:r>
       <w:r>
-        <w:t xml:space="preserve">ejecución periódica de </w:t>
-      </w:r>
-      <w:proofErr w:type="spellStart"/>
-      <w:r>
-        <w:t>proeces</w:t>
-      </w:r>
-      <w:proofErr w:type="spellEnd"/>
+        <w:t>ejecución periódica de pro</w:t>
+      </w:r>
+      <w:r>
+        <w:t>c</w:t>
+      </w:r>
+      <w:r>
+        <w:t>es</w:t>
+      </w:r>
+      <w:r>
+        <w:t>os</w:t>
+      </w:r>
       <w:r>
         <w:t xml:space="preserve"> como la rotación automática de la cola de espera, implementada con la anotación @Scheduled y un intervalo de 30 segundos. </w:t>
       </w:r>
@@ -8615,42 +8084,10 @@
       </w:r>
       <w:proofErr w:type="spellEnd"/>
       <w:r>
-        <w:t>) y tres de soporte (</w:t>
-      </w:r>
-      <w:proofErr w:type="spellStart"/>
-      <w:r>
-        <w:t>bloqueos_horario</w:t>
-      </w:r>
-      <w:proofErr w:type="spellEnd"/>
-      <w:r>
-        <w:t xml:space="preserve">, notificaciones y </w:t>
-      </w:r>
-      <w:proofErr w:type="spellStart"/>
-      <w:r>
-        <w:t>configuracion_sistema</w:t>
-      </w:r>
-      <w:proofErr w:type="spellEnd"/>
-      <w:r>
-        <w:t>).</w:t>
-      </w:r>
-      <w:r>
-        <w:t xml:space="preserve"> Hay 5 en producción y </w:t>
-      </w:r>
-      <w:proofErr w:type="spellStart"/>
-      <w:r>
-        <w:t>bloqueos_horario</w:t>
-      </w:r>
-      <w:proofErr w:type="spellEnd"/>
-      <w:r>
-        <w:t xml:space="preserve"> y </w:t>
-      </w:r>
-      <w:proofErr w:type="spellStart"/>
-      <w:r>
-        <w:t>configuracion_sistema</w:t>
-      </w:r>
-      <w:proofErr w:type="spellEnd"/>
-      <w:r>
-        <w:t xml:space="preserve"> están pendientes a futuras actualizaciones. </w:t>
+        <w:t>) y tres de soporte (bloqueos_horario, notificaciones y configuracion_sistema).</w:t>
+      </w:r>
+      <w:r>
+        <w:t xml:space="preserve"> Hay 5 en producción y bloqueos_horario y configuracion_sistema están pendientes a futuras actualizaciones. </w:t>
       </w:r>
     </w:p>
     <w:p>
@@ -9093,7 +8530,6 @@
               <w:spacing w:line="264" w:lineRule="auto"/>
               <w:jc w:val="both"/>
             </w:pPr>
-            <w:proofErr w:type="spellStart"/>
             <w:r>
               <w:rPr>
                 <w:sz w:val="20"/>
@@ -9101,7 +8537,6 @@
               </w:rPr>
               <w:t>bloqueos_horario</w:t>
             </w:r>
-            <w:proofErr w:type="spellEnd"/>
           </w:p>
         </w:tc>
         <w:tc>
@@ -9195,23 +8630,7 @@
                 <w:sz w:val="20"/>
                 <w:szCs w:val="20"/>
               </w:rPr>
-              <w:t xml:space="preserve">Historial de notificaciones enviadas, con su tipo y si se entregaron por </w:t>
-            </w:r>
-            <w:proofErr w:type="spellStart"/>
-            <w:r>
-              <w:rPr>
-                <w:sz w:val="20"/>
-                <w:szCs w:val="20"/>
-              </w:rPr>
-              <w:t>push</w:t>
-            </w:r>
-            <w:proofErr w:type="spellEnd"/>
-            <w:r>
-              <w:rPr>
-                <w:sz w:val="20"/>
-                <w:szCs w:val="20"/>
-              </w:rPr>
-              <w:t>.</w:t>
+              <w:t>Historial de notificaciones enviadas, con su tipo y si se entregaron por push.</w:t>
             </w:r>
           </w:p>
         </w:tc>
@@ -9239,7 +8658,6 @@
               <w:spacing w:line="264" w:lineRule="auto"/>
               <w:jc w:val="both"/>
             </w:pPr>
-            <w:proofErr w:type="spellStart"/>
             <w:r>
               <w:rPr>
                 <w:sz w:val="20"/>
@@ -9247,7 +8665,6 @@
               </w:rPr>
               <w:t>configuracion_sistema</w:t>
             </w:r>
-            <w:proofErr w:type="spellEnd"/>
           </w:p>
         </w:tc>
         <w:tc>
@@ -10663,7 +10080,27 @@
             <w:sz w:val="22"/>
             <w:szCs w:val="22"/>
           </w:rPr>
-          <w:t>https://api.nacimiento.me/swagger-ui.html</w:t>
+          <w:t>https://api.nacimiento.</w:t>
+        </w:r>
+        <w:r>
+          <w:rPr>
+            <w:rStyle w:val="Hipervnculo"/>
+            <w:b w:val="0"/>
+            <w:bCs w:val="0"/>
+            <w:sz w:val="22"/>
+            <w:szCs w:val="22"/>
+          </w:rPr>
+          <w:t>m</w:t>
+        </w:r>
+        <w:r>
+          <w:rPr>
+            <w:rStyle w:val="Hipervnculo"/>
+            <w:b w:val="0"/>
+            <w:bCs w:val="0"/>
+            <w:sz w:val="22"/>
+            <w:szCs w:val="22"/>
+          </w:rPr>
+          <w:t>e/swagger-ui.html</w:t>
         </w:r>
       </w:hyperlink>
       <w:r>
@@ -10729,7 +10166,16 @@
       </w:r>
       <w:proofErr w:type="spellEnd"/>
       <w:r>
-        <w:t xml:space="preserve"> 3, con una identidad visual basada en el verde característico del tenis sobre tierra y una navegación clara mediante una barra inferior con cuatro secciones: Inicio, Reservas, Espera y Perfil. Cada pantalla mantiene un diseño coherente (cabeceras, tarjetas, botones de acción) y ofrece retroalimentación al usuario mediante mensajes emergentes (</w:t>
+        <w:t xml:space="preserve"> 3, con una identidad visual basada en una paleta verde oscuro con acentos en lima, que transmite dinamismo y conexión con el deporte</w:t>
+      </w:r>
+      <w:r>
+        <w:t>,</w:t>
+      </w:r>
+      <w:r>
+        <w:t xml:space="preserve"> </w:t>
+      </w:r>
+      <w:r>
+        <w:t>una barra inferior con cuatro secciones: Inicio, Reservas, Espera y Perfil. Cada pantalla mantiene un diseño coherente (cabeceras, tarjetas, botones de acción) y ofrece retroalimentación al usuario mediante mensajes emergentes (</w:t>
       </w:r>
       <w:proofErr w:type="spellStart"/>
       <w:r>
@@ -10892,23 +10338,7 @@
       </w:r>
       <w:proofErr w:type="spellEnd"/>
       <w:r>
-        <w:t xml:space="preserve">, renovado automáticamente. </w:t>
-      </w:r>
-      <w:proofErr w:type="spellStart"/>
-      <w:r>
-        <w:t>Nginx</w:t>
-      </w:r>
-      <w:proofErr w:type="spellEnd"/>
-      <w:r>
-        <w:t xml:space="preserve"> actúa como terminador TLS y reenvía las peticiones al </w:t>
-      </w:r>
-      <w:proofErr w:type="spellStart"/>
-      <w:r>
-        <w:t>backend</w:t>
-      </w:r>
-      <w:proofErr w:type="spellEnd"/>
-      <w:r>
-        <w:t xml:space="preserve"> con las cabeceras X-</w:t>
+        <w:t>, renovado automáticamente. Nginx actúa como terminador TLS y reenvía las peticiones al backend con las cabeceras X-</w:t>
       </w:r>
       <w:proofErr w:type="spellStart"/>
       <w:r>
@@ -10973,15 +10403,7 @@
         <w:jc w:val="both"/>
       </w:pPr>
       <w:r>
-        <w:t xml:space="preserve">Aunque el proyecto es individual y todas las tareas recaen sobre una misma persona, conceptualmente se han asumido distintos perfiles de desarrollo: analista (definición de requisitos y diseño), desarrollador </w:t>
-      </w:r>
-      <w:proofErr w:type="spellStart"/>
-      <w:r>
-        <w:t>backend</w:t>
-      </w:r>
-      <w:proofErr w:type="spellEnd"/>
-      <w:r>
-        <w:t>, desarrollador Android, administrador de sistemas (despliegue del VPS) y responsable de pruebas y documentación.</w:t>
+        <w:t>Aunque el proyecto es individual y todas las tareas recaen sobre una misma persona, conceptualmente se han asumido distintos perfiles de desarrollo: analista (definición de requisitos y diseño), desarrollador backend, desarrollador Android, administrador de sistemas (despliegue del VPS) y responsable de pruebas y documentación.</w:t>
       </w:r>
     </w:p>
     <w:p>
@@ -11348,23 +10770,7 @@
                 <w:sz w:val="20"/>
                 <w:szCs w:val="20"/>
               </w:rPr>
-              <w:t xml:space="preserve">Desarrollo del </w:t>
-            </w:r>
-            <w:proofErr w:type="spellStart"/>
-            <w:r>
-              <w:rPr>
-                <w:sz w:val="20"/>
-                <w:szCs w:val="20"/>
-              </w:rPr>
-              <w:t>backend</w:t>
-            </w:r>
-            <w:proofErr w:type="spellEnd"/>
-            <w:r>
-              <w:rPr>
-                <w:sz w:val="20"/>
-                <w:szCs w:val="20"/>
-              </w:rPr>
-              <w:t>: autenticación, pistas y reservas</w:t>
+              <w:t>Desarrollo del backend: autenticación, pistas y reservas</w:t>
             </w:r>
           </w:p>
         </w:tc>
@@ -11604,23 +11010,7 @@
                 <w:sz w:val="20"/>
                 <w:szCs w:val="20"/>
               </w:rPr>
-              <w:t xml:space="preserve">Notificaciones </w:t>
-            </w:r>
-            <w:proofErr w:type="spellStart"/>
-            <w:r>
-              <w:rPr>
-                <w:sz w:val="20"/>
-                <w:szCs w:val="20"/>
-              </w:rPr>
-              <w:t>push</w:t>
-            </w:r>
-            <w:proofErr w:type="spellEnd"/>
-            <w:r>
-              <w:rPr>
-                <w:sz w:val="20"/>
-                <w:szCs w:val="20"/>
-              </w:rPr>
-              <w:t xml:space="preserve"> (FCM) y despliegue en producción</w:t>
+              <w:t>Notificaciones push (FCM) y despliegue en producción</w:t>
             </w:r>
           </w:p>
         </w:tc>
@@ -11768,23 +11158,7 @@
                 <w:sz w:val="20"/>
                 <w:szCs w:val="20"/>
               </w:rPr>
-              <w:t xml:space="preserve">Refinamiento final del </w:t>
-            </w:r>
-            <w:proofErr w:type="spellStart"/>
-            <w:r>
-              <w:rPr>
-                <w:sz w:val="20"/>
-                <w:szCs w:val="20"/>
-              </w:rPr>
-              <w:t>backend</w:t>
-            </w:r>
-            <w:proofErr w:type="spellEnd"/>
-            <w:r>
-              <w:rPr>
-                <w:sz w:val="20"/>
-                <w:szCs w:val="20"/>
-              </w:rPr>
-              <w:t xml:space="preserve"> (rotación automática, </w:t>
+              <w:t xml:space="preserve">Refinamiento final del backend (rotación automática, </w:t>
             </w:r>
             <w:proofErr w:type="spellStart"/>
             <w:r>
@@ -11878,15 +11252,7 @@
         <w:jc w:val="both"/>
       </w:pPr>
       <w:r>
-        <w:t xml:space="preserve">La siguiente tabla resume el </w:t>
-      </w:r>
-      <w:proofErr w:type="spellStart"/>
-      <w:r>
-        <w:t>stack</w:t>
-      </w:r>
-      <w:proofErr w:type="spellEnd"/>
-      <w:r>
-        <w:t xml:space="preserve"> tecnológico realmente empleado en la versión final del proyecto:</w:t>
+        <w:t>La siguiente tabla resume el stack tecnológico realmente empleado en la versión final del proyecto:</w:t>
       </w:r>
     </w:p>
     <w:tbl>
@@ -12075,47 +11441,13 @@
               <w:spacing w:line="264" w:lineRule="auto"/>
               <w:jc w:val="both"/>
             </w:pPr>
-            <w:proofErr w:type="spellStart"/>
-            <w:r>
-              <w:rPr>
-                <w:sz w:val="20"/>
-                <w:szCs w:val="20"/>
-              </w:rPr>
-              <w:t>Kotlin</w:t>
-            </w:r>
-            <w:proofErr w:type="spellEnd"/>
-            <w:r>
-              <w:rPr>
-                <w:sz w:val="20"/>
-                <w:szCs w:val="20"/>
-              </w:rPr>
-              <w:t xml:space="preserve"> + </w:t>
-            </w:r>
-            <w:proofErr w:type="spellStart"/>
-            <w:r>
-              <w:rPr>
-                <w:sz w:val="20"/>
-                <w:szCs w:val="20"/>
-              </w:rPr>
-              <w:t>Jetpack</w:t>
-            </w:r>
-            <w:proofErr w:type="spellEnd"/>
-            <w:r>
-              <w:rPr>
-                <w:sz w:val="20"/>
-                <w:szCs w:val="20"/>
-              </w:rPr>
-              <w:t xml:space="preserve"> </w:t>
-            </w:r>
-            <w:proofErr w:type="spellStart"/>
-            <w:r>
-              <w:rPr>
-                <w:sz w:val="20"/>
-                <w:szCs w:val="20"/>
-              </w:rPr>
-              <w:t>Compose</w:t>
-            </w:r>
-            <w:proofErr w:type="spellEnd"/>
+            <w:r>
+              <w:rPr>
+                <w:sz w:val="20"/>
+                <w:szCs w:val="20"/>
+              </w:rPr>
+              <w:t>Kotlin + Jetpack Compose</w:t>
+            </w:r>
           </w:p>
         </w:tc>
         <w:tc>
@@ -12854,17 +12186,8 @@
                 <w:sz w:val="20"/>
                 <w:szCs w:val="20"/>
               </w:rPr>
-              <w:t xml:space="preserve"> + </w:t>
-            </w:r>
-            <w:proofErr w:type="spellStart"/>
-            <w:r>
-              <w:rPr>
-                <w:sz w:val="20"/>
-                <w:szCs w:val="20"/>
-              </w:rPr>
-              <w:t>Compose</w:t>
-            </w:r>
-            <w:proofErr w:type="spellEnd"/>
+              <w:t xml:space="preserve"> + Compose</w:t>
+            </w:r>
           </w:p>
         </w:tc>
         <w:tc>
@@ -12962,39 +12285,7 @@
                 <w:sz w:val="20"/>
                 <w:szCs w:val="20"/>
               </w:rPr>
-              <w:t xml:space="preserve">Spring </w:t>
-            </w:r>
-            <w:proofErr w:type="spellStart"/>
-            <w:r>
-              <w:rPr>
-                <w:sz w:val="20"/>
-                <w:szCs w:val="20"/>
-              </w:rPr>
-              <w:t>Boot</w:t>
-            </w:r>
-            <w:proofErr w:type="spellEnd"/>
-            <w:r>
-              <w:rPr>
-                <w:sz w:val="20"/>
-                <w:szCs w:val="20"/>
-              </w:rPr>
-              <w:t xml:space="preserve"> 3.5 (</w:t>
-            </w:r>
-            <w:proofErr w:type="spellStart"/>
-            <w:r>
-              <w:rPr>
-                <w:sz w:val="20"/>
-                <w:szCs w:val="20"/>
-              </w:rPr>
-              <w:t>Kotlin</w:t>
-            </w:r>
-            <w:proofErr w:type="spellEnd"/>
-            <w:r>
-              <w:rPr>
-                <w:sz w:val="20"/>
-                <w:szCs w:val="20"/>
-              </w:rPr>
-              <w:t>)</w:t>
+              <w:t>Spring Boot 3.5 (Kotlin)</w:t>
             </w:r>
           </w:p>
         </w:tc>
@@ -13184,17 +12475,8 @@
                 <w:sz w:val="20"/>
                 <w:szCs w:val="20"/>
               </w:rPr>
-              <w:t xml:space="preserve">Spring Data JPA + </w:t>
-            </w:r>
-            <w:proofErr w:type="spellStart"/>
-            <w:r>
-              <w:rPr>
-                <w:sz w:val="20"/>
-                <w:szCs w:val="20"/>
-              </w:rPr>
-              <w:t>Hibernate</w:t>
-            </w:r>
-            <w:proofErr w:type="spellEnd"/>
+              <w:t>Spring Data JPA + Hibernate</w:t>
+            </w:r>
           </w:p>
         </w:tc>
         <w:tc>
@@ -13396,13 +12678,20 @@
               <w:spacing w:line="264" w:lineRule="auto"/>
               <w:jc w:val="both"/>
             </w:pPr>
+            <w:r>
+              <w:rPr>
+                <w:sz w:val="20"/>
+                <w:szCs w:val="20"/>
+              </w:rPr>
+              <w:t xml:space="preserve">Firebase </w:t>
+            </w:r>
             <w:proofErr w:type="spellStart"/>
             <w:r>
               <w:rPr>
                 <w:sz w:val="20"/>
                 <w:szCs w:val="20"/>
               </w:rPr>
-              <w:t>Firebase</w:t>
+              <w:t>Admin</w:t>
             </w:r>
             <w:proofErr w:type="spellEnd"/>
             <w:r>
@@ -13410,22 +12699,6 @@
                 <w:sz w:val="20"/>
                 <w:szCs w:val="20"/>
               </w:rPr>
-              <w:t xml:space="preserve"> </w:t>
-            </w:r>
-            <w:proofErr w:type="spellStart"/>
-            <w:r>
-              <w:rPr>
-                <w:sz w:val="20"/>
-                <w:szCs w:val="20"/>
-              </w:rPr>
-              <w:t>Admin</w:t>
-            </w:r>
-            <w:proofErr w:type="spellEnd"/>
-            <w:r>
-              <w:rPr>
-                <w:sz w:val="20"/>
-                <w:szCs w:val="20"/>
-              </w:rPr>
               <w:t xml:space="preserve"> SDK</w:t>
             </w:r>
           </w:p>
@@ -13457,23 +12730,7 @@
                 <w:sz w:val="20"/>
                 <w:szCs w:val="20"/>
               </w:rPr>
-              <w:t xml:space="preserve">Envío de notificaciones </w:t>
-            </w:r>
-            <w:proofErr w:type="spellStart"/>
-            <w:r>
-              <w:rPr>
-                <w:sz w:val="20"/>
-                <w:szCs w:val="20"/>
-              </w:rPr>
-              <w:t>push</w:t>
-            </w:r>
-            <w:proofErr w:type="spellEnd"/>
-            <w:r>
-              <w:rPr>
-                <w:sz w:val="20"/>
-                <w:szCs w:val="20"/>
-              </w:rPr>
-              <w:t>.</w:t>
+              <w:t>Envío de notificaciones push.</w:t>
             </w:r>
           </w:p>
         </w:tc>
@@ -13884,21 +13141,12 @@
               <w:spacing w:line="264" w:lineRule="auto"/>
               <w:jc w:val="both"/>
             </w:pPr>
-            <w:proofErr w:type="spellStart"/>
-            <w:r>
-              <w:rPr>
-                <w:sz w:val="20"/>
-                <w:szCs w:val="20"/>
-              </w:rPr>
-              <w:t>Nginx</w:t>
-            </w:r>
-            <w:proofErr w:type="spellEnd"/>
-            <w:r>
-              <w:rPr>
-                <w:sz w:val="20"/>
-                <w:szCs w:val="20"/>
-              </w:rPr>
-              <w:t xml:space="preserve"> + </w:t>
+            <w:r>
+              <w:rPr>
+                <w:sz w:val="20"/>
+                <w:szCs w:val="20"/>
+              </w:rPr>
+              <w:t xml:space="preserve">Nginx + </w:t>
             </w:r>
             <w:proofErr w:type="spellStart"/>
             <w:r>
@@ -14124,31 +13372,13 @@
               <w:spacing w:line="264" w:lineRule="auto"/>
               <w:jc w:val="both"/>
             </w:pPr>
-            <w:proofErr w:type="spellStart"/>
-            <w:r>
-              <w:rPr>
-                <w:sz w:val="20"/>
-                <w:szCs w:val="20"/>
-              </w:rPr>
-              <w:t>Firebase</w:t>
-            </w:r>
-            <w:proofErr w:type="spellEnd"/>
-            <w:r>
-              <w:rPr>
-                <w:sz w:val="20"/>
-                <w:szCs w:val="20"/>
-              </w:rPr>
-              <w:t xml:space="preserve"> Cloud </w:t>
-            </w:r>
-            <w:proofErr w:type="spellStart"/>
-            <w:r>
-              <w:rPr>
-                <w:sz w:val="20"/>
-                <w:szCs w:val="20"/>
-              </w:rPr>
-              <w:t>Messaging</w:t>
-            </w:r>
-            <w:proofErr w:type="spellEnd"/>
+            <w:r>
+              <w:rPr>
+                <w:sz w:val="20"/>
+                <w:szCs w:val="20"/>
+              </w:rPr>
+              <w:t>Firebase Cloud Messaging</w:t>
+            </w:r>
           </w:p>
         </w:tc>
         <w:tc>
@@ -14178,23 +13408,7 @@
                 <w:sz w:val="20"/>
                 <w:szCs w:val="20"/>
               </w:rPr>
-              <w:t xml:space="preserve">Canal de notificaciones </w:t>
-            </w:r>
-            <w:proofErr w:type="spellStart"/>
-            <w:r>
-              <w:rPr>
-                <w:sz w:val="20"/>
-                <w:szCs w:val="20"/>
-              </w:rPr>
-              <w:t>push</w:t>
-            </w:r>
-            <w:proofErr w:type="spellEnd"/>
-            <w:r>
-              <w:rPr>
-                <w:sz w:val="20"/>
-                <w:szCs w:val="20"/>
-              </w:rPr>
-              <w:t>.</w:t>
+              <w:t>Canal de notificaciones push.</w:t>
             </w:r>
           </w:p>
         </w:tc>
@@ -14303,23 +13517,7 @@
                 <w:sz w:val="20"/>
                 <w:szCs w:val="20"/>
               </w:rPr>
-              <w:t xml:space="preserve">Gestión del servicio del </w:t>
-            </w:r>
-            <w:proofErr w:type="spellStart"/>
-            <w:r>
-              <w:rPr>
-                <w:sz w:val="20"/>
-                <w:szCs w:val="20"/>
-              </w:rPr>
-              <w:t>backend</w:t>
-            </w:r>
-            <w:proofErr w:type="spellEnd"/>
-            <w:r>
-              <w:rPr>
-                <w:sz w:val="20"/>
-                <w:szCs w:val="20"/>
-              </w:rPr>
-              <w:t>: arranque automático y reinicio en caso de caída.</w:t>
+              <w:t>Gestión del servicio del backend: arranque automático y reinicio en caso de caída.</w:t>
             </w:r>
           </w:p>
         </w:tc>
@@ -14527,55 +13725,7 @@
                 <w:sz w:val="20"/>
                 <w:szCs w:val="20"/>
               </w:rPr>
-              <w:t xml:space="preserve">Entorno de desarrollo del </w:t>
-            </w:r>
-            <w:proofErr w:type="spellStart"/>
-            <w:r>
-              <w:rPr>
-                <w:sz w:val="20"/>
-                <w:szCs w:val="20"/>
-              </w:rPr>
-              <w:t>backend</w:t>
-            </w:r>
-            <w:proofErr w:type="spellEnd"/>
-            <w:r>
-              <w:rPr>
-                <w:sz w:val="20"/>
-                <w:szCs w:val="20"/>
-              </w:rPr>
-              <w:t xml:space="preserve"> (Spring </w:t>
-            </w:r>
-            <w:proofErr w:type="spellStart"/>
-            <w:r>
-              <w:rPr>
-                <w:sz w:val="20"/>
-                <w:szCs w:val="20"/>
-              </w:rPr>
-              <w:t>Boot</w:t>
-            </w:r>
-            <w:proofErr w:type="spellEnd"/>
-            <w:r>
-              <w:rPr>
-                <w:sz w:val="20"/>
-                <w:szCs w:val="20"/>
-              </w:rPr>
-              <w:t xml:space="preserve">, </w:t>
-            </w:r>
-            <w:proofErr w:type="spellStart"/>
-            <w:r>
-              <w:rPr>
-                <w:sz w:val="20"/>
-                <w:szCs w:val="20"/>
-              </w:rPr>
-              <w:t>Kotlin</w:t>
-            </w:r>
-            <w:proofErr w:type="spellEnd"/>
-            <w:r>
-              <w:rPr>
-                <w:sz w:val="20"/>
-                <w:szCs w:val="20"/>
-              </w:rPr>
-              <w:t>).</w:t>
+              <w:t>Entorno de desarrollo del backend (Spring Boot, Kotlin).</w:t>
             </w:r>
           </w:p>
         </w:tc>
@@ -14679,39 +13829,7 @@
                 <w:sz w:val="20"/>
                 <w:szCs w:val="20"/>
               </w:rPr>
-              <w:t>Entorno de desarrollo del cliente Android (</w:t>
-            </w:r>
-            <w:proofErr w:type="spellStart"/>
-            <w:r>
-              <w:rPr>
-                <w:sz w:val="20"/>
-                <w:szCs w:val="20"/>
-              </w:rPr>
-              <w:t>Kotlin</w:t>
-            </w:r>
-            <w:proofErr w:type="spellEnd"/>
-            <w:r>
-              <w:rPr>
-                <w:sz w:val="20"/>
-                <w:szCs w:val="20"/>
-              </w:rPr>
-              <w:t xml:space="preserve">, </w:t>
-            </w:r>
-            <w:proofErr w:type="spellStart"/>
-            <w:r>
-              <w:rPr>
-                <w:sz w:val="20"/>
-                <w:szCs w:val="20"/>
-              </w:rPr>
-              <w:t>Compose</w:t>
-            </w:r>
-            <w:proofErr w:type="spellEnd"/>
-            <w:r>
-              <w:rPr>
-                <w:sz w:val="20"/>
-                <w:szCs w:val="20"/>
-              </w:rPr>
-              <w:t>).</w:t>
+              <w:t>Entorno de desarrollo del cliente Android (Kotlin, Compose).</w:t>
             </w:r>
           </w:p>
         </w:tc>
@@ -14905,9 +14023,16 @@
                 <w:sz w:val="20"/>
                 <w:szCs w:val="20"/>
               </w:rPr>
-              <w:t>Mockito-Kotlin</w:t>
+              <w:t>Mockito</w:t>
             </w:r>
             <w:proofErr w:type="spellEnd"/>
+            <w:r>
+              <w:rPr>
+                <w:sz w:val="20"/>
+                <w:szCs w:val="20"/>
+              </w:rPr>
+              <w:t>-Kotlin</w:t>
+            </w:r>
           </w:p>
         </w:tc>
         <w:tc>
@@ -14941,23 +14066,7 @@
                 <w:sz w:val="20"/>
                 <w:szCs w:val="20"/>
               </w:rPr>
-              <w:t xml:space="preserve">Pruebas unitarias automatizadas del </w:t>
-            </w:r>
-            <w:proofErr w:type="spellStart"/>
-            <w:r>
-              <w:rPr>
-                <w:sz w:val="20"/>
-                <w:szCs w:val="20"/>
-              </w:rPr>
-              <w:t>backend</w:t>
-            </w:r>
-            <w:proofErr w:type="spellEnd"/>
-            <w:r>
-              <w:rPr>
-                <w:sz w:val="20"/>
-                <w:szCs w:val="20"/>
-              </w:rPr>
-              <w:t>.</w:t>
+              <w:t>Pruebas unitarias automatizadas del backend.</w:t>
             </w:r>
           </w:p>
         </w:tc>
@@ -14986,78 +14095,54 @@
         <w:jc w:val="both"/>
       </w:pPr>
       <w:r>
-        <w:t xml:space="preserve">El repositorio se organiza en dos aplicaciones independientes: el </w:t>
+        <w:t xml:space="preserve">El repositorio se organiza en dos aplicaciones independientes: el backend (Spring Boot) y el cliente Android, además de una carpeta de documentación con los diagramas y los </w:t>
       </w:r>
       <w:proofErr w:type="spellStart"/>
       <w:r>
-        <w:t>backend</w:t>
+        <w:t>wireframes</w:t>
       </w:r>
       <w:proofErr w:type="spellEnd"/>
       <w:r>
-        <w:t xml:space="preserve"> (Spring </w:t>
+        <w:t xml:space="preserve">. El cliente Android sigue la estructura de paquetes propia de </w:t>
       </w:r>
       <w:proofErr w:type="spellStart"/>
       <w:r>
-        <w:t>Boot</w:t>
+        <w:t>Clean</w:t>
       </w:r>
       <w:proofErr w:type="spellEnd"/>
       <w:r>
-        <w:t xml:space="preserve">) y el cliente Android, además de una carpeta de documentación con los diagramas y los </w:t>
+        <w:t xml:space="preserve"> </w:t>
       </w:r>
       <w:proofErr w:type="spellStart"/>
       <w:r>
-        <w:t>wireframes</w:t>
+        <w:t>Architecture</w:t>
       </w:r>
       <w:proofErr w:type="spellEnd"/>
       <w:r>
-        <w:t xml:space="preserve">. El cliente Android sigue la estructura de paquetes propia de </w:t>
+        <w:t xml:space="preserve"> (data, </w:t>
       </w:r>
       <w:proofErr w:type="spellStart"/>
       <w:r>
-        <w:t>Clean</w:t>
+        <w:t>domain</w:t>
       </w:r>
       <w:proofErr w:type="spellEnd"/>
       <w:r>
-        <w:t xml:space="preserve"> </w:t>
+        <w:t xml:space="preserve">, </w:t>
       </w:r>
       <w:proofErr w:type="spellStart"/>
       <w:r>
-        <w:t>Architecture</w:t>
+        <w:t>presentation</w:t>
       </w:r>
       <w:proofErr w:type="spellEnd"/>
       <w:r>
-        <w:t xml:space="preserve"> (data, </w:t>
+        <w:t xml:space="preserve">), mientras que el backend separa controladores, servicios, repositorios, entidades y </w:t>
       </w:r>
       <w:proofErr w:type="spellStart"/>
       <w:r>
-        <w:t>domain</w:t>
+        <w:t>DTOs</w:t>
       </w:r>
       <w:proofErr w:type="spellEnd"/>
       <w:r>
-        <w:t xml:space="preserve">, </w:t>
-      </w:r>
-      <w:proofErr w:type="spellStart"/>
-      <w:r>
-        <w:t>presentation</w:t>
-      </w:r>
-      <w:proofErr w:type="spellEnd"/>
-      <w:r>
-        <w:t xml:space="preserve">), mientras que el </w:t>
-      </w:r>
-      <w:proofErr w:type="spellStart"/>
-      <w:r>
-        <w:t>backend</w:t>
-      </w:r>
-      <w:proofErr w:type="spellEnd"/>
-      <w:r>
-        <w:t xml:space="preserve"> separa controladores, servicios, repositorios, entidades y </w:t>
-      </w:r>
-      <w:proofErr w:type="spellStart"/>
-      <w:r>
-        <w:t>DTOs</w:t>
-      </w:r>
-      <w:proofErr w:type="spellEnd"/>
-      <w:r>
         <w:t>.</w:t>
       </w:r>
     </w:p>
@@ -15067,23 +14152,7 @@
         <w:jc w:val="both"/>
       </w:pPr>
       <w:r>
-        <w:t xml:space="preserve">El </w:t>
-      </w:r>
-      <w:proofErr w:type="spellStart"/>
-      <w:r>
-        <w:t>backend</w:t>
-      </w:r>
-      <w:proofErr w:type="spellEnd"/>
-      <w:r>
-        <w:t xml:space="preserve"> se ha desarrollado con IntelliJ IDEA y el cliente Android con Android Studio, ambos en </w:t>
-      </w:r>
-      <w:proofErr w:type="spellStart"/>
-      <w:r>
-        <w:t>Kotlin</w:t>
-      </w:r>
-      <w:proofErr w:type="spellEnd"/>
-      <w:r>
-        <w:t>. Durante el desarrollo, la base de datos PostgreSQL se ejecuta en un contenedor Docker en la máquina local, lo que proporciona un entorno reproducible y aislado, mientras que en producción PostgreSQL está instalado de forma nativa en el servidor. Esta separación entre el entorno de desarrollo y el de producción es una práctica habitual en el desarrollo profesional.</w:t>
+        <w:t>El backend se ha desarrollado con IntelliJ IDEA y el cliente Android con Android Studio, ambos en Kotlin. Durante el desarrollo, la base de datos PostgreSQL se ejecuta en un contenedor Docker en la máquina local, lo que proporciona un entorno reproducible y aislado, mientras que en producción PostgreSQL está instalado de forma nativa en el servidor. Esta separación entre el entorno de desarrollo y el de producción es una práctica habitual en el desarrollo profesional.</w:t>
       </w:r>
     </w:p>
     <w:p>
@@ -15193,10 +14262,13 @@
           <w:sz w:val="22"/>
           <w:szCs w:val="22"/>
         </w:rPr>
-        <w:t xml:space="preserve">Una de las funcionalidades diferenciadoras de </w:t>
-      </w:r>
-      <w:proofErr w:type="spellStart"/>
-      <w:r>
+        <w:t>Una de las funcionalidades diferenciadoras de PistaGO es la lista de espera. Cuando una franja está ocupada, el usuario puede unirse a una cola. La posición de cada usuario no se almacena como un valor fijo, sino que se calcula dinámicamente en cada consulta ordenando por la fecha de incorporación a la cola. Esto evita inconsistencias: cuando un usuario abandona la lista, el resto avanza automáticamente sin necesidad de actualizar registros.</w:t>
+      </w:r>
+    </w:p>
+    <w:p>
+      <w:pPr>
+        <w:pStyle w:val="Ttulo3"/>
+        <w:jc w:val="both"/>
         <w:rPr>
           <w:b w:val="0"/>
           <w:bCs w:val="0"/>
@@ -15204,9 +14276,7 @@
           <w:sz w:val="22"/>
           <w:szCs w:val="22"/>
         </w:rPr>
-        <w:t>PistaGO</w:t>
-      </w:r>
-      <w:proofErr w:type="spellEnd"/>
+      </w:pPr>
       <w:r>
         <w:rPr>
           <w:b w:val="0"/>
@@ -15215,8 +14285,18 @@
           <w:sz w:val="22"/>
           <w:szCs w:val="22"/>
         </w:rPr>
-        <w:t xml:space="preserve"> es la lista de espera. Cuando una franja está ocupada, el usuario puede unirse a una cola. La posición de cada usuario no se almacena como un valor fijo, sino que se calcula dinámicamente en cada consulta ordenando por la fecha de incorporación a la cola. Esto evita inconsistencias: cuando un usuario abandona la lista, el resto avanza automáticamente sin necesidad de actualizar registros.</w:t>
-      </w:r>
+        <w:t>Además, el sistema garantiza que la cola no se quede bloqueada si el primer usuario notificado no confirma la reserva en su plazo. Una tarea programada con @Scheduled se ejecuta en el backend cada 30 segundos, detecta las entradas cuyo plazo de confirmación ha expirado, las elimina de la cola y notifica automáticamente al siguiente usuario disponible. Esta rotación automática es transparente para el usuario y demuestra la capacidad del backend para reaccionar a eventos temporales sin intervención externa.</w:t>
+      </w:r>
+    </w:p>
+    <w:p>
+      <w:pPr>
+        <w:pStyle w:val="Ttulo3"/>
+        <w:jc w:val="both"/>
+      </w:pPr>
+      <w:r>
+        <w:t>Notificaciones push (FCM)</w:t>
+      </w:r>
+      <w:bookmarkEnd w:id="32"/>
     </w:p>
     <w:p>
       <w:pPr>
@@ -15230,6 +14310,7 @@
           <w:szCs w:val="22"/>
         </w:rPr>
       </w:pPr>
+      <w:bookmarkStart w:id="33" w:name="_Toc230535753"/>
       <w:r>
         <w:rPr>
           <w:b w:val="0"/>
@@ -15238,203 +14319,7 @@
           <w:sz w:val="22"/>
           <w:szCs w:val="22"/>
         </w:rPr>
-        <w:t xml:space="preserve">Además, el sistema garantiza que la cola no se quede bloqueada si el primer usuario notificado no confirma la reserva en su plazo. Una tarea programada con @Scheduled se ejecuta en el </w:t>
-      </w:r>
-      <w:proofErr w:type="spellStart"/>
-      <w:r>
-        <w:rPr>
-          <w:b w:val="0"/>
-          <w:bCs w:val="0"/>
-          <w:color w:val="auto"/>
-          <w:sz w:val="22"/>
-          <w:szCs w:val="22"/>
-        </w:rPr>
-        <w:t>backend</w:t>
-      </w:r>
-      <w:proofErr w:type="spellEnd"/>
-      <w:r>
-        <w:rPr>
-          <w:b w:val="0"/>
-          <w:bCs w:val="0"/>
-          <w:color w:val="auto"/>
-          <w:sz w:val="22"/>
-          <w:szCs w:val="22"/>
-        </w:rPr>
-        <w:t xml:space="preserve"> cada 30 segundos, detecta las entradas cuyo plazo de confirmación ha expirado, las elimina de la cola y notifica automáticamente al siguiente usuario disponible. Esta rotación automática es transparente para el usuario y demuestra la capacidad del </w:t>
-      </w:r>
-      <w:proofErr w:type="spellStart"/>
-      <w:r>
-        <w:rPr>
-          <w:b w:val="0"/>
-          <w:bCs w:val="0"/>
-          <w:color w:val="auto"/>
-          <w:sz w:val="22"/>
-          <w:szCs w:val="22"/>
-        </w:rPr>
-        <w:t>backend</w:t>
-      </w:r>
-      <w:proofErr w:type="spellEnd"/>
-      <w:r>
-        <w:rPr>
-          <w:b w:val="0"/>
-          <w:bCs w:val="0"/>
-          <w:color w:val="auto"/>
-          <w:sz w:val="22"/>
-          <w:szCs w:val="22"/>
-        </w:rPr>
-        <w:t xml:space="preserve"> para reaccionar a eventos temporales sin intervención externa.</w:t>
-      </w:r>
-    </w:p>
-    <w:p>
-      <w:pPr>
-        <w:pStyle w:val="Ttulo3"/>
-        <w:jc w:val="both"/>
-      </w:pPr>
-      <w:r>
-        <w:t xml:space="preserve">Notificaciones </w:t>
-      </w:r>
-      <w:proofErr w:type="spellStart"/>
-      <w:r>
-        <w:t>push</w:t>
-      </w:r>
-      <w:proofErr w:type="spellEnd"/>
-      <w:r>
-        <w:t xml:space="preserve"> (FCM)</w:t>
-      </w:r>
-      <w:bookmarkEnd w:id="32"/>
-    </w:p>
-    <w:p>
-      <w:pPr>
-        <w:pStyle w:val="Ttulo3"/>
-        <w:jc w:val="both"/>
-        <w:rPr>
-          <w:b w:val="0"/>
-          <w:bCs w:val="0"/>
-          <w:color w:val="auto"/>
-          <w:sz w:val="22"/>
-          <w:szCs w:val="22"/>
-        </w:rPr>
-      </w:pPr>
-      <w:bookmarkStart w:id="33" w:name="_Toc230535753"/>
-      <w:r>
-        <w:rPr>
-          <w:b w:val="0"/>
-          <w:bCs w:val="0"/>
-          <w:color w:val="auto"/>
-          <w:sz w:val="22"/>
-          <w:szCs w:val="22"/>
-        </w:rPr>
-        <w:t xml:space="preserve">El sistema utiliza </w:t>
-      </w:r>
-      <w:proofErr w:type="spellStart"/>
-      <w:r>
-        <w:rPr>
-          <w:b w:val="0"/>
-          <w:bCs w:val="0"/>
-          <w:color w:val="auto"/>
-          <w:sz w:val="22"/>
-          <w:szCs w:val="22"/>
-        </w:rPr>
-        <w:t>Firebase</w:t>
-      </w:r>
-      <w:proofErr w:type="spellEnd"/>
-      <w:r>
-        <w:rPr>
-          <w:b w:val="0"/>
-          <w:bCs w:val="0"/>
-          <w:color w:val="auto"/>
-          <w:sz w:val="22"/>
-          <w:szCs w:val="22"/>
-        </w:rPr>
-        <w:t xml:space="preserve"> Cloud </w:t>
-      </w:r>
-      <w:proofErr w:type="spellStart"/>
-      <w:r>
-        <w:rPr>
-          <w:b w:val="0"/>
-          <w:bCs w:val="0"/>
-          <w:color w:val="auto"/>
-          <w:sz w:val="22"/>
-          <w:szCs w:val="22"/>
-        </w:rPr>
-        <w:t>Messaging</w:t>
-      </w:r>
-      <w:proofErr w:type="spellEnd"/>
-      <w:r>
-        <w:rPr>
-          <w:b w:val="0"/>
-          <w:bCs w:val="0"/>
-          <w:color w:val="auto"/>
-          <w:sz w:val="22"/>
-          <w:szCs w:val="22"/>
-        </w:rPr>
-        <w:t xml:space="preserve"> para enviar notificaciones </w:t>
-      </w:r>
-      <w:proofErr w:type="spellStart"/>
-      <w:r>
-        <w:rPr>
-          <w:b w:val="0"/>
-          <w:bCs w:val="0"/>
-          <w:color w:val="auto"/>
-          <w:sz w:val="22"/>
-          <w:szCs w:val="22"/>
-        </w:rPr>
-        <w:t>push</w:t>
-      </w:r>
-      <w:proofErr w:type="spellEnd"/>
-      <w:r>
-        <w:rPr>
-          <w:b w:val="0"/>
-          <w:bCs w:val="0"/>
-          <w:color w:val="auto"/>
-          <w:sz w:val="22"/>
-          <w:szCs w:val="22"/>
-        </w:rPr>
-        <w:t xml:space="preserve"> en dos escenarios distintos. El primero: cuando se cancela una reserva, el </w:t>
-      </w:r>
-      <w:proofErr w:type="spellStart"/>
-      <w:r>
-        <w:rPr>
-          <w:b w:val="0"/>
-          <w:bCs w:val="0"/>
-          <w:color w:val="auto"/>
-          <w:sz w:val="22"/>
-          <w:szCs w:val="22"/>
-        </w:rPr>
-        <w:t>backend</w:t>
-      </w:r>
-      <w:proofErr w:type="spellEnd"/>
-      <w:r>
-        <w:rPr>
-          <w:b w:val="0"/>
-          <w:bCs w:val="0"/>
-          <w:color w:val="auto"/>
-          <w:sz w:val="22"/>
-          <w:szCs w:val="22"/>
-        </w:rPr>
-        <w:t xml:space="preserve"> busca al primer usuario de la lista de espera de esa franja que aún no haya sido avisado y le envía un </w:t>
-      </w:r>
-      <w:proofErr w:type="spellStart"/>
-      <w:r>
-        <w:rPr>
-          <w:b w:val="0"/>
-          <w:bCs w:val="0"/>
-          <w:color w:val="auto"/>
-          <w:sz w:val="22"/>
-          <w:szCs w:val="22"/>
-        </w:rPr>
-        <w:t>push</w:t>
-      </w:r>
-      <w:proofErr w:type="spellEnd"/>
-      <w:r>
-        <w:rPr>
-          <w:b w:val="0"/>
-          <w:bCs w:val="0"/>
-          <w:color w:val="auto"/>
-          <w:sz w:val="22"/>
-          <w:szCs w:val="22"/>
-        </w:rPr>
-        <w:t xml:space="preserve"> </w:t>
+        <w:t xml:space="preserve">El sistema utiliza Firebase Cloud Messaging para enviar notificaciones push en dos escenarios distintos. El primero: cuando se cancela una reserva, el backend busca al primer usuario de la lista de espera de esa franja que aún no haya sido avisado y le envía un push </w:t>
       </w:r>
       <w:r>
         <w:rPr>
@@ -15445,29 +14330,7 @@
           <w:szCs w:val="22"/>
         </w:rPr>
         <w:lastRenderedPageBreak/>
-        <w:t xml:space="preserve">mediante el </w:t>
-      </w:r>
-      <w:proofErr w:type="spellStart"/>
-      <w:r>
-        <w:rPr>
-          <w:b w:val="0"/>
-          <w:bCs w:val="0"/>
-          <w:color w:val="auto"/>
-          <w:sz w:val="22"/>
-          <w:szCs w:val="22"/>
-        </w:rPr>
-        <w:t>Firebase</w:t>
-      </w:r>
-      <w:proofErr w:type="spellEnd"/>
-      <w:r>
-        <w:rPr>
-          <w:b w:val="0"/>
-          <w:bCs w:val="0"/>
-          <w:color w:val="auto"/>
-          <w:sz w:val="22"/>
-          <w:szCs w:val="22"/>
-        </w:rPr>
-        <w:t xml:space="preserve"> </w:t>
+        <w:t xml:space="preserve">mediante el Firebase </w:t>
       </w:r>
       <w:proofErr w:type="spellStart"/>
       <w:r>
@@ -15489,10 +14352,407 @@
           <w:sz w:val="22"/>
           <w:szCs w:val="22"/>
         </w:rPr>
-        <w:t xml:space="preserve"> SDK; el usuario queda marcado como notificado con una ventana temporal y la notificación se registra en el historial. El segundo: cuando un administrador cancela una reserva de la que no es propietario, el usuario afectado recibe un </w:t>
+        <w:t xml:space="preserve"> SDK; el usuario queda marcado como notificado con una ventana temporal y la notificación se registra en el historial. El segundo: cuando un administrador cancela una reserva de la que no es propietario, el usuario afectado recibe un push avisándole de la cancelación, lo que cierra el círculo de comunicación entre la gestión del club y el socio. Esta funcionalidad demuestra la comunicación en red asíncrona y la integración con servicios externos, competencias del módulo de Programación de Servicios y Procesos.</w:t>
+      </w:r>
+    </w:p>
+    <w:p>
+      <w:pPr>
+        <w:pStyle w:val="Ttulo3"/>
+        <w:jc w:val="both"/>
+      </w:pPr>
+      <w:r>
+        <w:t>Gestión del perfil</w:t>
+      </w:r>
+      <w:bookmarkEnd w:id="33"/>
+    </w:p>
+    <w:p>
+      <w:pPr>
+        <w:spacing w:after="120" w:line="276" w:lineRule="auto"/>
+        <w:jc w:val="both"/>
+      </w:pPr>
+      <w:r>
+        <w:t xml:space="preserve">El usuario puede editar su nombre y teléfono, cambiar su contraseña (con verificación de la actual) y subir una foto de perfil. La foto se envía al backend mediante una petición </w:t>
       </w:r>
       <w:proofErr w:type="spellStart"/>
       <w:r>
+        <w:t>multipart</w:t>
+      </w:r>
+      <w:proofErr w:type="spellEnd"/>
+      <w:r>
+        <w:t xml:space="preserve">, se almacena en el servidor y se sirve como archivo estático a través de Nginx; en la base de datos solo se guarda la URL pública. En el cliente, la imagen se carga con la librería </w:t>
+      </w:r>
+      <w:proofErr w:type="spellStart"/>
+      <w:r>
+        <w:t>Coil</w:t>
+      </w:r>
+      <w:proofErr w:type="spellEnd"/>
+      <w:r>
+        <w:t>.</w:t>
+      </w:r>
+    </w:p>
+    <w:p>
+      <w:pPr>
+        <w:pStyle w:val="Ttulo3"/>
+      </w:pPr>
+      <w:r>
+        <w:t>Regla de reserva única por usuario</w:t>
+      </w:r>
+    </w:p>
+    <w:p>
+      <w:pPr>
+        <w:spacing w:after="120" w:line="276" w:lineRule="auto"/>
+        <w:jc w:val="both"/>
+      </w:pPr>
+      <w:r>
+        <w:t>Para asegurar el uso equitativo de las pistas, el sistema impide que un usuario tenga más de una reserva activa simultánea: mientras tenga una reserva confirmada cuya hora de fin no haya pasado, no podrá crear otra. Los administradores quedan exentos para facilitar la gestión. La regla se valida en el servicio y se cubre con tres pruebas unitarias.</w:t>
+      </w:r>
+    </w:p>
+    <w:p>
+      <w:pPr>
+        <w:pStyle w:val="Ttulo3"/>
+      </w:pPr>
+      <w:r>
+        <w:t>Panel de estadísticas para administradores</w:t>
+      </w:r>
+    </w:p>
+    <w:p>
+      <w:pPr>
+        <w:spacing w:after="120" w:line="276" w:lineRule="auto"/>
+        <w:jc w:val="both"/>
+      </w:pPr>
+      <w:r>
+        <w:t xml:space="preserve">Los administradores disponen de una pantalla específica con métricas de uso del club: total de usuarios y reservas, reservas del día, tasa de cancelación, ranking de las pistas y usuarios más activos, y distribución de reservas por día de la semana en un gráfico de barras. El servidor calcula los agregados mediante consultas JPQL y una consulta nativa de PostgreSQL para el reparto semanal; el cliente representa los datos con barras dibujadas en un </w:t>
+      </w:r>
+      <w:proofErr w:type="spellStart"/>
+      <w:r>
+        <w:t>Canvas</w:t>
+      </w:r>
+      <w:proofErr w:type="spellEnd"/>
+      <w:r>
+        <w:t xml:space="preserve"> de Compose, sin dependencias externas</w:t>
+      </w:r>
+      <w:r>
+        <w:t>.</w:t>
+      </w:r>
+      <w:r>
+        <w:t xml:space="preserve"> </w:t>
+      </w:r>
+      <w:r>
+        <w:t>El cómputo incluye reservas en estado CONFIRMADA, CANCELADA y EXPIRADA, lo que garantiza una visión histórica completa del uso del club</w:t>
+      </w:r>
+    </w:p>
+    <w:p>
+      <w:pPr>
+        <w:pStyle w:val="Ttulo3"/>
+      </w:pPr>
+      <w:r>
+        <w:t>Sistema unificado de mensajes de error</w:t>
+      </w:r>
+    </w:p>
+    <w:p>
+      <w:pPr>
+        <w:spacing w:after="120" w:line="276" w:lineRule="auto"/>
+        <w:jc w:val="both"/>
+      </w:pPr>
+      <w:r>
+        <w:t xml:space="preserve">El backend devuelve los errores con una estructura JSON consistente gracias a un manejador global de excepciones (campos status, error, </w:t>
+      </w:r>
+      <w:proofErr w:type="spellStart"/>
+      <w:r>
+        <w:t>message</w:t>
+      </w:r>
+      <w:proofErr w:type="spellEnd"/>
+      <w:r>
+        <w:t xml:space="preserve">, </w:t>
+      </w:r>
+      <w:proofErr w:type="spellStart"/>
+      <w:r>
+        <w:t>path</w:t>
+      </w:r>
+      <w:proofErr w:type="spellEnd"/>
+      <w:r>
+        <w:t xml:space="preserve"> y, opcionalmente, </w:t>
+      </w:r>
+      <w:proofErr w:type="spellStart"/>
+      <w:r>
+        <w:t>errors</w:t>
+      </w:r>
+      <w:proofErr w:type="spellEnd"/>
+      <w:r>
+        <w:t xml:space="preserve"> de validación). El cliente Android dispone de una función de extensión común que extrae el mensaje real de cualquier respuesta de error y lo muestra al usuario, en lugar de un código HTTP genérico.</w:t>
+      </w:r>
+    </w:p>
+    <w:p>
+      <w:pPr>
+        <w:pStyle w:val="Ttulo3"/>
+      </w:pPr>
+      <w:r>
+        <w:t>Documentación interactiva de la API</w:t>
+      </w:r>
+    </w:p>
+    <w:p>
+      <w:pPr>
+        <w:spacing w:after="120" w:line="276" w:lineRule="auto"/>
+        <w:jc w:val="both"/>
+      </w:pPr>
+      <w:r>
+        <w:t xml:space="preserve">Todos </w:t>
+      </w:r>
+      <w:r>
+        <w:t xml:space="preserve">los </w:t>
+      </w:r>
+      <w:proofErr w:type="spellStart"/>
+      <w:r>
+        <w:t>endpoints</w:t>
+      </w:r>
+      <w:proofErr w:type="spellEnd"/>
+      <w:r>
+        <w:t xml:space="preserve"> del backend están documentados automáticamente mediante </w:t>
+      </w:r>
+      <w:proofErr w:type="spellStart"/>
+      <w:r>
+        <w:t>OpenAPI</w:t>
+      </w:r>
+      <w:proofErr w:type="spellEnd"/>
+      <w:r>
+        <w:t xml:space="preserve"> 3.1 a través de la librería </w:t>
+      </w:r>
+      <w:proofErr w:type="spellStart"/>
+      <w:r>
+        <w:t>springdoc-openapi</w:t>
+      </w:r>
+      <w:proofErr w:type="spellEnd"/>
+      <w:r>
+        <w:t xml:space="preserve">. La documentación se expone como interfaz web interactiva en https://api.nacimiento.me/swagger-ui.html, donde es posible explorar los </w:t>
+      </w:r>
+      <w:proofErr w:type="spellStart"/>
+      <w:r>
+        <w:t>endpoints</w:t>
+      </w:r>
+      <w:proofErr w:type="spellEnd"/>
+      <w:r>
+        <w:t xml:space="preserve">, ver los esquemas de entrada y salida, y ejecutar peticiones de prueba directamente desde el navegador, sin necesidad de herramientas externas como </w:t>
+      </w:r>
+      <w:proofErr w:type="spellStart"/>
+      <w:r>
+        <w:t>Postman</w:t>
+      </w:r>
+      <w:proofErr w:type="spellEnd"/>
+      <w:r>
+        <w:t>. Esto facilita tanto la integración como el mantenimiento del sistema.</w:t>
+      </w:r>
+    </w:p>
+    <w:p>
+      <w:pPr>
+        <w:spacing w:after="120" w:line="276" w:lineRule="auto"/>
+        <w:jc w:val="both"/>
+      </w:pPr>
+    </w:p>
+    <w:p>
+      <w:pPr>
+        <w:spacing w:after="120" w:line="276" w:lineRule="auto"/>
+        <w:jc w:val="both"/>
+      </w:pPr>
+    </w:p>
+    <w:p>
+      <w:pPr>
+        <w:spacing w:after="120" w:line="276" w:lineRule="auto"/>
+        <w:jc w:val="both"/>
+      </w:pPr>
+    </w:p>
+    <w:p>
+      <w:pPr>
+        <w:spacing w:after="120" w:line="276" w:lineRule="auto"/>
+        <w:jc w:val="both"/>
+      </w:pPr>
+    </w:p>
+    <w:p>
+      <w:pPr>
+        <w:pStyle w:val="Ttulo2"/>
+        <w:jc w:val="both"/>
+      </w:pPr>
+      <w:bookmarkStart w:id="34" w:name="_Toc230535754"/>
+      <w:r>
+        <w:lastRenderedPageBreak/>
+        <w:t>5.4. Buenas prácticas aplicadas</w:t>
+      </w:r>
+      <w:bookmarkEnd w:id="34"/>
+    </w:p>
+    <w:p>
+      <w:pPr>
+        <w:pStyle w:val="Prrafodelista"/>
+        <w:numPr>
+          <w:ilvl w:val="0"/>
+          <w:numId w:val="2"/>
+        </w:numPr>
+        <w:spacing w:after="60" w:line="276" w:lineRule="auto"/>
+        <w:jc w:val="both"/>
+      </w:pPr>
+      <w:r>
+        <w:t>Separación de responsabilidades por capas, tanto en el cliente como en el servidor.</w:t>
+      </w:r>
+    </w:p>
+    <w:p>
+      <w:pPr>
+        <w:pStyle w:val="Prrafodelista"/>
+        <w:numPr>
+          <w:ilvl w:val="0"/>
+          <w:numId w:val="2"/>
+        </w:numPr>
+        <w:spacing w:after="60" w:line="276" w:lineRule="auto"/>
+        <w:jc w:val="both"/>
+      </w:pPr>
+      <w:r>
+        <w:t>Inyección de dependencias para reducir el acoplamiento.</w:t>
+      </w:r>
+    </w:p>
+    <w:p>
+      <w:pPr>
+        <w:pStyle w:val="Prrafodelista"/>
+        <w:numPr>
+          <w:ilvl w:val="0"/>
+          <w:numId w:val="2"/>
+        </w:numPr>
+        <w:spacing w:after="60" w:line="276" w:lineRule="auto"/>
+        <w:jc w:val="both"/>
+      </w:pPr>
+      <w:r>
+        <w:t>Validación de la entrada en cliente y servidor, con manejo centralizado de errores en el backend mediante un controlador de excepciones global.</w:t>
+      </w:r>
+    </w:p>
+    <w:p>
+      <w:pPr>
+        <w:pStyle w:val="Prrafodelista"/>
+        <w:numPr>
+          <w:ilvl w:val="0"/>
+          <w:numId w:val="2"/>
+        </w:numPr>
+        <w:spacing w:after="60" w:line="276" w:lineRule="auto"/>
+        <w:jc w:val="both"/>
+      </w:pPr>
+      <w:r>
+        <w:t xml:space="preserve">Nombres descriptivos para variables, métodos y </w:t>
+      </w:r>
+      <w:proofErr w:type="spellStart"/>
+      <w:r>
+        <w:t>endpoints</w:t>
+      </w:r>
+      <w:proofErr w:type="spellEnd"/>
+      <w:r>
+        <w:t>.</w:t>
+      </w:r>
+    </w:p>
+    <w:p>
+      <w:pPr>
+        <w:pStyle w:val="Prrafodelista"/>
+        <w:numPr>
+          <w:ilvl w:val="0"/>
+          <w:numId w:val="2"/>
+        </w:numPr>
+        <w:spacing w:after="60" w:line="276" w:lineRule="auto"/>
+        <w:jc w:val="both"/>
+      </w:pPr>
+      <w:r>
+        <w:t xml:space="preserve">Reutilización de código (por ejemplo, mediante funciones de extensión para mapear entidades a </w:t>
+      </w:r>
+      <w:proofErr w:type="spellStart"/>
+      <w:r>
+        <w:t>DTOs</w:t>
+      </w:r>
+      <w:proofErr w:type="spellEnd"/>
+      <w:r>
+        <w:t>).</w:t>
+      </w:r>
+    </w:p>
+    <w:p>
+      <w:pPr>
+        <w:pStyle w:val="Prrafodelista"/>
+        <w:numPr>
+          <w:ilvl w:val="0"/>
+          <w:numId w:val="2"/>
+        </w:numPr>
+        <w:spacing w:after="60" w:line="276" w:lineRule="auto"/>
+        <w:jc w:val="both"/>
+      </w:pPr>
+      <w:proofErr w:type="spellStart"/>
+      <w:r>
+        <w:t>Commits</w:t>
+      </w:r>
+      <w:proofErr w:type="spellEnd"/>
+      <w:r>
+        <w:t xml:space="preserve"> frecuentes y descriptivos con </w:t>
+      </w:r>
+      <w:proofErr w:type="spellStart"/>
+      <w:r>
+        <w:t>Conventional</w:t>
+      </w:r>
+      <w:proofErr w:type="spellEnd"/>
+      <w:r>
+        <w:t xml:space="preserve"> </w:t>
+      </w:r>
+      <w:proofErr w:type="spellStart"/>
+      <w:r>
+        <w:t>Commits</w:t>
+      </w:r>
+      <w:proofErr w:type="spellEnd"/>
+      <w:r>
+        <w:t>.</w:t>
+      </w:r>
+    </w:p>
+    <w:p>
+      <w:pPr>
+        <w:pStyle w:val="Prrafodelista"/>
+        <w:numPr>
+          <w:ilvl w:val="0"/>
+          <w:numId w:val="2"/>
+        </w:numPr>
+        <w:spacing w:after="60" w:line="276" w:lineRule="auto"/>
+        <w:jc w:val="both"/>
+      </w:pPr>
+      <w:r>
+        <w:t xml:space="preserve">Pruebas unitarias automatizadas en el backend con </w:t>
+      </w:r>
+      <w:proofErr w:type="spellStart"/>
+      <w:r>
+        <w:t>JUnit</w:t>
+      </w:r>
+      <w:proofErr w:type="spellEnd"/>
+      <w:r>
+        <w:t xml:space="preserve"> 5 y </w:t>
+      </w:r>
+      <w:proofErr w:type="spellStart"/>
+      <w:r>
+        <w:t>Mockito</w:t>
+      </w:r>
+      <w:proofErr w:type="spellEnd"/>
+      <w:r>
+        <w:t>-Kotlin, cubriendo los servicios críticos (reservas, estadísticas, autenticación) con tiempos de ejecución inferiores a dos segundos.</w:t>
+      </w:r>
+    </w:p>
+    <w:p>
+      <w:pPr>
+        <w:jc w:val="both"/>
+      </w:pPr>
+      <w:r>
+        <w:br w:type="page"/>
+      </w:r>
+    </w:p>
+    <w:p>
+      <w:pPr>
+        <w:pStyle w:val="Ttulo1"/>
+        <w:jc w:val="both"/>
+      </w:pPr>
+      <w:bookmarkStart w:id="35" w:name="_Toc230535755"/>
+      <w:r>
+        <w:lastRenderedPageBreak/>
+        <w:t>6. Pruebas realizadas</w:t>
+      </w:r>
+      <w:bookmarkEnd w:id="35"/>
+    </w:p>
+    <w:p>
+      <w:pPr>
+        <w:pStyle w:val="Ttulo2"/>
+        <w:jc w:val="both"/>
         <w:rPr>
           <w:b w:val="0"/>
           <w:bCs w:val="0"/>
@@ -15500,9 +14760,8 @@
           <w:sz w:val="22"/>
           <w:szCs w:val="22"/>
         </w:rPr>
-        <w:t>push</w:t>
-      </w:r>
-      <w:proofErr w:type="spellEnd"/>
+      </w:pPr>
+      <w:bookmarkStart w:id="36" w:name="_Toc230535756"/>
       <w:r>
         <w:rPr>
           <w:b w:val="0"/>
@@ -15511,446 +14770,18 @@
           <w:sz w:val="22"/>
           <w:szCs w:val="22"/>
         </w:rPr>
-        <w:t xml:space="preserve"> avisándole de la cancelación, lo que cierra el círculo de comunicación entre la gestión del club y el socio. Esta funcionalidad demuestra la comunicación en red asíncrona y la integración con servicios externos, competencias del módulo de Programación de Servicios y Procesos.</w:t>
-      </w:r>
-    </w:p>
-    <w:p>
-      <w:pPr>
-        <w:pStyle w:val="Ttulo3"/>
-        <w:jc w:val="both"/>
-      </w:pPr>
-      <w:r>
-        <w:t>Gestión del perfil</w:t>
-      </w:r>
-      <w:bookmarkEnd w:id="33"/>
-    </w:p>
-    <w:p>
-      <w:pPr>
-        <w:spacing w:after="120" w:line="276" w:lineRule="auto"/>
-        <w:jc w:val="both"/>
-      </w:pPr>
-      <w:r>
-        <w:t xml:space="preserve">El usuario puede editar su nombre y teléfono, cambiar su contraseña (con verificación de la actual) y subir una foto de perfil. La foto se envía al </w:t>
-      </w:r>
-      <w:proofErr w:type="spellStart"/>
-      <w:r>
-        <w:t>backend</w:t>
-      </w:r>
-      <w:proofErr w:type="spellEnd"/>
-      <w:r>
-        <w:t xml:space="preserve"> mediante una petición </w:t>
-      </w:r>
-      <w:proofErr w:type="spellStart"/>
-      <w:r>
-        <w:t>multipart</w:t>
-      </w:r>
-      <w:proofErr w:type="spellEnd"/>
-      <w:r>
-        <w:t xml:space="preserve">, se almacena en el servidor y se sirve como archivo estático a través de </w:t>
-      </w:r>
-      <w:proofErr w:type="spellStart"/>
-      <w:r>
-        <w:t>Nginx</w:t>
-      </w:r>
-      <w:proofErr w:type="spellEnd"/>
-      <w:r>
-        <w:t xml:space="preserve">; en la base de datos solo se guarda la URL pública. En el cliente, la imagen se carga con la librería </w:t>
-      </w:r>
-      <w:proofErr w:type="spellStart"/>
-      <w:r>
-        <w:t>Coil</w:t>
-      </w:r>
-      <w:proofErr w:type="spellEnd"/>
-      <w:r>
-        <w:t>.</w:t>
-      </w:r>
-    </w:p>
-    <w:p>
-      <w:pPr>
-        <w:pStyle w:val="Ttulo3"/>
-      </w:pPr>
-      <w:r>
-        <w:t>Regla de reserva única por usuario</w:t>
-      </w:r>
-    </w:p>
-    <w:p>
-      <w:pPr>
-        <w:spacing w:after="120" w:line="276" w:lineRule="auto"/>
-        <w:jc w:val="both"/>
-      </w:pPr>
-      <w:r>
-        <w:t>Para asegurar el uso equitativo de las pistas, el sistema impide que un usuario tenga más de una reserva activa simultánea: mientras tenga una reserva confirmada cuya hora de fin no haya pasado, no podrá crear otra. Los administradores quedan exentos para facilitar la gestión. La regla se valida en el servicio y se cubre con tres pruebas unitarias.</w:t>
-      </w:r>
-    </w:p>
-    <w:p>
-      <w:pPr>
-        <w:pStyle w:val="Ttulo3"/>
-      </w:pPr>
-      <w:r>
-        <w:t>Panel de estadísticas para administradores</w:t>
-      </w:r>
-    </w:p>
-    <w:p>
-      <w:pPr>
-        <w:spacing w:after="120" w:line="276" w:lineRule="auto"/>
-        <w:jc w:val="both"/>
-      </w:pPr>
-      <w:r>
-        <w:t xml:space="preserve">Los administradores disponen de una pantalla específica con métricas de uso del club: total de usuarios y reservas, reservas del día, tasa de cancelación, ranking de las pistas y usuarios más activos, y distribución de reservas por día de la semana en un gráfico de barras. El servidor calcula los agregados mediante consultas JPQL y una consulta nativa de PostgreSQL para el reparto semanal; el cliente representa los datos con barras dibujadas en un </w:t>
-      </w:r>
-      <w:proofErr w:type="spellStart"/>
-      <w:r>
-        <w:t>Canvas</w:t>
-      </w:r>
-      <w:proofErr w:type="spellEnd"/>
-      <w:r>
-        <w:t xml:space="preserve"> de </w:t>
-      </w:r>
-      <w:proofErr w:type="spellStart"/>
-      <w:r>
-        <w:t>Compose</w:t>
-      </w:r>
-      <w:proofErr w:type="spellEnd"/>
-      <w:r>
-        <w:t>, sin dependencias externas</w:t>
-      </w:r>
-      <w:r>
-        <w:t>.</w:t>
-      </w:r>
-      <w:r>
-        <w:t xml:space="preserve"> </w:t>
-      </w:r>
-      <w:r>
-        <w:t>El cómputo incluye reservas en estado CONFIRMADA, CANCELADA y EXPIRADA, lo que garantiza una visión histórica completa del uso del club</w:t>
-      </w:r>
-    </w:p>
-    <w:p>
-      <w:pPr>
-        <w:pStyle w:val="Ttulo3"/>
-      </w:pPr>
-      <w:r>
-        <w:t>Sistema unificado de mensajes de error</w:t>
-      </w:r>
-    </w:p>
-    <w:p>
-      <w:pPr>
-        <w:spacing w:after="120" w:line="276" w:lineRule="auto"/>
-        <w:jc w:val="both"/>
-      </w:pPr>
-      <w:r>
-        <w:t xml:space="preserve">El </w:t>
-      </w:r>
-      <w:proofErr w:type="spellStart"/>
-      <w:r>
-        <w:t>backend</w:t>
-      </w:r>
-      <w:proofErr w:type="spellEnd"/>
-      <w:r>
-        <w:t xml:space="preserve"> devuelve los errores con una estructura JSON consistente gracias a un manejador global de excepciones (campos status, error, </w:t>
-      </w:r>
-      <w:proofErr w:type="spellStart"/>
-      <w:r>
-        <w:t>message</w:t>
-      </w:r>
-      <w:proofErr w:type="spellEnd"/>
-      <w:r>
-        <w:t xml:space="preserve">, </w:t>
-      </w:r>
-      <w:proofErr w:type="spellStart"/>
-      <w:r>
-        <w:t>path</w:t>
-      </w:r>
-      <w:proofErr w:type="spellEnd"/>
-      <w:r>
-        <w:t xml:space="preserve"> y, opcionalmente, </w:t>
-      </w:r>
-      <w:proofErr w:type="spellStart"/>
-      <w:r>
-        <w:t>errors</w:t>
-      </w:r>
-      <w:proofErr w:type="spellEnd"/>
-      <w:r>
-        <w:t xml:space="preserve"> de validación). El cliente Android dispone de una función de extensión común que extrae el mensaje real de cualquier respuesta de error y lo muestra al usuario, en lugar de un código HTTP genérico.</w:t>
-      </w:r>
-    </w:p>
-    <w:p>
-      <w:pPr>
-        <w:pStyle w:val="Ttulo3"/>
-      </w:pPr>
-      <w:r>
-        <w:t>Documentación interactiva de la API</w:t>
-      </w:r>
-    </w:p>
-    <w:p>
-      <w:pPr>
-        <w:spacing w:after="120" w:line="276" w:lineRule="auto"/>
-        <w:jc w:val="both"/>
-      </w:pPr>
-      <w:r>
-        <w:t xml:space="preserve">Todos </w:t>
-      </w:r>
-      <w:r>
-        <w:t xml:space="preserve">los </w:t>
-      </w:r>
-      <w:proofErr w:type="spellStart"/>
-      <w:r>
-        <w:t>endpoints</w:t>
-      </w:r>
-      <w:proofErr w:type="spellEnd"/>
-      <w:r>
-        <w:t xml:space="preserve"> del </w:t>
-      </w:r>
-      <w:proofErr w:type="spellStart"/>
-      <w:r>
-        <w:t>backend</w:t>
-      </w:r>
-      <w:proofErr w:type="spellEnd"/>
-      <w:r>
-        <w:t xml:space="preserve"> están documentados automáticamente mediante </w:t>
-      </w:r>
-      <w:proofErr w:type="spellStart"/>
-      <w:r>
-        <w:t>OpenAPI</w:t>
-      </w:r>
-      <w:proofErr w:type="spellEnd"/>
-      <w:r>
-        <w:t xml:space="preserve"> 3.1 a través de la librería </w:t>
-      </w:r>
-      <w:proofErr w:type="spellStart"/>
-      <w:r>
-        <w:t>springdoc-openapi</w:t>
-      </w:r>
-      <w:proofErr w:type="spellEnd"/>
-      <w:r>
-        <w:t xml:space="preserve">. La documentación se expone como interfaz web interactiva en https://api.nacimiento.me/swagger-ui.html, donde es posible explorar los </w:t>
-      </w:r>
-      <w:proofErr w:type="spellStart"/>
-      <w:r>
-        <w:t>endpoints</w:t>
-      </w:r>
-      <w:proofErr w:type="spellEnd"/>
-      <w:r>
-        <w:t xml:space="preserve">, ver los esquemas de entrada y salida, y ejecutar peticiones de prueba directamente desde el navegador, sin necesidad de herramientas externas como </w:t>
-      </w:r>
-      <w:proofErr w:type="spellStart"/>
-      <w:r>
-        <w:t>Postman</w:t>
-      </w:r>
-      <w:proofErr w:type="spellEnd"/>
-      <w:r>
-        <w:t>. Esto facilita tanto la integración como el mantenimiento del sistema.</w:t>
-      </w:r>
-    </w:p>
-    <w:p>
-      <w:pPr>
-        <w:spacing w:after="120" w:line="276" w:lineRule="auto"/>
-        <w:jc w:val="both"/>
-      </w:pPr>
-    </w:p>
-    <w:p>
-      <w:pPr>
-        <w:spacing w:after="120" w:line="276" w:lineRule="auto"/>
-        <w:jc w:val="both"/>
-      </w:pPr>
+        <w:t>La verificación del sistema se ha abordado en dos niveles: pruebas funcionales manuales durante el desarrollo y un conjunto de pruebas unitarias automatizadas sobre la lógica de negocio del backend.</w:t>
+      </w:r>
     </w:p>
     <w:p>
       <w:pPr>
         <w:pStyle w:val="Ttulo2"/>
         <w:jc w:val="both"/>
       </w:pPr>
-      <w:bookmarkStart w:id="34" w:name="_Toc230535754"/>
-      <w:r>
-        <w:t>5.4. Buenas prácticas aplicadas</w:t>
-      </w:r>
-      <w:bookmarkEnd w:id="34"/>
-    </w:p>
-    <w:p>
-      <w:pPr>
-        <w:pStyle w:val="Prrafodelista"/>
-        <w:numPr>
-          <w:ilvl w:val="0"/>
-          <w:numId w:val="2"/>
-        </w:numPr>
-        <w:spacing w:after="60" w:line="276" w:lineRule="auto"/>
-        <w:jc w:val="both"/>
-      </w:pPr>
-      <w:r>
-        <w:t>Separación de responsabilidades por capas, tanto en el cliente como en el servidor.</w:t>
-      </w:r>
-    </w:p>
-    <w:p>
-      <w:pPr>
-        <w:pStyle w:val="Prrafodelista"/>
-        <w:numPr>
-          <w:ilvl w:val="0"/>
-          <w:numId w:val="2"/>
-        </w:numPr>
-        <w:spacing w:after="60" w:line="276" w:lineRule="auto"/>
-        <w:jc w:val="both"/>
-      </w:pPr>
-      <w:r>
-        <w:t>Inyección de dependencias para reducir el acoplamiento.</w:t>
-      </w:r>
-    </w:p>
-    <w:p>
-      <w:pPr>
-        <w:pStyle w:val="Prrafodelista"/>
-        <w:numPr>
-          <w:ilvl w:val="0"/>
-          <w:numId w:val="2"/>
-        </w:numPr>
-        <w:spacing w:after="60" w:line="276" w:lineRule="auto"/>
-        <w:jc w:val="both"/>
-      </w:pPr>
-      <w:r>
-        <w:lastRenderedPageBreak/>
-        <w:t xml:space="preserve">Validación de la entrada en cliente y servidor, con manejo centralizado de errores en el </w:t>
-      </w:r>
-      <w:proofErr w:type="spellStart"/>
-      <w:r>
-        <w:t>backend</w:t>
-      </w:r>
-      <w:proofErr w:type="spellEnd"/>
-      <w:r>
-        <w:t xml:space="preserve"> mediante un controlador de excepciones global.</w:t>
-      </w:r>
-    </w:p>
-    <w:p>
-      <w:pPr>
-        <w:pStyle w:val="Prrafodelista"/>
-        <w:numPr>
-          <w:ilvl w:val="0"/>
-          <w:numId w:val="2"/>
-        </w:numPr>
-        <w:spacing w:after="60" w:line="276" w:lineRule="auto"/>
-        <w:jc w:val="both"/>
-      </w:pPr>
-      <w:r>
-        <w:t xml:space="preserve">Nombres descriptivos para variables, métodos y </w:t>
-      </w:r>
-      <w:proofErr w:type="spellStart"/>
-      <w:r>
-        <w:t>endpoints</w:t>
-      </w:r>
-      <w:proofErr w:type="spellEnd"/>
-      <w:r>
-        <w:t>.</w:t>
-      </w:r>
-    </w:p>
-    <w:p>
-      <w:pPr>
-        <w:pStyle w:val="Prrafodelista"/>
-        <w:numPr>
-          <w:ilvl w:val="0"/>
-          <w:numId w:val="2"/>
-        </w:numPr>
-        <w:spacing w:after="60" w:line="276" w:lineRule="auto"/>
-        <w:jc w:val="both"/>
-      </w:pPr>
-      <w:r>
-        <w:t xml:space="preserve">Reutilización de código (por ejemplo, mediante funciones de extensión para mapear entidades a </w:t>
-      </w:r>
-      <w:proofErr w:type="spellStart"/>
-      <w:r>
-        <w:t>DTOs</w:t>
-      </w:r>
-      <w:proofErr w:type="spellEnd"/>
-      <w:r>
-        <w:t>).</w:t>
-      </w:r>
-    </w:p>
-    <w:p>
-      <w:pPr>
-        <w:pStyle w:val="Prrafodelista"/>
-        <w:numPr>
-          <w:ilvl w:val="0"/>
-          <w:numId w:val="2"/>
-        </w:numPr>
-        <w:spacing w:after="60" w:line="276" w:lineRule="auto"/>
-        <w:jc w:val="both"/>
-      </w:pPr>
-      <w:proofErr w:type="spellStart"/>
-      <w:r>
-        <w:t>Commits</w:t>
-      </w:r>
-      <w:proofErr w:type="spellEnd"/>
-      <w:r>
-        <w:t xml:space="preserve"> frecuentes y descriptivos con </w:t>
-      </w:r>
-      <w:proofErr w:type="spellStart"/>
-      <w:r>
-        <w:t>Conventional</w:t>
-      </w:r>
-      <w:proofErr w:type="spellEnd"/>
-      <w:r>
-        <w:t xml:space="preserve"> </w:t>
-      </w:r>
-      <w:proofErr w:type="spellStart"/>
-      <w:r>
-        <w:t>Commits</w:t>
-      </w:r>
-      <w:proofErr w:type="spellEnd"/>
-      <w:r>
-        <w:t>.</w:t>
-      </w:r>
-    </w:p>
-    <w:p>
-      <w:pPr>
-        <w:pStyle w:val="Prrafodelista"/>
-        <w:numPr>
-          <w:ilvl w:val="0"/>
-          <w:numId w:val="2"/>
-        </w:numPr>
-        <w:spacing w:after="60" w:line="276" w:lineRule="auto"/>
-        <w:jc w:val="both"/>
-      </w:pPr>
-      <w:r>
-        <w:t xml:space="preserve">Pruebas unitarias automatizadas en el </w:t>
-      </w:r>
-      <w:proofErr w:type="spellStart"/>
-      <w:r>
-        <w:t>backend</w:t>
-      </w:r>
-      <w:proofErr w:type="spellEnd"/>
-      <w:r>
-        <w:t xml:space="preserve"> con </w:t>
-      </w:r>
-      <w:proofErr w:type="spellStart"/>
-      <w:r>
-        <w:t>JUnit</w:t>
-      </w:r>
-      <w:proofErr w:type="spellEnd"/>
-      <w:r>
-        <w:t xml:space="preserve"> 5 y </w:t>
-      </w:r>
-      <w:proofErr w:type="spellStart"/>
-      <w:r>
-        <w:t>Mockito-Kotlin</w:t>
-      </w:r>
-      <w:proofErr w:type="spellEnd"/>
-      <w:r>
-        <w:t>, cubriendo los servicios críticos (reservas, estadísticas, autenticación) con tiempos de ejecución inferiores a dos segundos.</w:t>
-      </w:r>
-    </w:p>
-    <w:p>
-      <w:pPr>
-        <w:jc w:val="both"/>
-      </w:pPr>
-      <w:r>
-        <w:br w:type="page"/>
-      </w:r>
-    </w:p>
-    <w:p>
-      <w:pPr>
-        <w:pStyle w:val="Ttulo1"/>
-        <w:jc w:val="both"/>
-      </w:pPr>
-      <w:bookmarkStart w:id="35" w:name="_Toc230535755"/>
-      <w:r>
-        <w:lastRenderedPageBreak/>
-        <w:t>6. Pruebas realizadas</w:t>
-      </w:r>
-      <w:bookmarkEnd w:id="35"/>
+      <w:r>
+        <w:t>6.1. Pruebas de la API</w:t>
+      </w:r>
+      <w:bookmarkEnd w:id="36"/>
     </w:p>
     <w:p>
       <w:pPr>
@@ -15964,7 +14795,7 @@
           <w:szCs w:val="22"/>
         </w:rPr>
       </w:pPr>
-      <w:bookmarkStart w:id="36" w:name="_Toc230535756"/>
+      <w:bookmarkStart w:id="37" w:name="_Toc230535757"/>
       <w:r>
         <w:rPr>
           <w:b w:val="0"/>
@@ -15973,85 +14804,7 @@
           <w:sz w:val="22"/>
           <w:szCs w:val="22"/>
         </w:rPr>
-        <w:t xml:space="preserve">La verificación del sistema se ha abordado en dos niveles: pruebas funcionales manuales durante el desarrollo y un conjunto de pruebas unitarias automatizadas sobre la lógica de negocio del </w:t>
-      </w:r>
-      <w:proofErr w:type="spellStart"/>
-      <w:r>
-        <w:rPr>
-          <w:b w:val="0"/>
-          <w:bCs w:val="0"/>
-          <w:color w:val="auto"/>
-          <w:sz w:val="22"/>
-          <w:szCs w:val="22"/>
-        </w:rPr>
-        <w:t>backend</w:t>
-      </w:r>
-      <w:proofErr w:type="spellEnd"/>
-      <w:r>
-        <w:rPr>
-          <w:b w:val="0"/>
-          <w:bCs w:val="0"/>
-          <w:color w:val="auto"/>
-          <w:sz w:val="22"/>
-          <w:szCs w:val="22"/>
-        </w:rPr>
-        <w:t>.</w:t>
-      </w:r>
-    </w:p>
-    <w:p>
-      <w:pPr>
-        <w:pStyle w:val="Ttulo2"/>
-        <w:jc w:val="both"/>
-      </w:pPr>
-      <w:r>
-        <w:t>6.1. Pruebas de la API</w:t>
-      </w:r>
-      <w:bookmarkEnd w:id="36"/>
-    </w:p>
-    <w:p>
-      <w:pPr>
-        <w:pStyle w:val="Ttulo2"/>
-        <w:jc w:val="both"/>
-        <w:rPr>
-          <w:b w:val="0"/>
-          <w:bCs w:val="0"/>
-          <w:color w:val="auto"/>
-          <w:sz w:val="22"/>
-          <w:szCs w:val="22"/>
-        </w:rPr>
-      </w:pPr>
-      <w:bookmarkStart w:id="37" w:name="_Toc230535757"/>
-      <w:r>
-        <w:rPr>
-          <w:b w:val="0"/>
-          <w:bCs w:val="0"/>
-          <w:color w:val="auto"/>
-          <w:sz w:val="22"/>
-          <w:szCs w:val="22"/>
-        </w:rPr>
-        <w:t xml:space="preserve">Se han desarrollado 30 pruebas unitarias que se ejecutan al 100% de éxito (1,998 segundos en total). De ellas, 29 corresponden a la lógica de negocio distribuidas en los tres servicios principales, y 1 es el test de contexto que verifica el arranque correcto de Spring </w:t>
-      </w:r>
-      <w:proofErr w:type="spellStart"/>
-      <w:r>
-        <w:rPr>
-          <w:b w:val="0"/>
-          <w:bCs w:val="0"/>
-          <w:color w:val="auto"/>
-          <w:sz w:val="22"/>
-          <w:szCs w:val="22"/>
-        </w:rPr>
-        <w:t>Boot</w:t>
-      </w:r>
-      <w:proofErr w:type="spellEnd"/>
-      <w:r>
-        <w:rPr>
-          <w:b w:val="0"/>
-          <w:bCs w:val="0"/>
-          <w:color w:val="auto"/>
-          <w:sz w:val="22"/>
-          <w:szCs w:val="22"/>
-        </w:rPr>
-        <w:t>.</w:t>
+        <w:t>Se han desarrollado 30 pruebas unitarias que se ejecutan al 100% de éxito (1,998 segundos en total). De ellas, 29 corresponden a la lógica de negocio distribuidas en los tres servicios principales, y 1 es el test de contexto que verifica el arranque correcto de Spring Boot.</w:t>
       </w:r>
       <w:r>
         <w:rPr>
@@ -16063,7 +14816,7 @@
           <w:szCs w:val="22"/>
         </w:rPr>
         <w:drawing>
-          <wp:inline distT="0" distB="0" distL="0" distR="0" wp14:anchorId="5B4A8AEC" wp14:editId="5EC0794E">
+          <wp:inline distT="0" distB="0" distL="0" distR="0" wp14:anchorId="5B4A8AEC" wp14:editId="13BF4452">
             <wp:extent cx="5731510" cy="2351088"/>
             <wp:effectExtent l="0" t="0" r="2540" b="0"/>
             <wp:docPr id="2" name="Imagen 2"/>
@@ -16400,29 +15153,7 @@
           <w:sz w:val="22"/>
           <w:szCs w:val="22"/>
         </w:rPr>
-        <w:t xml:space="preserve">Las pruebas unitarias cubren la lógica de negocio implementada hasta antes del sprint final. Las funcionalidades incorporadas en la fase de refinamiento —rotación automática de la cola de espera con @Scheduled, notificación </w:t>
-      </w:r>
-      <w:proofErr w:type="spellStart"/>
-      <w:r>
-        <w:rPr>
-          <w:b w:val="0"/>
-          <w:bCs w:val="0"/>
-          <w:color w:val="auto"/>
-          <w:sz w:val="22"/>
-          <w:szCs w:val="22"/>
-        </w:rPr>
-        <w:t>push</w:t>
-      </w:r>
-      <w:proofErr w:type="spellEnd"/>
-      <w:r>
-        <w:rPr>
-          <w:b w:val="0"/>
-          <w:bCs w:val="0"/>
-          <w:color w:val="auto"/>
-          <w:sz w:val="22"/>
-          <w:szCs w:val="22"/>
-        </w:rPr>
-        <w:t xml:space="preserve"> al usuario afectado por cancelaciones del administrador, ajuste del cómputo de estadísticas para incluir reservas EXPIRADAS— se han verificado funcionalmente de forma manual y quedan identificadas como ampliación natural de la suite automatizada para trabajos futuros</w:t>
+        <w:t>Las pruebas unitarias cubren la lógica de negocio implementada hasta antes del sprint final. Las funcionalidades incorporadas en la fase de refinamiento —rotación automática de la cola de espera con @Scheduled, notificación push al usuario afectado por cancelaciones del administrador, ajuste del cómputo de estadísticas para incluir reservas EXPIRADAS— se han verificado funcionalmente de forma manual y quedan identificadas como ampliación natural de la suite automatizada para trabajos futuros</w:t>
       </w:r>
       <w:r>
         <w:rPr>
@@ -16470,7 +15201,7 @@
           <w:szCs w:val="22"/>
         </w:rPr>
         <w:drawing>
-          <wp:inline distT="0" distB="0" distL="0" distR="0" wp14:anchorId="7A0A4147" wp14:editId="2B9719AB">
+          <wp:inline distT="0" distB="0" distL="0" distR="0" wp14:anchorId="7A0A4147" wp14:editId="6AE5FA46">
             <wp:extent cx="5731510" cy="2291930"/>
             <wp:effectExtent l="0" t="0" r="2540" b="0"/>
             <wp:docPr id="3" name="Imagen 3"/>
@@ -16692,51 +15423,7 @@
           <w:sz w:val="22"/>
           <w:szCs w:val="22"/>
         </w:rPr>
-        <w:t xml:space="preserve">Ciclo completo de notificación tras cancelación de usuario: con dos usuarios reales, uno se apuntó a la lista de espera de una franja ocupada y, al cancelar el otro su reserva, el primero recibió la notificación </w:t>
-      </w:r>
-      <w:proofErr w:type="spellStart"/>
-      <w:r>
-        <w:rPr>
-          <w:b w:val="0"/>
-          <w:bCs w:val="0"/>
-          <w:color w:val="auto"/>
-          <w:sz w:val="22"/>
-          <w:szCs w:val="22"/>
-        </w:rPr>
-        <w:t>push</w:t>
-      </w:r>
-      <w:proofErr w:type="spellEnd"/>
-      <w:r>
-        <w:rPr>
-          <w:b w:val="0"/>
-          <w:bCs w:val="0"/>
-          <w:color w:val="auto"/>
-          <w:sz w:val="22"/>
-          <w:szCs w:val="22"/>
-        </w:rPr>
-        <w:t xml:space="preserve"> en su dispositivo, validando toda la cadena cliente-servidor-</w:t>
-      </w:r>
-      <w:proofErr w:type="spellStart"/>
-      <w:r>
-        <w:rPr>
-          <w:b w:val="0"/>
-          <w:bCs w:val="0"/>
-          <w:color w:val="auto"/>
-          <w:sz w:val="22"/>
-          <w:szCs w:val="22"/>
-        </w:rPr>
-        <w:t>Firebase</w:t>
-      </w:r>
-      <w:proofErr w:type="spellEnd"/>
-      <w:r>
-        <w:rPr>
-          <w:b w:val="0"/>
-          <w:bCs w:val="0"/>
-          <w:color w:val="auto"/>
-          <w:sz w:val="22"/>
-          <w:szCs w:val="22"/>
-        </w:rPr>
-        <w:t>.</w:t>
+        <w:t>Ciclo completo de notificación tras cancelación de usuario: con dos usuarios reales, uno se apuntó a la lista de espera de una franja ocupada y, al cancelar el otro su reserva, el primero recibió la notificación push en su dispositivo, validando toda la cadena cliente-servidor-Firebase.</w:t>
       </w:r>
     </w:p>
     <w:p>
@@ -16781,10 +15468,13 @@
           <w:sz w:val="22"/>
           <w:szCs w:val="22"/>
         </w:rPr>
-        <w:t xml:space="preserve"> detectaba la expiración, eliminaba su entrada y enviaba automáticamente la notificación </w:t>
-      </w:r>
-      <w:proofErr w:type="spellStart"/>
-      <w:r>
+        <w:t xml:space="preserve"> detectaba la expiración, eliminaba su entrada y enviaba automáticamente la notificación push al segundo usuario, todo ello sin intervención manual.</w:t>
+      </w:r>
+    </w:p>
+    <w:p>
+      <w:pPr>
+        <w:pStyle w:val="Ttulo2"/>
+        <w:jc w:val="both"/>
         <w:rPr>
           <w:b w:val="0"/>
           <w:bCs w:val="0"/>
@@ -16792,9 +15482,7 @@
           <w:sz w:val="22"/>
           <w:szCs w:val="22"/>
         </w:rPr>
-        <w:t>push</w:t>
-      </w:r>
-      <w:proofErr w:type="spellEnd"/>
+      </w:pPr>
       <w:r>
         <w:rPr>
           <w:b w:val="0"/>
@@ -16803,74 +15491,7 @@
           <w:sz w:val="22"/>
           <w:szCs w:val="22"/>
         </w:rPr>
-        <w:t xml:space="preserve"> al segundo usuario, todo ello sin intervención manual.</w:t>
-      </w:r>
-    </w:p>
-    <w:p>
-      <w:pPr>
-        <w:pStyle w:val="Ttulo2"/>
-        <w:jc w:val="both"/>
-        <w:rPr>
-          <w:b w:val="0"/>
-          <w:bCs w:val="0"/>
-          <w:color w:val="auto"/>
-          <w:sz w:val="22"/>
-          <w:szCs w:val="22"/>
-        </w:rPr>
-      </w:pPr>
-      <w:r>
-        <w:rPr>
-          <w:b w:val="0"/>
-          <w:bCs w:val="0"/>
-          <w:color w:val="auto"/>
-          <w:sz w:val="22"/>
-          <w:szCs w:val="22"/>
-        </w:rPr>
-        <w:t xml:space="preserve">Cancelación por administrador con doble notificación: el administrador canceló una reserva de un socio del club; se comprobó que el socio afectado recibía el </w:t>
-      </w:r>
-      <w:proofErr w:type="spellStart"/>
-      <w:r>
-        <w:rPr>
-          <w:b w:val="0"/>
-          <w:bCs w:val="0"/>
-          <w:color w:val="auto"/>
-          <w:sz w:val="22"/>
-          <w:szCs w:val="22"/>
-        </w:rPr>
-        <w:t>push</w:t>
-      </w:r>
-      <w:proofErr w:type="spellEnd"/>
-      <w:r>
-        <w:rPr>
-          <w:b w:val="0"/>
-          <w:bCs w:val="0"/>
-          <w:color w:val="auto"/>
-          <w:sz w:val="22"/>
-          <w:szCs w:val="22"/>
-        </w:rPr>
-        <w:t xml:space="preserve"> de cancelación y, simultáneamente, el primer usuario de la lista de espera de esa franja recibía el </w:t>
-      </w:r>
-      <w:proofErr w:type="spellStart"/>
-      <w:r>
-        <w:rPr>
-          <w:b w:val="0"/>
-          <w:bCs w:val="0"/>
-          <w:color w:val="auto"/>
-          <w:sz w:val="22"/>
-          <w:szCs w:val="22"/>
-        </w:rPr>
-        <w:t>push</w:t>
-      </w:r>
-      <w:proofErr w:type="spellEnd"/>
-      <w:r>
-        <w:rPr>
-          <w:b w:val="0"/>
-          <w:bCs w:val="0"/>
-          <w:color w:val="auto"/>
-          <w:sz w:val="22"/>
-          <w:szCs w:val="22"/>
-        </w:rPr>
-        <w:t xml:space="preserve"> de turno disponible.</w:t>
+        <w:t>Cancelación por administrador con doble notificación: el administrador canceló una reserva de un socio del club; se comprobó que el socio afectado recibía el push de cancelación y, simultáneamente, el primer usuario de la lista de espera de esa franja recibía el push de turno disponible.</w:t>
       </w:r>
     </w:p>
     <w:p>
@@ -16986,15 +15607,7 @@
         <w:jc w:val="both"/>
       </w:pPr>
       <w:r>
-        <w:t xml:space="preserve">Cancelación de reservas ajenas por parte del administrador: el sistema permite la operación si el rol es ADMINISTRADOR y, simultáneamente, notifica al socio afectado mediante </w:t>
-      </w:r>
-      <w:proofErr w:type="spellStart"/>
-      <w:r>
-        <w:t>push</w:t>
-      </w:r>
-      <w:proofErr w:type="spellEnd"/>
-      <w:r>
-        <w:t xml:space="preserve">. </w:t>
+        <w:t xml:space="preserve">Cancelación de reservas ajenas por parte del administrador: el sistema permite la operación si el rol es ADMINISTRADOR y, simultáneamente, notifica al socio afectado mediante push. </w:t>
       </w:r>
     </w:p>
     <w:p>
@@ -17023,15 +15636,7 @@
         <w:jc w:val="both"/>
       </w:pPr>
       <w:r>
-        <w:t xml:space="preserve">Consistencia horaria entre </w:t>
-      </w:r>
-      <w:proofErr w:type="spellStart"/>
-      <w:r>
-        <w:t>backend</w:t>
-      </w:r>
-      <w:proofErr w:type="spellEnd"/>
-      <w:r>
-        <w:t xml:space="preserve"> y cliente: verificada coincidencia exacta de las horas mostradas en la app con las almacenadas en base de datos, tras la fijación explícita de la zona horaria en el servidor.</w:t>
+        <w:t>Consistencia horaria entre backend y cliente: verificada coincidencia exacta de las horas mostradas en la app con las almacenadas en base de datos, tras la fijación explícita de la zona horaria en el servidor.</w:t>
       </w:r>
     </w:p>
     <w:p>
@@ -17071,23 +15676,7 @@
         <w:jc w:val="both"/>
       </w:pPr>
       <w:r>
-        <w:t xml:space="preserve">El </w:t>
-      </w:r>
-      <w:proofErr w:type="spellStart"/>
-      <w:r>
-        <w:t>backend</w:t>
-      </w:r>
-      <w:proofErr w:type="spellEnd"/>
-      <w:r>
-        <w:t xml:space="preserve"> de </w:t>
-      </w:r>
-      <w:proofErr w:type="spellStart"/>
-      <w:r>
-        <w:t>PistaGO</w:t>
-      </w:r>
-      <w:proofErr w:type="spellEnd"/>
-      <w:r>
-        <w:t xml:space="preserve"> se ha desplegado en un servidor virtual privado (VPS) de </w:t>
+        <w:t xml:space="preserve">El backend de PistaGO se ha desplegado en un servidor virtual privado (VPS) de </w:t>
       </w:r>
       <w:proofErr w:type="spellStart"/>
       <w:r>
@@ -17143,40 +15732,15 @@
         <w:spacing w:after="60" w:line="276" w:lineRule="auto"/>
         <w:jc w:val="both"/>
       </w:pPr>
-      <w:proofErr w:type="spellStart"/>
       <w:r>
         <w:rPr>
           <w:b/>
           <w:bCs/>
         </w:rPr>
-        <w:t>Nginx</w:t>
-      </w:r>
-      <w:proofErr w:type="spellEnd"/>
-      <w:r>
-        <w:rPr>
-          <w:b/>
-          <w:bCs/>
-        </w:rPr>
-        <w:t xml:space="preserve"> como proxy inverso: </w:t>
-      </w:r>
-      <w:r>
-        <w:t xml:space="preserve">recibe las peticiones HTTPS en el subdominio de la API y las redirige al </w:t>
-      </w:r>
-      <w:proofErr w:type="spellStart"/>
-      <w:r>
-        <w:t>backend</w:t>
-      </w:r>
-      <w:proofErr w:type="spellEnd"/>
-      <w:r>
-        <w:t xml:space="preserve"> de Spring </w:t>
-      </w:r>
-      <w:proofErr w:type="spellStart"/>
-      <w:r>
-        <w:t>Boot</w:t>
-      </w:r>
-      <w:proofErr w:type="spellEnd"/>
-      <w:r>
-        <w:t>, que escucha en local. Además, sirve directamente las fotos de perfil como archivos estáticos.</w:t>
+        <w:t xml:space="preserve">Nginx como proxy inverso: </w:t>
+      </w:r>
+      <w:r>
+        <w:t>recibe las peticiones HTTPS en el subdominio de la API y las redirige al backend de Spring Boot, que escucha en local. Además, sirve directamente las fotos de perfil como archivos estáticos.</w:t>
       </w:r>
     </w:p>
     <w:p>
@@ -17263,37 +15827,12 @@
         <w:spacing w:after="60" w:line="276" w:lineRule="auto"/>
         <w:jc w:val="both"/>
       </w:pPr>
-      <w:proofErr w:type="spellStart"/>
       <w:r>
         <w:rPr>
           <w:b/>
           <w:bCs/>
         </w:rPr>
-        <w:t>Backend</w:t>
-      </w:r>
-      <w:proofErr w:type="spellEnd"/>
-      <w:r>
-        <w:rPr>
-          <w:b/>
-          <w:bCs/>
-        </w:rPr>
-        <w:t xml:space="preserve"> Spring </w:t>
-      </w:r>
-      <w:proofErr w:type="spellStart"/>
-      <w:r>
-        <w:rPr>
-          <w:b/>
-          <w:bCs/>
-        </w:rPr>
-        <w:t>Boot</w:t>
-      </w:r>
-      <w:proofErr w:type="spellEnd"/>
-      <w:r>
-        <w:rPr>
-          <w:b/>
-          <w:bCs/>
-        </w:rPr>
-        <w:t xml:space="preserve">: </w:t>
+        <w:t xml:space="preserve">Backend Spring Boot: </w:t>
       </w:r>
       <w:r>
         <w:t xml:space="preserve">empaquetado como un archivo JAR ejecutable y gestionado como servicio del sistema mediante </w:t>
@@ -17320,21 +15859,12 @@
         <w:spacing w:after="60" w:line="276" w:lineRule="auto"/>
         <w:jc w:val="both"/>
       </w:pPr>
-      <w:proofErr w:type="spellStart"/>
       <w:r>
         <w:rPr>
           <w:b/>
           <w:bCs/>
         </w:rPr>
-        <w:t>Firebase</w:t>
-      </w:r>
-      <w:proofErr w:type="spellEnd"/>
-      <w:r>
-        <w:rPr>
-          <w:b/>
-          <w:bCs/>
-        </w:rPr>
-        <w:t xml:space="preserve"> </w:t>
+        <w:t xml:space="preserve">Firebase </w:t>
       </w:r>
       <w:proofErr w:type="spellStart"/>
       <w:r>
@@ -17381,15 +15911,7 @@
         <w:t>:</w:t>
       </w:r>
       <w:r>
-        <w:t xml:space="preserve"> </w:t>
-      </w:r>
-      <w:proofErr w:type="spellStart"/>
-      <w:r>
-        <w:t>Nginx</w:t>
-      </w:r>
-      <w:proofErr w:type="spellEnd"/>
-      <w:r>
-        <w:t xml:space="preserve"> sirve también una ruta pública (https://nacimiento.me/pistago/) con una página HTML y un código QR para descargar la aplicación firmada, lo que facilita su distribución al tribunal durante la defensa.</w:t>
+        <w:t xml:space="preserve"> Nginx sirve también una ruta pública (https://nacimiento.me/pistago/) con una página HTML y un código QR para descargar la aplicación firmada, lo que facilita su distribución al tribunal durante la defensa.</w:t>
       </w:r>
     </w:p>
     <w:p>
@@ -17426,71 +15948,47 @@
         <w:t xml:space="preserve"> UI)</w:t>
       </w:r>
       <w:r>
-        <w:t xml:space="preserve">: </w:t>
+        <w:t xml:space="preserve">: Nginx expone la ruta /swagger-ui.html del backend en el subdominio </w:t>
       </w:r>
       <w:proofErr w:type="spellStart"/>
       <w:r>
-        <w:t>Nginx</w:t>
+        <w:t>api.nacimiento.me</w:t>
       </w:r>
       <w:proofErr w:type="spellEnd"/>
       <w:r>
-        <w:t xml:space="preserve"> expone la ruta /swagger-ui.html del </w:t>
+        <w:t xml:space="preserve">, permitiendo explorar y probar todos los </w:t>
       </w:r>
       <w:proofErr w:type="spellStart"/>
       <w:r>
-        <w:t>backend</w:t>
+        <w:t>endpoints</w:t>
       </w:r>
       <w:proofErr w:type="spellEnd"/>
       <w:r>
-        <w:t xml:space="preserve"> en el subdominio </w:t>
+        <w:t xml:space="preserve"> desde el navegador sin herramientas externas. La detección correcta del esquema HTTPS detrás del proxy se logra mediante la propiedad </w:t>
       </w:r>
       <w:proofErr w:type="spellStart"/>
       <w:r>
-        <w:t>api.nacimiento.me</w:t>
+        <w:t>server.forward-headers-strategy</w:t>
       </w:r>
       <w:proofErr w:type="spellEnd"/>
       <w:r>
-        <w:t xml:space="preserve">, permitiendo explorar y probar todos los </w:t>
+        <w:t>=</w:t>
       </w:r>
       <w:proofErr w:type="spellStart"/>
       <w:r>
-        <w:t>endpoints</w:t>
+        <w:t>framework</w:t>
       </w:r>
       <w:proofErr w:type="spellEnd"/>
       <w:r>
-        <w:t xml:space="preserve"> desde el navegador sin herramientas externas. La detección correcta del esquema HTTPS detrás del proxy se logra mediante la propiedad </w:t>
+        <w:t xml:space="preserve"> y la propagación de cabeceras X-</w:t>
       </w:r>
       <w:proofErr w:type="spellStart"/>
       <w:r>
-        <w:t>server.forward-headers-strategy</w:t>
+        <w:t>Forwarded</w:t>
       </w:r>
       <w:proofErr w:type="spellEnd"/>
       <w:r>
-        <w:t>=</w:t>
-      </w:r>
-      <w:proofErr w:type="spellStart"/>
-      <w:r>
-        <w:t>framework</w:t>
-      </w:r>
-      <w:proofErr w:type="spellEnd"/>
-      <w:r>
-        <w:t xml:space="preserve"> y la propagación de cabeceras X-</w:t>
-      </w:r>
-      <w:proofErr w:type="spellStart"/>
-      <w:r>
-        <w:t>Forwarded</w:t>
-      </w:r>
-      <w:proofErr w:type="spellEnd"/>
-      <w:r>
-        <w:t xml:space="preserve">-* desde </w:t>
-      </w:r>
-      <w:proofErr w:type="spellStart"/>
-      <w:r>
-        <w:t>Nginx</w:t>
-      </w:r>
-      <w:proofErr w:type="spellEnd"/>
-      <w:r>
-        <w:t>.</w:t>
+        <w:t>-* desde Nginx.</w:t>
       </w:r>
     </w:p>
     <w:p>
@@ -17508,59 +16006,50 @@
           <w:b/>
           <w:bCs/>
         </w:rPr>
-        <w:t xml:space="preserve">Tareas programadas en el </w:t>
+        <w:t>Tareas programadas en el backend</w:t>
+      </w:r>
+      <w:r>
+        <w:t>: el motor de planificación de Spring (@EnableScheduling) ejecuta cada 30 segundos la rotación automática de la cola de espera, sin requerir ningún proceso adicional fuera del propio servicio del backend.</w:t>
+      </w:r>
+    </w:p>
+    <w:p>
+      <w:pPr>
+        <w:pStyle w:val="Ttulo2"/>
+        <w:jc w:val="both"/>
+      </w:pPr>
+      <w:bookmarkStart w:id="42" w:name="_Toc230535762"/>
+      <w:r>
+        <w:t>7.3. Proceso de despliegue</w:t>
+      </w:r>
+      <w:bookmarkEnd w:id="42"/>
+    </w:p>
+    <w:p>
+      <w:pPr>
+        <w:spacing w:after="120" w:line="276" w:lineRule="auto"/>
+        <w:jc w:val="both"/>
+      </w:pPr>
+      <w:r>
+        <w:t>El proceso de despliegue de una nueva versión consiste en compilar el archivo JAR en el entorno de desarrollo con ./</w:t>
       </w:r>
       <w:proofErr w:type="spellStart"/>
       <w:r>
-        <w:rPr>
-          <w:b/>
-          <w:bCs/>
-        </w:rPr>
-        <w:t>backend</w:t>
+        <w:t>gradlew</w:t>
       </w:r>
       <w:proofErr w:type="spellEnd"/>
       <w:r>
-        <w:t xml:space="preserve">: el motor de planificación de Spring (@EnableScheduling) ejecuta cada 30 segundos la rotación automática de la cola de espera, sin requerir ningún proceso adicional fuera del propio servicio del </w:t>
+        <w:t xml:space="preserve"> </w:t>
       </w:r>
       <w:proofErr w:type="spellStart"/>
       <w:r>
-        <w:t>backend</w:t>
+        <w:t>bootJar</w:t>
       </w:r>
       <w:proofErr w:type="spellEnd"/>
       <w:r>
-        <w:t>.</w:t>
-      </w:r>
-    </w:p>
-    <w:p>
-      <w:pPr>
-        <w:pStyle w:val="Ttulo2"/>
-        <w:jc w:val="both"/>
-      </w:pPr>
-      <w:bookmarkStart w:id="42" w:name="_Toc230535762"/>
-      <w:r>
-        <w:t>7.3. Proceso de despliegue</w:t>
-      </w:r>
-      <w:bookmarkEnd w:id="42"/>
-    </w:p>
-    <w:p>
-      <w:pPr>
-        <w:spacing w:after="120" w:line="276" w:lineRule="auto"/>
-        <w:jc w:val="both"/>
-      </w:pPr>
-      <w:r>
-        <w:t xml:space="preserve">El proceso de despliegue de una nueva versión consiste en compilar el archivo JAR en el entorno de desarrollo </w:t>
-      </w:r>
-      <w:proofErr w:type="gramStart"/>
-      <w:r>
-        <w:t>con .</w:t>
-      </w:r>
-      <w:proofErr w:type="gramEnd"/>
-      <w:r>
-        <w:t>/</w:t>
+        <w:t xml:space="preserve">, subirlo al servidor mediante una conexión segura (SCP) y reiniciar el servicio del backend con sudo </w:t>
       </w:r>
       <w:proofErr w:type="spellStart"/>
       <w:r>
-        <w:t>gradlew</w:t>
+        <w:t>systemctl</w:t>
       </w:r>
       <w:proofErr w:type="spellEnd"/>
       <w:r>
@@ -17568,67 +16057,35 @@
       </w:r>
       <w:proofErr w:type="spellStart"/>
       <w:r>
-        <w:t>bootJar</w:t>
+        <w:t>restart</w:t>
       </w:r>
       <w:proofErr w:type="spellEnd"/>
       <w:r>
-        <w:t xml:space="preserve">, subirlo al servidor mediante una conexión segura (SCP) y reiniciar el servicio del </w:t>
+        <w:t xml:space="preserve"> </w:t>
       </w:r>
       <w:proofErr w:type="spellStart"/>
       <w:r>
-        <w:t>backend</w:t>
+        <w:t>pistago</w:t>
       </w:r>
       <w:proofErr w:type="spellEnd"/>
       <w:r>
-        <w:t xml:space="preserve"> con sudo </w:t>
+        <w:t xml:space="preserve">. </w:t>
       </w:r>
       <w:proofErr w:type="spellStart"/>
       <w:r>
-        <w:t>systemctl</w:t>
+        <w:t>systemd</w:t>
       </w:r>
       <w:proofErr w:type="spellEnd"/>
       <w:r>
-        <w:t xml:space="preserve"> </w:t>
+        <w:t xml:space="preserve"> se encarga de detener la versión anterior, liberar el puerto y arrancar la nueva versión de forma ordenada, registrando la salida en su propio sistema de logs (</w:t>
       </w:r>
       <w:proofErr w:type="spellStart"/>
       <w:r>
-        <w:t>restart</w:t>
+        <w:t>journalctl</w:t>
       </w:r>
       <w:proofErr w:type="spellEnd"/>
       <w:r>
-        <w:t xml:space="preserve"> </w:t>
-      </w:r>
-      <w:proofErr w:type="spellStart"/>
-      <w:r>
-        <w:t>pistago</w:t>
-      </w:r>
-      <w:proofErr w:type="spellEnd"/>
-      <w:r>
-        <w:t xml:space="preserve">. </w:t>
-      </w:r>
-      <w:proofErr w:type="spellStart"/>
-      <w:r>
-        <w:t>systemd</w:t>
-      </w:r>
-      <w:proofErr w:type="spellEnd"/>
-      <w:r>
-        <w:t xml:space="preserve"> se encarga de detener la versión anterior, liberar el puerto y arrancar la nueva versión de forma ordenada, registrando la salida en su propio sistema de logs (</w:t>
-      </w:r>
-      <w:proofErr w:type="spellStart"/>
-      <w:r>
-        <w:t>journalctl</w:t>
-      </w:r>
-      <w:proofErr w:type="spellEnd"/>
-      <w:r>
-        <w:t xml:space="preserve">). La configuración sensible (credenciales de base de datos, secreto JWT, ruta de las credenciales de </w:t>
-      </w:r>
-      <w:proofErr w:type="spellStart"/>
-      <w:r>
-        <w:t>Firebase</w:t>
-      </w:r>
-      <w:proofErr w:type="spellEnd"/>
-      <w:r>
-        <w:t>) se mantiene en un archivo de configuración externo al JAR, presente solo en el servidor y fuera del repositorio</w:t>
+        <w:t>). La configuración sensible (credenciales de base de datos, secreto JWT, ruta de las credenciales de Firebase) se mantiene en un archivo de configuración externo al JAR, presente solo en el servidor y fuera del repositorio</w:t>
       </w:r>
       <w:r>
         <w:t>.</w:t>
@@ -17689,15 +16146,7 @@
         <w:jc w:val="both"/>
       </w:pPr>
       <w:r>
-        <w:t xml:space="preserve">Aunque </w:t>
-      </w:r>
-      <w:proofErr w:type="spellStart"/>
-      <w:r>
-        <w:t>PistaGO</w:t>
-      </w:r>
-      <w:proofErr w:type="spellEnd"/>
-      <w:r>
-        <w:t xml:space="preserve"> es un proyecto académico sin coste comercial real, se incluye una estimación del presupuesto que tendría su desarrollo en un contexto profesional, a efectos formativos.</w:t>
+        <w:t>Aunque PistaGO es un proyecto académico sin coste comercial real, se incluye una estimación del presupuesto que tendría su desarrollo en un contexto profesional, a efectos formativos.</w:t>
       </w:r>
     </w:p>
     <w:p>
@@ -17975,17 +16424,8 @@
                 <w:sz w:val="20"/>
                 <w:szCs w:val="20"/>
               </w:rPr>
-              <w:t xml:space="preserve">Desarrollo </w:t>
-            </w:r>
-            <w:proofErr w:type="spellStart"/>
-            <w:r>
-              <w:rPr>
-                <w:sz w:val="20"/>
-                <w:szCs w:val="20"/>
-              </w:rPr>
-              <w:t>backend</w:t>
-            </w:r>
-            <w:proofErr w:type="spellEnd"/>
+              <w:t>Desarrollo backend</w:t>
+            </w:r>
           </w:p>
         </w:tc>
         <w:tc>
@@ -18015,14 +16455,7 @@
                 <w:sz w:val="20"/>
                 <w:szCs w:val="20"/>
               </w:rPr>
-              <w:t>5</w:t>
-            </w:r>
-            <w:r>
-              <w:rPr>
-                <w:sz w:val="20"/>
-                <w:szCs w:val="20"/>
-              </w:rPr>
-              <w:t>5 h</w:t>
+              <w:t>55 h</w:t>
             </w:r>
           </w:p>
         </w:tc>
@@ -18226,14 +16659,7 @@
                 <w:sz w:val="20"/>
                 <w:szCs w:val="20"/>
               </w:rPr>
-              <w:t>20</w:t>
-            </w:r>
-            <w:r>
-              <w:rPr>
-                <w:sz w:val="20"/>
-                <w:szCs w:val="20"/>
-              </w:rPr>
-              <w:t xml:space="preserve"> h</w:t>
+              <w:t>20 h</w:t>
             </w:r>
           </w:p>
         </w:tc>
@@ -18264,14 +16690,7 @@
                 <w:sz w:val="20"/>
                 <w:szCs w:val="20"/>
               </w:rPr>
-              <w:t>500</w:t>
-            </w:r>
-            <w:r>
-              <w:rPr>
-                <w:sz w:val="20"/>
-                <w:szCs w:val="20"/>
-              </w:rPr>
-              <w:t xml:space="preserve"> €</w:t>
+              <w:t>500 €</w:t>
             </w:r>
           </w:p>
         </w:tc>
@@ -18380,14 +16799,7 @@
                 <w:sz w:val="20"/>
                 <w:szCs w:val="20"/>
               </w:rPr>
-              <w:t>375</w:t>
-            </w:r>
-            <w:r>
-              <w:rPr>
-                <w:sz w:val="20"/>
-                <w:szCs w:val="20"/>
-              </w:rPr>
-              <w:t xml:space="preserve"> €</w:t>
+              <w:t>375 €</w:t>
             </w:r>
           </w:p>
         </w:tc>
@@ -18496,28 +16908,7 @@
                 <w:sz w:val="20"/>
                 <w:szCs w:val="20"/>
               </w:rPr>
-              <w:t>4</w:t>
-            </w:r>
-            <w:r>
-              <w:rPr>
-                <w:sz w:val="20"/>
-                <w:szCs w:val="20"/>
-              </w:rPr>
-              <w:t>.</w:t>
-            </w:r>
-            <w:r>
-              <w:rPr>
-                <w:sz w:val="20"/>
-                <w:szCs w:val="20"/>
-              </w:rPr>
-              <w:t>2</w:t>
-            </w:r>
-            <w:r>
-              <w:rPr>
-                <w:sz w:val="20"/>
-                <w:szCs w:val="20"/>
-              </w:rPr>
-              <w:t>50 €</w:t>
+              <w:t>4.250 €</w:t>
             </w:r>
           </w:p>
         </w:tc>
@@ -19359,23 +17750,7 @@
                 <w:sz w:val="20"/>
                 <w:szCs w:val="20"/>
               </w:rPr>
-              <w:t xml:space="preserve">Las claves (JWT, </w:t>
-            </w:r>
-            <w:proofErr w:type="spellStart"/>
-            <w:r>
-              <w:rPr>
-                <w:sz w:val="20"/>
-                <w:szCs w:val="20"/>
-              </w:rPr>
-              <w:t>Firebase</w:t>
-            </w:r>
-            <w:proofErr w:type="spellEnd"/>
-            <w:r>
-              <w:rPr>
-                <w:sz w:val="20"/>
-                <w:szCs w:val="20"/>
-              </w:rPr>
-              <w:t>, BD) se mantienen fuera del repositorio.</w:t>
+              <w:t>Las claves (JWT, Firebase, BD) se mantienen fuera del repositorio.</w:t>
             </w:r>
           </w:p>
         </w:tc>
@@ -19408,23 +17783,7 @@
                 <w:sz w:val="20"/>
                 <w:szCs w:val="20"/>
               </w:rPr>
-              <w:t xml:space="preserve">Curva de aprendizaje de tecnologías nuevas (FCM, </w:t>
-            </w:r>
-            <w:proofErr w:type="spellStart"/>
-            <w:r>
-              <w:rPr>
-                <w:sz w:val="20"/>
-                <w:szCs w:val="20"/>
-              </w:rPr>
-              <w:t>Compose</w:t>
-            </w:r>
-            <w:proofErr w:type="spellEnd"/>
-            <w:r>
-              <w:rPr>
-                <w:sz w:val="20"/>
-                <w:szCs w:val="20"/>
-              </w:rPr>
-              <w:t>)</w:t>
+              <w:t>Curva de aprendizaje de tecnologías nuevas (FCM, Compose)</w:t>
             </w:r>
           </w:p>
         </w:tc>
@@ -19497,21 +17856,8 @@
         <w:spacing w:after="120" w:line="276" w:lineRule="auto"/>
         <w:jc w:val="both"/>
       </w:pPr>
-      <w:proofErr w:type="spellStart"/>
-      <w:r>
-        <w:t>PistaGO</w:t>
-      </w:r>
-      <w:proofErr w:type="spellEnd"/>
-      <w:r>
-        <w:t xml:space="preserve"> ha alcanzado su objetivo principal: ofrecer una aplicación Android nativa, funcional y desplegada en producción, capaz de gestionar de forma integral las reservas de pistas de tenis de un club. El proyecto ha permitido integrar de manera práctica las competencias de todos los módulos del ciclo DAM, desde el diseño de la base de datos y el desarrollo de la API REST hasta la construcción de la interfaz nativa, la seguridad mediante JWT y la integración de notificaciones </w:t>
-      </w:r>
-      <w:proofErr w:type="spellStart"/>
-      <w:r>
-        <w:t>push</w:t>
-      </w:r>
-      <w:proofErr w:type="spellEnd"/>
-      <w:r>
-        <w:t>.</w:t>
+      <w:r>
+        <w:t>PistaGO ha alcanzado su objetivo principal: ofrecer una aplicación Android nativa, funcional y desplegada en producción, capaz de gestionar de forma integral las reservas de pistas de tenis de un club. El proyecto ha permitido integrar de manera práctica las competencias de todos los módulos del ciclo DAM, desde el diseño de la base de datos y el desarrollo de la API REST hasta la construcción de la interfaz nativa, la seguridad mediante JWT y la integración de notificaciones push.</w:t>
       </w:r>
     </w:p>
     <w:p>
@@ -19520,15 +17866,7 @@
         <w:jc w:val="both"/>
       </w:pPr>
       <w:r>
-        <w:t xml:space="preserve">Entre los logros más destacables se encuentran la implementación de la lista de espera con cálculo dinámico de posición y rotación automática del turno mediante tarea programada, el sistema de notificaciones </w:t>
-      </w:r>
-      <w:proofErr w:type="spellStart"/>
-      <w:r>
-        <w:t>push</w:t>
-      </w:r>
-      <w:proofErr w:type="spellEnd"/>
-      <w:r>
-        <w:t xml:space="preserve"> que cierra el ciclo de comunicación tanto al liberar plazas como cuando un administrador cancela una reserva, el despliegue completo en un VPS propio con HTTPS y servicio gestionado por </w:t>
+        <w:t xml:space="preserve">Entre los logros más destacables se encuentran la implementación de la lista de espera con cálculo dinámico de posición y rotación automática del turno mediante tarea programada, el sistema de notificaciones push que cierra el ciclo de comunicación tanto al liberar plazas como cuando un administrador cancela una reserva, el despliegue completo en un VPS propio con HTTPS y servicio gestionado por </w:t>
       </w:r>
       <w:proofErr w:type="spellStart"/>
       <w:r>
@@ -19646,15 +17984,7 @@
         <w:t xml:space="preserve">Ampliación de la cobertura de pruebas: </w:t>
       </w:r>
       <w:r>
-        <w:t xml:space="preserve">pruebas de integración con base de datos en memoria y pruebas unitarias específicas para las funcionalidades añadidas en el sprint final (rotación automática de cola, </w:t>
-      </w:r>
-      <w:proofErr w:type="spellStart"/>
-      <w:r>
-        <w:t>push</w:t>
-      </w:r>
-      <w:proofErr w:type="spellEnd"/>
-      <w:r>
-        <w:t xml:space="preserve"> del administrador, cómputo de estadísticas con estado EXPIRADA), que complementen la suite actual de 30 pruebas</w:t>
+        <w:t>pruebas de integración con base de datos en memoria y pruebas unitarias específicas para las funcionalidades añadidas en el sprint final (rotación automática de cola, push del administrador, cómputo de estadísticas con estado EXPIRADA), que complementen la suite actual de 30 pruebas</w:t>
       </w:r>
       <w:r>
         <w:t>.</w:t>
@@ -19678,19 +18008,11 @@
         <w:t>Bloqueos por franja horaria</w:t>
       </w:r>
       <w:r>
-        <w:t xml:space="preserve">: activar la tabla </w:t>
-      </w:r>
-      <w:proofErr w:type="spellStart"/>
-      <w:r>
-        <w:t>bloqueos_</w:t>
+        <w:t>: activar la tabla bloqueos_</w:t>
       </w:r>
       <w:proofErr w:type="gramStart"/>
       <w:r>
-        <w:t>horario</w:t>
-      </w:r>
-      <w:proofErr w:type="spellEnd"/>
-      <w:r>
-        <w:t xml:space="preserve"> ya modelada</w:t>
+        <w:t>horario ya modelada</w:t>
       </w:r>
       <w:proofErr w:type="gramEnd"/>
       <w:r>
@@ -19715,15 +18037,7 @@
         <w:t>Configuración dinámica del sistema</w:t>
       </w:r>
       <w:r>
-        <w:t xml:space="preserve">: migrar parámetros globales (horarios de apertura, duración de franja, márgenes de cancelación) a la tabla </w:t>
-      </w:r>
-      <w:proofErr w:type="spellStart"/>
-      <w:r>
-        <w:t>configuracion_sistema</w:t>
-      </w:r>
-      <w:proofErr w:type="spellEnd"/>
-      <w:r>
-        <w:t xml:space="preserve"> para que puedan modificarse desde el panel de administrador sin necesidad de redespliegue</w:t>
+        <w:t>: migrar parámetros globales (horarios de apertura, duración de franja, márgenes de cancelación) a la tabla configuracion_sistema para que puedan modificarse desde el panel de administrador sin necesidad de redespliegue</w:t>
       </w:r>
       <w:r>
         <w:t>.</w:t>
@@ -19810,23 +18124,7 @@
       </w:r>
       <w:proofErr w:type="spellEnd"/>
       <w:r>
-        <w:t xml:space="preserve"> y </w:t>
-      </w:r>
-      <w:proofErr w:type="spellStart"/>
-      <w:r>
-        <w:t>Jetpack</w:t>
-      </w:r>
-      <w:proofErr w:type="spellEnd"/>
-      <w:r>
-        <w:t xml:space="preserve"> </w:t>
-      </w:r>
-      <w:proofErr w:type="spellStart"/>
-      <w:r>
-        <w:t>Compose</w:t>
-      </w:r>
-      <w:proofErr w:type="spellEnd"/>
-      <w:r>
-        <w:t>. https://developer.android.com</w:t>
+        <w:t xml:space="preserve"> y Jetpack Compose. https://developer.android.com</w:t>
       </w:r>
     </w:p>
     <w:p>
@@ -19840,15 +18138,7 @@
         <w:jc w:val="both"/>
       </w:pPr>
       <w:r>
-        <w:t xml:space="preserve">Documentación oficial de </w:t>
-      </w:r>
-      <w:proofErr w:type="spellStart"/>
-      <w:r>
-        <w:t>Kotlin</w:t>
-      </w:r>
-      <w:proofErr w:type="spellEnd"/>
-      <w:r>
-        <w:t>. https://kotlinlang.org/docs</w:t>
+        <w:t>Documentación oficial de Kotlin. https://kotlinlang.org/docs</w:t>
       </w:r>
     </w:p>
     <w:p>
@@ -19862,15 +18152,7 @@
         <w:jc w:val="both"/>
       </w:pPr>
       <w:r>
-        <w:t xml:space="preserve">Documentación oficial de Spring </w:t>
-      </w:r>
-      <w:proofErr w:type="spellStart"/>
-      <w:r>
-        <w:t>Boot</w:t>
-      </w:r>
-      <w:proofErr w:type="spellEnd"/>
-      <w:r>
-        <w:t xml:space="preserve"> y Spring Security. https://spring.io</w:t>
+        <w:t>Documentación oficial de Spring Boot y Spring Security. https://spring.io</w:t>
       </w:r>
     </w:p>
     <w:p>
@@ -19898,31 +18180,7 @@
         <w:jc w:val="both"/>
       </w:pPr>
       <w:r>
-        <w:t xml:space="preserve">Documentación de </w:t>
-      </w:r>
-      <w:proofErr w:type="spellStart"/>
-      <w:r>
-        <w:t>Firebase</w:t>
-      </w:r>
-      <w:proofErr w:type="spellEnd"/>
-      <w:r>
-        <w:t xml:space="preserve"> Cloud </w:t>
-      </w:r>
-      <w:proofErr w:type="spellStart"/>
-      <w:r>
-        <w:t>Messaging</w:t>
-      </w:r>
-      <w:proofErr w:type="spellEnd"/>
-      <w:r>
-        <w:t xml:space="preserve"> y </w:t>
-      </w:r>
-      <w:proofErr w:type="spellStart"/>
-      <w:r>
-        <w:t>Firebase</w:t>
-      </w:r>
-      <w:proofErr w:type="spellEnd"/>
-      <w:r>
-        <w:t xml:space="preserve"> </w:t>
+        <w:t xml:space="preserve">Documentación de Firebase Cloud Messaging y Firebase </w:t>
       </w:r>
       <w:proofErr w:type="spellStart"/>
       <w:r>
@@ -20004,15 +18262,7 @@
         <w:jc w:val="both"/>
       </w:pPr>
       <w:r>
-        <w:t xml:space="preserve">Documentación de </w:t>
-      </w:r>
-      <w:proofErr w:type="spellStart"/>
-      <w:r>
-        <w:t>Nginx</w:t>
-      </w:r>
-      <w:proofErr w:type="spellEnd"/>
-      <w:r>
-        <w:t xml:space="preserve"> y </w:t>
+        <w:t xml:space="preserve">Documentación de Nginx y </w:t>
       </w:r>
       <w:proofErr w:type="spellStart"/>
       <w:r>
@@ -20142,11 +18392,11 @@
       </w:r>
       <w:proofErr w:type="spellStart"/>
       <w:r>
-        <w:t>Mockito-Kotlin</w:t>
+        <w:t>Mockito</w:t>
       </w:r>
       <w:proofErr w:type="spellEnd"/>
       <w:r>
-        <w:t xml:space="preserve">. </w:t>
+        <w:t xml:space="preserve">-Kotlin. </w:t>
       </w:r>
       <w:hyperlink r:id="rId15" w:history="1">
         <w:r>
@@ -20227,15 +18477,7 @@
         <w:jc w:val="both"/>
       </w:pPr>
       <w:r>
-        <w:t>Repositorio completo del proyecto (</w:t>
-      </w:r>
-      <w:proofErr w:type="spellStart"/>
-      <w:r>
-        <w:t>backend</w:t>
-      </w:r>
-      <w:proofErr w:type="spellEnd"/>
-      <w:r>
-        <w:t xml:space="preserve">, cliente Android y documentación): </w:t>
+        <w:t xml:space="preserve">Repositorio completo del proyecto (backend, cliente Android y documentación): </w:t>
       </w:r>
       <w:hyperlink r:id="rId17" w:history="1">
         <w:r>
@@ -20296,13 +18538,10 @@
         <w:jc w:val="both"/>
       </w:pPr>
       <w:r>
-        <w:rPr>
-          <w:noProof/>
-        </w:rPr>
         <w:drawing>
-          <wp:inline distT="0" distB="0" distL="0" distR="0" wp14:anchorId="038B5F19" wp14:editId="1A5A9D74">
-            <wp:extent cx="5724525" cy="5610225"/>
-            <wp:effectExtent l="0" t="0" r="9525" b="9525"/>
+          <wp:inline distT="0" distB="0" distL="0" distR="0" wp14:anchorId="40033151" wp14:editId="721FB698">
+            <wp:extent cx="5731510" cy="3103245"/>
+            <wp:effectExtent l="0" t="0" r="2540" b="1905"/>
             <wp:docPr id="1" name="Imagen 1"/>
             <wp:cNvGraphicFramePr>
               <a:graphicFrameLocks xmlns:a="http://schemas.openxmlformats.org/drawingml/2006/main" noChangeAspect="1"/>
@@ -20311,36 +18550,23 @@
               <a:graphicData uri="http://schemas.openxmlformats.org/drawingml/2006/picture">
                 <pic:pic xmlns:pic="http://schemas.openxmlformats.org/drawingml/2006/picture">
                   <pic:nvPicPr>
-                    <pic:cNvPr id="0" name="Picture 1"/>
-                    <pic:cNvPicPr>
-                      <a:picLocks noChangeAspect="1" noChangeArrowheads="1"/>
-                    </pic:cNvPicPr>
+                    <pic:cNvPr id="1" name=""/>
+                    <pic:cNvPicPr/>
                   </pic:nvPicPr>
                   <pic:blipFill>
-                    <a:blip r:embed="rId18" cstate="print">
-                      <a:extLst>
-                        <a:ext uri="{28A0092B-C50C-407E-A947-70E740481C1C}">
-                          <a14:useLocalDpi xmlns:a14="http://schemas.microsoft.com/office/drawing/2010/main" val="0"/>
-                        </a:ext>
-                      </a:extLst>
-                    </a:blip>
-                    <a:srcRect/>
+                    <a:blip r:embed="rId18"/>
                     <a:stretch>
                       <a:fillRect/>
                     </a:stretch>
                   </pic:blipFill>
-                  <pic:spPr bwMode="auto">
+                  <pic:spPr>
                     <a:xfrm>
                       <a:off x="0" y="0"/>
-                      <a:ext cx="5724525" cy="5610225"/>
+                      <a:ext cx="5731510" cy="3103245"/>
                     </a:xfrm>
                     <a:prstGeom prst="rect">
                       <a:avLst/>
                     </a:prstGeom>
-                    <a:noFill/>
-                    <a:ln>
-                      <a:noFill/>
-                    </a:ln>
                   </pic:spPr>
                 </pic:pic>
               </a:graphicData>
@@ -20348,6 +18574,60 @@
           </wp:inline>
         </w:drawing>
       </w:r>
+    </w:p>
+    <w:p>
+      <w:pPr>
+        <w:spacing w:after="120" w:line="276" w:lineRule="auto"/>
+        <w:jc w:val="both"/>
+      </w:pPr>
+    </w:p>
+    <w:p>
+      <w:pPr>
+        <w:spacing w:after="120" w:line="276" w:lineRule="auto"/>
+        <w:jc w:val="both"/>
+      </w:pPr>
+    </w:p>
+    <w:p>
+      <w:pPr>
+        <w:spacing w:after="120" w:line="276" w:lineRule="auto"/>
+        <w:jc w:val="both"/>
+      </w:pPr>
+    </w:p>
+    <w:p>
+      <w:pPr>
+        <w:spacing w:after="120" w:line="276" w:lineRule="auto"/>
+        <w:jc w:val="both"/>
+      </w:pPr>
+    </w:p>
+    <w:p>
+      <w:pPr>
+        <w:spacing w:after="120" w:line="276" w:lineRule="auto"/>
+        <w:jc w:val="both"/>
+      </w:pPr>
+    </w:p>
+    <w:p>
+      <w:pPr>
+        <w:spacing w:after="120" w:line="276" w:lineRule="auto"/>
+        <w:jc w:val="both"/>
+      </w:pPr>
+    </w:p>
+    <w:p>
+      <w:pPr>
+        <w:spacing w:after="120" w:line="276" w:lineRule="auto"/>
+        <w:jc w:val="both"/>
+      </w:pPr>
+    </w:p>
+    <w:p>
+      <w:pPr>
+        <w:spacing w:after="120" w:line="276" w:lineRule="auto"/>
+        <w:jc w:val="both"/>
+      </w:pPr>
+    </w:p>
+    <w:p>
+      <w:pPr>
+        <w:spacing w:after="120" w:line="276" w:lineRule="auto"/>
+        <w:jc w:val="both"/>
+      </w:pPr>
     </w:p>
     <w:p>
       <w:pPr>
@@ -20628,23 +18908,13 @@
         <w:bottom w:val="single" w:sz="4" w:space="4" w:color="2E75B6"/>
       </w:pBdr>
     </w:pPr>
-    <w:proofErr w:type="spellStart"/>
     <w:r>
       <w:rPr>
         <w:color w:val="888888"/>
         <w:sz w:val="16"/>
         <w:szCs w:val="16"/>
       </w:rPr>
-      <w:t>PistaGO</w:t>
-    </w:r>
-    <w:proofErr w:type="spellEnd"/>
-    <w:r>
-      <w:rPr>
-        <w:color w:val="888888"/>
-        <w:sz w:val="16"/>
-        <w:szCs w:val="16"/>
-      </w:rPr>
-      <w:t xml:space="preserve"> · Memoria del Proyecto</w:t>
+      <w:t>PistaGO · Memoria del Proyecto</w:t>
     </w:r>
   </w:p>
 </w:hdr>

</xml_diff>